<commit_message>
Date: 26 Aug 2025
</commit_message>
<xml_diff>
--- a/Notes.docx
+++ b/Notes.docx
@@ -5454,6 +5454,138 @@
           <w:lang w:val="en-US"/>
         </w:rPr>
       </w:pPr>
+      <w:r>
+        <w:rPr>
+          <w:lang w:val="en-US"/>
+        </w:rPr>
+        <w:t>selectByContainsVisibleText()</w:t>
+      </w:r>
+    </w:p>
+    <w:p>
+      <w:pPr>
+        <w:pStyle w:val="ListParagraph"/>
+        <w:numPr>
+          <w:ilvl w:val="0"/>
+          <w:numId w:val="23"/>
+        </w:numPr>
+        <w:rPr>
+          <w:lang w:val="en-US"/>
+        </w:rPr>
+      </w:pPr>
+      <w:r>
+        <w:rPr>
+          <w:lang w:val="en-US"/>
+        </w:rPr>
+        <w:t>selectByVisibleText()</w:t>
+      </w:r>
+    </w:p>
+    <w:p>
+      <w:pPr>
+        <w:pStyle w:val="ListParagraph"/>
+        <w:numPr>
+          <w:ilvl w:val="0"/>
+          <w:numId w:val="23"/>
+        </w:numPr>
+        <w:rPr>
+          <w:lang w:val="en-US"/>
+        </w:rPr>
+      </w:pPr>
+      <w:r>
+        <w:rPr>
+          <w:lang w:val="en-US"/>
+        </w:rPr>
+        <w:t>selectByValue()</w:t>
+      </w:r>
+    </w:p>
+    <w:p>
+      <w:pPr>
+        <w:pStyle w:val="ListParagraph"/>
+        <w:numPr>
+          <w:ilvl w:val="0"/>
+          <w:numId w:val="23"/>
+        </w:numPr>
+        <w:rPr>
+          <w:lang w:val="en-US"/>
+        </w:rPr>
+      </w:pPr>
+      <w:r>
+        <w:rPr>
+          <w:lang w:val="en-US"/>
+        </w:rPr>
+        <w:t>selectByIndex()</w:t>
+      </w:r>
+    </w:p>
+    <w:p>
+      <w:pPr>
+        <w:pStyle w:val="ListParagraph"/>
+        <w:numPr>
+          <w:ilvl w:val="0"/>
+          <w:numId w:val="23"/>
+        </w:numPr>
+        <w:rPr>
+          <w:lang w:val="en-US"/>
+        </w:rPr>
+      </w:pPr>
+      <w:r>
+        <w:rPr>
+          <w:lang w:val="en-US"/>
+        </w:rPr>
+        <w:t xml:space="preserve">getAllSelectedOptions() </w:t>
+      </w:r>
+      <w:r>
+        <w:rPr>
+          <w:lang w:val="en-US"/>
+        </w:rPr>
+        <w:sym w:font="Wingdings" w:char="F0E0"/>
+      </w:r>
+      <w:r>
+        <w:rPr>
+          <w:lang w:val="en-US"/>
+        </w:rPr>
+        <w:t xml:space="preserve"> Returns list of all the selected elements / options from List</w:t>
+      </w:r>
+      <w:r>
+        <w:rPr>
+          <w:lang w:val="en-US"/>
+        </w:rPr>
+        <w:t xml:space="preserve"> </w:t>
+      </w:r>
+      <w:r>
+        <w:rPr>
+          <w:lang w:val="en-US"/>
+        </w:rPr>
+        <w:t>box. (List&lt;WebElement&gt;)</w:t>
+      </w:r>
+    </w:p>
+    <w:p>
+      <w:pPr>
+        <w:pStyle w:val="ListParagraph"/>
+        <w:numPr>
+          <w:ilvl w:val="0"/>
+          <w:numId w:val="23"/>
+        </w:numPr>
+        <w:rPr>
+          <w:lang w:val="en-US"/>
+        </w:rPr>
+      </w:pPr>
+      <w:r>
+        <w:rPr>
+          <w:lang w:val="en-US"/>
+        </w:rPr>
+        <w:t xml:space="preserve">isMultiple() </w:t>
+      </w:r>
+      <w:r>
+        <w:rPr>
+          <w:lang w:val="en-US"/>
+        </w:rPr>
+        <w:sym w:font="Wingdings" w:char="F0E0"/>
+      </w:r>
+      <w:r>
+        <w:rPr>
+          <w:lang w:val="en-US"/>
+        </w:rPr>
+        <w:t xml:space="preserve"> Checks that whether the control allows to select multiple options or not. (boolean)</w:t>
+      </w:r>
       <w:bookmarkStart w:id="0" w:name="_GoBack"/>
       <w:bookmarkEnd w:id="0"/>
     </w:p>
@@ -9601,49 +9733,49 @@
     </dgm:pt>
   </dgm:ptLst>
   <dgm:cxnLst>
-    <dgm:cxn modelId="{361BFEF8-DDA0-4EBA-968B-0AAC33259B8F}" type="presOf" srcId="{BA319471-CEE2-4F47-BD5C-3922FB7DFA6B}" destId="{59356F7B-2878-4C69-8BCC-736D52D62464}" srcOrd="0" destOrd="0" presId="urn:microsoft.com/office/officeart/2005/8/layout/cycle2"/>
-    <dgm:cxn modelId="{B119D05A-2548-4750-BB6F-59947F637817}" type="presOf" srcId="{A01E66F2-8DE2-4DBF-B8E1-AB48AEB22F0F}" destId="{48BF6C11-EF1A-4273-900D-DD5B59C0D92F}" srcOrd="0" destOrd="0" presId="urn:microsoft.com/office/officeart/2005/8/layout/cycle2"/>
-    <dgm:cxn modelId="{B6B50DA6-66A4-4B82-A1FA-8DC0858EEF88}" type="presOf" srcId="{6BE14A29-3F47-4123-9A53-87F7E3976F30}" destId="{1379CEB1-3469-4B4A-813A-D2A2C295406E}" srcOrd="0" destOrd="0" presId="urn:microsoft.com/office/officeart/2005/8/layout/cycle2"/>
+    <dgm:cxn modelId="{EB0EC7C9-CEC1-467B-ADF7-7628B8E44729}" type="presOf" srcId="{D35F654F-C71E-4CF2-BA21-C832C92DCB2B}" destId="{C262E5EC-AFFC-4D29-8F55-4FC98D066102}" srcOrd="1" destOrd="0" presId="urn:microsoft.com/office/officeart/2005/8/layout/cycle2"/>
+    <dgm:cxn modelId="{A0109055-ACF2-4F86-91DB-C3434C6FFA91}" type="presOf" srcId="{D35F654F-C71E-4CF2-BA21-C832C92DCB2B}" destId="{9F2CA740-10BE-422F-97C4-215D3262A7C2}" srcOrd="0" destOrd="0" presId="urn:microsoft.com/office/officeart/2005/8/layout/cycle2"/>
+    <dgm:cxn modelId="{3354B5DD-DD06-4226-83B0-C5DBB4314929}" srcId="{30169AF5-3F60-49ED-BA16-26E156F3CD77}" destId="{D01084D7-448F-40E6-BAD6-916FA5266B35}" srcOrd="1" destOrd="0" parTransId="{11A516D9-F860-4BE8-BA91-08CBF1F90AAF}" sibTransId="{BA319471-CEE2-4F47-BD5C-3922FB7DFA6B}"/>
+    <dgm:cxn modelId="{3A6CAD7C-9D06-4601-9DA6-58C23D4FE730}" srcId="{30169AF5-3F60-49ED-BA16-26E156F3CD77}" destId="{E3147738-712C-470E-BA43-1900B58F3BA1}" srcOrd="5" destOrd="0" parTransId="{390EF3C2-87EC-4379-B2B2-CD6400F6DFF0}" sibTransId="{A01E66F2-8DE2-4DBF-B8E1-AB48AEB22F0F}"/>
+    <dgm:cxn modelId="{7D752029-B3EF-4D9F-801A-6F87E5067D1D}" type="presOf" srcId="{A3989F04-57A2-4559-BF44-044AD8FBD67A}" destId="{A670810F-0345-4254-8BC7-4FA06BB5C3CC}" srcOrd="0" destOrd="0" presId="urn:microsoft.com/office/officeart/2005/8/layout/cycle2"/>
+    <dgm:cxn modelId="{D2E04241-210D-4CF4-9323-1CFE19946662}" type="presOf" srcId="{D996DF6E-E24A-4672-B53C-F45E82ED11D5}" destId="{23B2CE62-F90C-4121-BB9A-FD58550B5409}" srcOrd="0" destOrd="0" presId="urn:microsoft.com/office/officeart/2005/8/layout/cycle2"/>
+    <dgm:cxn modelId="{026D6AE9-41C4-4E88-B421-D7A6BB38CC27}" srcId="{30169AF5-3F60-49ED-BA16-26E156F3CD77}" destId="{F2BE9233-54BD-4C28-B5F2-1B65E9CDDF96}" srcOrd="3" destOrd="0" parTransId="{672307C0-A98C-48FA-8729-D6E3187E5E3A}" sibTransId="{9C8E8DEB-5DB8-4F82-8CE8-1171D0ABBD37}"/>
+    <dgm:cxn modelId="{B8CB0855-835F-4AD4-B068-C4751FDF253D}" type="presOf" srcId="{A01E66F2-8DE2-4DBF-B8E1-AB48AEB22F0F}" destId="{48BF6C11-EF1A-4273-900D-DD5B59C0D92F}" srcOrd="0" destOrd="0" presId="urn:microsoft.com/office/officeart/2005/8/layout/cycle2"/>
+    <dgm:cxn modelId="{68A3F72A-CE1C-40EA-B47C-58DF96C0B486}" type="presOf" srcId="{D01084D7-448F-40E6-BAD6-916FA5266B35}" destId="{6AB4841B-36EA-4743-8E11-22D754152787}" srcOrd="0" destOrd="0" presId="urn:microsoft.com/office/officeart/2005/8/layout/cycle2"/>
+    <dgm:cxn modelId="{E9D35F14-D542-4236-BA24-5DBC11D56849}" type="presOf" srcId="{9C8E8DEB-5DB8-4F82-8CE8-1171D0ABBD37}" destId="{15DBFFA1-5F90-4067-9D91-73AA2852D991}" srcOrd="1" destOrd="0" presId="urn:microsoft.com/office/officeart/2005/8/layout/cycle2"/>
+    <dgm:cxn modelId="{CD767F68-E827-495F-95F2-026EBE8D528C}" type="presOf" srcId="{E3147738-712C-470E-BA43-1900B58F3BA1}" destId="{ABB91F78-7B6C-410F-9644-452AF8D7494A}" srcOrd="0" destOrd="0" presId="urn:microsoft.com/office/officeart/2005/8/layout/cycle2"/>
+    <dgm:cxn modelId="{52FB9DC5-6380-4116-8C70-FAC8D715E805}" type="presOf" srcId="{F2BE9233-54BD-4C28-B5F2-1B65E9CDDF96}" destId="{F9AED730-9635-4E85-B16D-CDB7F5FBEF2A}" srcOrd="0" destOrd="0" presId="urn:microsoft.com/office/officeart/2005/8/layout/cycle2"/>
+    <dgm:cxn modelId="{1D0B91C2-469C-46B5-9E32-E3980FF77AA9}" type="presOf" srcId="{6BE14A29-3F47-4123-9A53-87F7E3976F30}" destId="{1379CEB1-3469-4B4A-813A-D2A2C295406E}" srcOrd="0" destOrd="0" presId="urn:microsoft.com/office/officeart/2005/8/layout/cycle2"/>
+    <dgm:cxn modelId="{848F4C5E-1795-4D95-A513-241970F0A4EE}" type="presOf" srcId="{A01E66F2-8DE2-4DBF-B8E1-AB48AEB22F0F}" destId="{2D827D14-3A64-4B45-B11B-3ECDBC24212A}" srcOrd="1" destOrd="0" presId="urn:microsoft.com/office/officeart/2005/8/layout/cycle2"/>
+    <dgm:cxn modelId="{FC683937-3E9A-4071-B70B-BFE511A7B23C}" srcId="{30169AF5-3F60-49ED-BA16-26E156F3CD77}" destId="{6BE14A29-3F47-4123-9A53-87F7E3976F30}" srcOrd="4" destOrd="0" parTransId="{14C76E7C-A806-46D2-A04B-406CC2747FBF}" sibTransId="{D35F654F-C71E-4CF2-BA21-C832C92DCB2B}"/>
+    <dgm:cxn modelId="{BAB1F8DD-1BA3-417C-9DC2-C72EFD2766F8}" type="presOf" srcId="{D996DF6E-E24A-4672-B53C-F45E82ED11D5}" destId="{85727C8B-3068-4E77-A7A1-E6EDA8103D60}" srcOrd="1" destOrd="0" presId="urn:microsoft.com/office/officeart/2005/8/layout/cycle2"/>
+    <dgm:cxn modelId="{F09F8ED9-D24F-448F-AF8E-F92EC404CBA7}" srcId="{30169AF5-3F60-49ED-BA16-26E156F3CD77}" destId="{7C03F650-450B-470D-9F41-9EBB6F24DE08}" srcOrd="0" destOrd="0" parTransId="{A8856599-3D3C-4A85-ABFD-520651FDD510}" sibTransId="{D996DF6E-E24A-4672-B53C-F45E82ED11D5}"/>
     <dgm:cxn modelId="{57569DDB-32CD-4132-93C5-3D28EE6D9D0F}" srcId="{30169AF5-3F60-49ED-BA16-26E156F3CD77}" destId="{A3989F04-57A2-4559-BF44-044AD8FBD67A}" srcOrd="2" destOrd="0" parTransId="{E7AABBEB-8EE1-4214-A7B4-DD1F0B63D6DC}" sibTransId="{F90989A5-9584-42E6-85EC-F46F18F0E118}"/>
-    <dgm:cxn modelId="{B87AAD81-282E-419A-8D15-8F2FD084646D}" type="presOf" srcId="{9C8E8DEB-5DB8-4F82-8CE8-1171D0ABBD37}" destId="{15DBFFA1-5F90-4067-9D91-73AA2852D991}" srcOrd="1" destOrd="0" presId="urn:microsoft.com/office/officeart/2005/8/layout/cycle2"/>
-    <dgm:cxn modelId="{2A23C073-A572-463A-A7D0-D597DADF6C17}" type="presOf" srcId="{F90989A5-9584-42E6-85EC-F46F18F0E118}" destId="{74D1E673-78E8-4911-AB9E-E98BE428CF47}" srcOrd="1" destOrd="0" presId="urn:microsoft.com/office/officeart/2005/8/layout/cycle2"/>
-    <dgm:cxn modelId="{3354B5DD-DD06-4226-83B0-C5DBB4314929}" srcId="{30169AF5-3F60-49ED-BA16-26E156F3CD77}" destId="{D01084D7-448F-40E6-BAD6-916FA5266B35}" srcOrd="1" destOrd="0" parTransId="{11A516D9-F860-4BE8-BA91-08CBF1F90AAF}" sibTransId="{BA319471-CEE2-4F47-BD5C-3922FB7DFA6B}"/>
-    <dgm:cxn modelId="{1A395D99-84BC-4BEB-827C-06EBFD0631B1}" type="presOf" srcId="{D35F654F-C71E-4CF2-BA21-C832C92DCB2B}" destId="{9F2CA740-10BE-422F-97C4-215D3262A7C2}" srcOrd="0" destOrd="0" presId="urn:microsoft.com/office/officeart/2005/8/layout/cycle2"/>
-    <dgm:cxn modelId="{E7611CA8-C626-49F2-9202-105FE70B6EEA}" type="presOf" srcId="{BA319471-CEE2-4F47-BD5C-3922FB7DFA6B}" destId="{2FCF5CF5-49BA-4E5D-A81E-50ABA18D10A9}" srcOrd="1" destOrd="0" presId="urn:microsoft.com/office/officeart/2005/8/layout/cycle2"/>
-    <dgm:cxn modelId="{026D6AE9-41C4-4E88-B421-D7A6BB38CC27}" srcId="{30169AF5-3F60-49ED-BA16-26E156F3CD77}" destId="{F2BE9233-54BD-4C28-B5F2-1B65E9CDDF96}" srcOrd="3" destOrd="0" parTransId="{672307C0-A98C-48FA-8729-D6E3187E5E3A}" sibTransId="{9C8E8DEB-5DB8-4F82-8CE8-1171D0ABBD37}"/>
-    <dgm:cxn modelId="{3A6CAD7C-9D06-4601-9DA6-58C23D4FE730}" srcId="{30169AF5-3F60-49ED-BA16-26E156F3CD77}" destId="{E3147738-712C-470E-BA43-1900B58F3BA1}" srcOrd="5" destOrd="0" parTransId="{390EF3C2-87EC-4379-B2B2-CD6400F6DFF0}" sibTransId="{A01E66F2-8DE2-4DBF-B8E1-AB48AEB22F0F}"/>
-    <dgm:cxn modelId="{BC6EDE89-0CD2-4CAE-BF51-9A8A0850C99B}" type="presOf" srcId="{7C03F650-450B-470D-9F41-9EBB6F24DE08}" destId="{915300E8-D21B-48E5-86A7-A677802348CF}" srcOrd="0" destOrd="0" presId="urn:microsoft.com/office/officeart/2005/8/layout/cycle2"/>
-    <dgm:cxn modelId="{61972AC9-DB21-4563-AB3D-3C90BCAA186E}" type="presOf" srcId="{F90989A5-9584-42E6-85EC-F46F18F0E118}" destId="{31D81D24-1473-4316-96A5-763E7A6060DC}" srcOrd="0" destOrd="0" presId="urn:microsoft.com/office/officeart/2005/8/layout/cycle2"/>
-    <dgm:cxn modelId="{C331C677-BAED-42D3-BF62-C440049D8751}" type="presOf" srcId="{F2BE9233-54BD-4C28-B5F2-1B65E9CDDF96}" destId="{F9AED730-9635-4E85-B16D-CDB7F5FBEF2A}" srcOrd="0" destOrd="0" presId="urn:microsoft.com/office/officeart/2005/8/layout/cycle2"/>
-    <dgm:cxn modelId="{116EA1F9-F7DE-4946-838B-26EB1391C04C}" type="presOf" srcId="{A3989F04-57A2-4559-BF44-044AD8FBD67A}" destId="{A670810F-0345-4254-8BC7-4FA06BB5C3CC}" srcOrd="0" destOrd="0" presId="urn:microsoft.com/office/officeart/2005/8/layout/cycle2"/>
-    <dgm:cxn modelId="{6241205F-5724-4581-821C-C434C34FC536}" type="presOf" srcId="{E3147738-712C-470E-BA43-1900B58F3BA1}" destId="{ABB91F78-7B6C-410F-9644-452AF8D7494A}" srcOrd="0" destOrd="0" presId="urn:microsoft.com/office/officeart/2005/8/layout/cycle2"/>
-    <dgm:cxn modelId="{73771F3E-5FD0-4FC1-A4BB-109FC8D4BEC5}" type="presOf" srcId="{D35F654F-C71E-4CF2-BA21-C832C92DCB2B}" destId="{C262E5EC-AFFC-4D29-8F55-4FC98D066102}" srcOrd="1" destOrd="0" presId="urn:microsoft.com/office/officeart/2005/8/layout/cycle2"/>
-    <dgm:cxn modelId="{5C2963DF-04F2-4D15-B8E2-DF759F5AC2EE}" type="presOf" srcId="{D996DF6E-E24A-4672-B53C-F45E82ED11D5}" destId="{85727C8B-3068-4E77-A7A1-E6EDA8103D60}" srcOrd="1" destOrd="0" presId="urn:microsoft.com/office/officeart/2005/8/layout/cycle2"/>
-    <dgm:cxn modelId="{2063AAA7-4814-4563-8B20-09EAAC221AEF}" type="presOf" srcId="{D01084D7-448F-40E6-BAD6-916FA5266B35}" destId="{6AB4841B-36EA-4743-8E11-22D754152787}" srcOrd="0" destOrd="0" presId="urn:microsoft.com/office/officeart/2005/8/layout/cycle2"/>
-    <dgm:cxn modelId="{9CDF7BE0-B493-4925-A4B9-1C1D49D615BE}" type="presOf" srcId="{9C8E8DEB-5DB8-4F82-8CE8-1171D0ABBD37}" destId="{2C63797F-35D2-4BF1-ADFC-8E15A2A56D28}" srcOrd="0" destOrd="0" presId="urn:microsoft.com/office/officeart/2005/8/layout/cycle2"/>
-    <dgm:cxn modelId="{1A9A3283-5830-4D5D-904F-D75A366F937E}" type="presOf" srcId="{D996DF6E-E24A-4672-B53C-F45E82ED11D5}" destId="{23B2CE62-F90C-4121-BB9A-FD58550B5409}" srcOrd="0" destOrd="0" presId="urn:microsoft.com/office/officeart/2005/8/layout/cycle2"/>
-    <dgm:cxn modelId="{C6439AD6-AB21-4FF8-9EEB-4DB2C0DC1919}" type="presOf" srcId="{30169AF5-3F60-49ED-BA16-26E156F3CD77}" destId="{B41B0945-C228-466F-ACBC-F0427AE563C3}" srcOrd="0" destOrd="0" presId="urn:microsoft.com/office/officeart/2005/8/layout/cycle2"/>
-    <dgm:cxn modelId="{F09F8ED9-D24F-448F-AF8E-F92EC404CBA7}" srcId="{30169AF5-3F60-49ED-BA16-26E156F3CD77}" destId="{7C03F650-450B-470D-9F41-9EBB6F24DE08}" srcOrd="0" destOrd="0" parTransId="{A8856599-3D3C-4A85-ABFD-520651FDD510}" sibTransId="{D996DF6E-E24A-4672-B53C-F45E82ED11D5}"/>
-    <dgm:cxn modelId="{21875170-85DA-49A3-963F-B54A9F1A632B}" type="presOf" srcId="{A01E66F2-8DE2-4DBF-B8E1-AB48AEB22F0F}" destId="{2D827D14-3A64-4B45-B11B-3ECDBC24212A}" srcOrd="1" destOrd="0" presId="urn:microsoft.com/office/officeart/2005/8/layout/cycle2"/>
-    <dgm:cxn modelId="{FC683937-3E9A-4071-B70B-BFE511A7B23C}" srcId="{30169AF5-3F60-49ED-BA16-26E156F3CD77}" destId="{6BE14A29-3F47-4123-9A53-87F7E3976F30}" srcOrd="4" destOrd="0" parTransId="{14C76E7C-A806-46D2-A04B-406CC2747FBF}" sibTransId="{D35F654F-C71E-4CF2-BA21-C832C92DCB2B}"/>
-    <dgm:cxn modelId="{E4D3B418-693B-4FFE-A81F-5E87CEAE454F}" type="presParOf" srcId="{B41B0945-C228-466F-ACBC-F0427AE563C3}" destId="{915300E8-D21B-48E5-86A7-A677802348CF}" srcOrd="0" destOrd="0" presId="urn:microsoft.com/office/officeart/2005/8/layout/cycle2"/>
-    <dgm:cxn modelId="{00D326CF-7C54-42D7-AE0B-546515B9FDF4}" type="presParOf" srcId="{B41B0945-C228-466F-ACBC-F0427AE563C3}" destId="{23B2CE62-F90C-4121-BB9A-FD58550B5409}" srcOrd="1" destOrd="0" presId="urn:microsoft.com/office/officeart/2005/8/layout/cycle2"/>
-    <dgm:cxn modelId="{968A07F2-630A-405E-86E9-505326C8674D}" type="presParOf" srcId="{23B2CE62-F90C-4121-BB9A-FD58550B5409}" destId="{85727C8B-3068-4E77-A7A1-E6EDA8103D60}" srcOrd="0" destOrd="0" presId="urn:microsoft.com/office/officeart/2005/8/layout/cycle2"/>
-    <dgm:cxn modelId="{1267D17A-73A2-446E-8F6E-019A99E3B269}" type="presParOf" srcId="{B41B0945-C228-466F-ACBC-F0427AE563C3}" destId="{6AB4841B-36EA-4743-8E11-22D754152787}" srcOrd="2" destOrd="0" presId="urn:microsoft.com/office/officeart/2005/8/layout/cycle2"/>
-    <dgm:cxn modelId="{F86736E6-8EB7-477F-9254-203EFC459472}" type="presParOf" srcId="{B41B0945-C228-466F-ACBC-F0427AE563C3}" destId="{59356F7B-2878-4C69-8BCC-736D52D62464}" srcOrd="3" destOrd="0" presId="urn:microsoft.com/office/officeart/2005/8/layout/cycle2"/>
-    <dgm:cxn modelId="{B975AD89-EDA1-463E-96DA-D62DA961B423}" type="presParOf" srcId="{59356F7B-2878-4C69-8BCC-736D52D62464}" destId="{2FCF5CF5-49BA-4E5D-A81E-50ABA18D10A9}" srcOrd="0" destOrd="0" presId="urn:microsoft.com/office/officeart/2005/8/layout/cycle2"/>
-    <dgm:cxn modelId="{6C7AA6A1-E806-494A-99E9-6133585B27CF}" type="presParOf" srcId="{B41B0945-C228-466F-ACBC-F0427AE563C3}" destId="{A670810F-0345-4254-8BC7-4FA06BB5C3CC}" srcOrd="4" destOrd="0" presId="urn:microsoft.com/office/officeart/2005/8/layout/cycle2"/>
-    <dgm:cxn modelId="{2A2A172C-4731-44F6-84D5-EB741495FC18}" type="presParOf" srcId="{B41B0945-C228-466F-ACBC-F0427AE563C3}" destId="{31D81D24-1473-4316-96A5-763E7A6060DC}" srcOrd="5" destOrd="0" presId="urn:microsoft.com/office/officeart/2005/8/layout/cycle2"/>
-    <dgm:cxn modelId="{AEC2A241-7A81-497B-97AF-CCD5920FC6D8}" type="presParOf" srcId="{31D81D24-1473-4316-96A5-763E7A6060DC}" destId="{74D1E673-78E8-4911-AB9E-E98BE428CF47}" srcOrd="0" destOrd="0" presId="urn:microsoft.com/office/officeart/2005/8/layout/cycle2"/>
-    <dgm:cxn modelId="{0342B632-7960-47E1-8090-BEF226A14A68}" type="presParOf" srcId="{B41B0945-C228-466F-ACBC-F0427AE563C3}" destId="{F9AED730-9635-4E85-B16D-CDB7F5FBEF2A}" srcOrd="6" destOrd="0" presId="urn:microsoft.com/office/officeart/2005/8/layout/cycle2"/>
-    <dgm:cxn modelId="{72180976-829F-4E5F-BA1A-165CAF61BD59}" type="presParOf" srcId="{B41B0945-C228-466F-ACBC-F0427AE563C3}" destId="{2C63797F-35D2-4BF1-ADFC-8E15A2A56D28}" srcOrd="7" destOrd="0" presId="urn:microsoft.com/office/officeart/2005/8/layout/cycle2"/>
-    <dgm:cxn modelId="{D71E1999-3C88-4F20-83DC-14DCF6078E85}" type="presParOf" srcId="{2C63797F-35D2-4BF1-ADFC-8E15A2A56D28}" destId="{15DBFFA1-5F90-4067-9D91-73AA2852D991}" srcOrd="0" destOrd="0" presId="urn:microsoft.com/office/officeart/2005/8/layout/cycle2"/>
-    <dgm:cxn modelId="{57EE619A-A57E-4D79-8853-8B4B76515210}" type="presParOf" srcId="{B41B0945-C228-466F-ACBC-F0427AE563C3}" destId="{1379CEB1-3469-4B4A-813A-D2A2C295406E}" srcOrd="8" destOrd="0" presId="urn:microsoft.com/office/officeart/2005/8/layout/cycle2"/>
-    <dgm:cxn modelId="{500A328C-4B99-4939-91F5-61DE28C11F6E}" type="presParOf" srcId="{B41B0945-C228-466F-ACBC-F0427AE563C3}" destId="{9F2CA740-10BE-422F-97C4-215D3262A7C2}" srcOrd="9" destOrd="0" presId="urn:microsoft.com/office/officeart/2005/8/layout/cycle2"/>
-    <dgm:cxn modelId="{03B35DD2-675E-43B9-83A7-B5F827F01B94}" type="presParOf" srcId="{9F2CA740-10BE-422F-97C4-215D3262A7C2}" destId="{C262E5EC-AFFC-4D29-8F55-4FC98D066102}" srcOrd="0" destOrd="0" presId="urn:microsoft.com/office/officeart/2005/8/layout/cycle2"/>
-    <dgm:cxn modelId="{53556B7D-D55E-4201-BB39-6DF76BA0F4A1}" type="presParOf" srcId="{B41B0945-C228-466F-ACBC-F0427AE563C3}" destId="{ABB91F78-7B6C-410F-9644-452AF8D7494A}" srcOrd="10" destOrd="0" presId="urn:microsoft.com/office/officeart/2005/8/layout/cycle2"/>
-    <dgm:cxn modelId="{EA9E3356-B7CA-4F42-BAF0-EB250471A1D1}" type="presParOf" srcId="{B41B0945-C228-466F-ACBC-F0427AE563C3}" destId="{48BF6C11-EF1A-4273-900D-DD5B59C0D92F}" srcOrd="11" destOrd="0" presId="urn:microsoft.com/office/officeart/2005/8/layout/cycle2"/>
-    <dgm:cxn modelId="{16DF6EF9-91E9-418B-9429-6473BB8AE104}" type="presParOf" srcId="{48BF6C11-EF1A-4273-900D-DD5B59C0D92F}" destId="{2D827D14-3A64-4B45-B11B-3ECDBC24212A}" srcOrd="0" destOrd="0" presId="urn:microsoft.com/office/officeart/2005/8/layout/cycle2"/>
+    <dgm:cxn modelId="{C798414A-263C-4879-9C9A-B89A5476B363}" type="presOf" srcId="{30169AF5-3F60-49ED-BA16-26E156F3CD77}" destId="{B41B0945-C228-466F-ACBC-F0427AE563C3}" srcOrd="0" destOrd="0" presId="urn:microsoft.com/office/officeart/2005/8/layout/cycle2"/>
+    <dgm:cxn modelId="{C83E9738-6A24-48E5-8C0F-D627BD0904C1}" type="presOf" srcId="{7C03F650-450B-470D-9F41-9EBB6F24DE08}" destId="{915300E8-D21B-48E5-86A7-A677802348CF}" srcOrd="0" destOrd="0" presId="urn:microsoft.com/office/officeart/2005/8/layout/cycle2"/>
+    <dgm:cxn modelId="{0F7B59BB-F455-4BA2-BF11-1205C73865A5}" type="presOf" srcId="{BA319471-CEE2-4F47-BD5C-3922FB7DFA6B}" destId="{2FCF5CF5-49BA-4E5D-A81E-50ABA18D10A9}" srcOrd="1" destOrd="0" presId="urn:microsoft.com/office/officeart/2005/8/layout/cycle2"/>
+    <dgm:cxn modelId="{B8199DDA-93F7-4DF3-AF3C-1E1680C3A11D}" type="presOf" srcId="{F90989A5-9584-42E6-85EC-F46F18F0E118}" destId="{74D1E673-78E8-4911-AB9E-E98BE428CF47}" srcOrd="1" destOrd="0" presId="urn:microsoft.com/office/officeart/2005/8/layout/cycle2"/>
+    <dgm:cxn modelId="{7BF5CBBD-F90F-4965-B8C6-7283E5F54417}" type="presOf" srcId="{F90989A5-9584-42E6-85EC-F46F18F0E118}" destId="{31D81D24-1473-4316-96A5-763E7A6060DC}" srcOrd="0" destOrd="0" presId="urn:microsoft.com/office/officeart/2005/8/layout/cycle2"/>
+    <dgm:cxn modelId="{112562DF-E40F-4BA2-B87D-395BF5857FFD}" type="presOf" srcId="{BA319471-CEE2-4F47-BD5C-3922FB7DFA6B}" destId="{59356F7B-2878-4C69-8BCC-736D52D62464}" srcOrd="0" destOrd="0" presId="urn:microsoft.com/office/officeart/2005/8/layout/cycle2"/>
+    <dgm:cxn modelId="{BF0D0B76-2461-4F98-AEFF-76D10F2F677C}" type="presOf" srcId="{9C8E8DEB-5DB8-4F82-8CE8-1171D0ABBD37}" destId="{2C63797F-35D2-4BF1-ADFC-8E15A2A56D28}" srcOrd="0" destOrd="0" presId="urn:microsoft.com/office/officeart/2005/8/layout/cycle2"/>
+    <dgm:cxn modelId="{4C598B37-2E76-4BFD-9960-4E0A20F08E32}" type="presParOf" srcId="{B41B0945-C228-466F-ACBC-F0427AE563C3}" destId="{915300E8-D21B-48E5-86A7-A677802348CF}" srcOrd="0" destOrd="0" presId="urn:microsoft.com/office/officeart/2005/8/layout/cycle2"/>
+    <dgm:cxn modelId="{ADADE189-EAEC-4864-923E-F6DCE9020ED9}" type="presParOf" srcId="{B41B0945-C228-466F-ACBC-F0427AE563C3}" destId="{23B2CE62-F90C-4121-BB9A-FD58550B5409}" srcOrd="1" destOrd="0" presId="urn:microsoft.com/office/officeart/2005/8/layout/cycle2"/>
+    <dgm:cxn modelId="{C6A047B2-C6F3-4429-AAEC-4C2392F21B01}" type="presParOf" srcId="{23B2CE62-F90C-4121-BB9A-FD58550B5409}" destId="{85727C8B-3068-4E77-A7A1-E6EDA8103D60}" srcOrd="0" destOrd="0" presId="urn:microsoft.com/office/officeart/2005/8/layout/cycle2"/>
+    <dgm:cxn modelId="{B17A201D-7BF9-4140-A86B-8774DD809DE5}" type="presParOf" srcId="{B41B0945-C228-466F-ACBC-F0427AE563C3}" destId="{6AB4841B-36EA-4743-8E11-22D754152787}" srcOrd="2" destOrd="0" presId="urn:microsoft.com/office/officeart/2005/8/layout/cycle2"/>
+    <dgm:cxn modelId="{1AA285AA-0A72-4FEF-9904-33F88F928693}" type="presParOf" srcId="{B41B0945-C228-466F-ACBC-F0427AE563C3}" destId="{59356F7B-2878-4C69-8BCC-736D52D62464}" srcOrd="3" destOrd="0" presId="urn:microsoft.com/office/officeart/2005/8/layout/cycle2"/>
+    <dgm:cxn modelId="{0A0FC2B0-CFD1-40C4-83F9-064C13DAA033}" type="presParOf" srcId="{59356F7B-2878-4C69-8BCC-736D52D62464}" destId="{2FCF5CF5-49BA-4E5D-A81E-50ABA18D10A9}" srcOrd="0" destOrd="0" presId="urn:microsoft.com/office/officeart/2005/8/layout/cycle2"/>
+    <dgm:cxn modelId="{F288EE29-AC66-4B56-9C6B-CB26EA8D034A}" type="presParOf" srcId="{B41B0945-C228-466F-ACBC-F0427AE563C3}" destId="{A670810F-0345-4254-8BC7-4FA06BB5C3CC}" srcOrd="4" destOrd="0" presId="urn:microsoft.com/office/officeart/2005/8/layout/cycle2"/>
+    <dgm:cxn modelId="{72360F2C-6AA6-4BFA-A78A-B869A5C03EF2}" type="presParOf" srcId="{B41B0945-C228-466F-ACBC-F0427AE563C3}" destId="{31D81D24-1473-4316-96A5-763E7A6060DC}" srcOrd="5" destOrd="0" presId="urn:microsoft.com/office/officeart/2005/8/layout/cycle2"/>
+    <dgm:cxn modelId="{477EF41A-8770-4D92-A2F0-C370C5470FBA}" type="presParOf" srcId="{31D81D24-1473-4316-96A5-763E7A6060DC}" destId="{74D1E673-78E8-4911-AB9E-E98BE428CF47}" srcOrd="0" destOrd="0" presId="urn:microsoft.com/office/officeart/2005/8/layout/cycle2"/>
+    <dgm:cxn modelId="{FFCD36EA-9CC1-4369-81A8-D3E30CC29465}" type="presParOf" srcId="{B41B0945-C228-466F-ACBC-F0427AE563C3}" destId="{F9AED730-9635-4E85-B16D-CDB7F5FBEF2A}" srcOrd="6" destOrd="0" presId="urn:microsoft.com/office/officeart/2005/8/layout/cycle2"/>
+    <dgm:cxn modelId="{110DC392-EAF0-4856-ACA5-D565157C9C44}" type="presParOf" srcId="{B41B0945-C228-466F-ACBC-F0427AE563C3}" destId="{2C63797F-35D2-4BF1-ADFC-8E15A2A56D28}" srcOrd="7" destOrd="0" presId="urn:microsoft.com/office/officeart/2005/8/layout/cycle2"/>
+    <dgm:cxn modelId="{16F8EFE3-F14D-4CF0-AC5C-26988D8B6940}" type="presParOf" srcId="{2C63797F-35D2-4BF1-ADFC-8E15A2A56D28}" destId="{15DBFFA1-5F90-4067-9D91-73AA2852D991}" srcOrd="0" destOrd="0" presId="urn:microsoft.com/office/officeart/2005/8/layout/cycle2"/>
+    <dgm:cxn modelId="{B54B5D1F-AE29-4D0A-802E-A73A57A27BFA}" type="presParOf" srcId="{B41B0945-C228-466F-ACBC-F0427AE563C3}" destId="{1379CEB1-3469-4B4A-813A-D2A2C295406E}" srcOrd="8" destOrd="0" presId="urn:microsoft.com/office/officeart/2005/8/layout/cycle2"/>
+    <dgm:cxn modelId="{F88BBBC7-5643-4F08-B2B2-F0326A0DFE19}" type="presParOf" srcId="{B41B0945-C228-466F-ACBC-F0427AE563C3}" destId="{9F2CA740-10BE-422F-97C4-215D3262A7C2}" srcOrd="9" destOrd="0" presId="urn:microsoft.com/office/officeart/2005/8/layout/cycle2"/>
+    <dgm:cxn modelId="{A90D865F-5A95-4A89-B763-673D4957236B}" type="presParOf" srcId="{9F2CA740-10BE-422F-97C4-215D3262A7C2}" destId="{C262E5EC-AFFC-4D29-8F55-4FC98D066102}" srcOrd="0" destOrd="0" presId="urn:microsoft.com/office/officeart/2005/8/layout/cycle2"/>
+    <dgm:cxn modelId="{90EE716A-DEE6-4624-B2F2-8D0916E23AA6}" type="presParOf" srcId="{B41B0945-C228-466F-ACBC-F0427AE563C3}" destId="{ABB91F78-7B6C-410F-9644-452AF8D7494A}" srcOrd="10" destOrd="0" presId="urn:microsoft.com/office/officeart/2005/8/layout/cycle2"/>
+    <dgm:cxn modelId="{849E2F36-A766-4778-ABCA-2D0ADB68B427}" type="presParOf" srcId="{B41B0945-C228-466F-ACBC-F0427AE563C3}" destId="{48BF6C11-EF1A-4273-900D-DD5B59C0D92F}" srcOrd="11" destOrd="0" presId="urn:microsoft.com/office/officeart/2005/8/layout/cycle2"/>
+    <dgm:cxn modelId="{187B32B9-8257-4452-8DAE-7977BCE1572C}" type="presParOf" srcId="{48BF6C11-EF1A-4273-900D-DD5B59C0D92F}" destId="{2D827D14-3A64-4B45-B11B-3ECDBC24212A}" srcOrd="0" destOrd="0" presId="urn:microsoft.com/office/officeart/2005/8/layout/cycle2"/>
   </dgm:cxnLst>
   <dgm:bg/>
   <dgm:whole/>

</xml_diff>

<commit_message>
Date: 12 Sept 2025
</commit_message>
<xml_diff>
--- a/Notes.docx
+++ b/Notes.docx
@@ -4429,6 +4429,26 @@
         </w:rPr>
         <w:t>. (Control is taking time to load)</w:t>
       </w:r>
+    </w:p>
+    <w:p>
+      <w:pPr>
+        <w:pStyle w:val="ListParagraph"/>
+        <w:numPr>
+          <w:ilvl w:val="1"/>
+          <w:numId w:val="14"/>
+        </w:numPr>
+        <w:rPr>
+          <w:lang w:val="en-US"/>
+        </w:rPr>
+      </w:pPr>
+      <w:r>
+        <w:rPr>
+          <w:lang w:val="en-US"/>
+        </w:rPr>
+        <w:t>The control may be inside frame or shadow root.</w:t>
+      </w:r>
+      <w:bookmarkStart w:id="0" w:name="_GoBack"/>
+      <w:bookmarkEnd w:id="0"/>
     </w:p>
     <w:p>
       <w:pPr>
@@ -4597,7 +4617,6 @@
         <w:rPr>
           <w:lang w:val="en-US"/>
         </w:rPr>
-        <w:lastRenderedPageBreak/>
         <w:t>Name</w:t>
       </w:r>
     </w:p>
@@ -6881,8 +6900,6 @@
           <w:lang w:val="en-US"/>
         </w:rPr>
       </w:pPr>
-      <w:bookmarkStart w:id="0" w:name="_GoBack"/>
-      <w:bookmarkEnd w:id="0"/>
     </w:p>
     <w:sectPr>
       <w:pgSz w:w="11906" w:h="16838"/>
@@ -11555,49 +11572,49 @@
     </dgm:pt>
   </dgm:ptLst>
   <dgm:cxnLst>
-    <dgm:cxn modelId="{BFE1B4B4-650B-40BA-8476-63953BA92D5D}" type="presOf" srcId="{7C03F650-450B-470D-9F41-9EBB6F24DE08}" destId="{915300E8-D21B-48E5-86A7-A677802348CF}" srcOrd="0" destOrd="0" presId="urn:microsoft.com/office/officeart/2005/8/layout/cycle2"/>
-    <dgm:cxn modelId="{85BB6F5F-043B-4223-814C-DBF29CBCDFD3}" type="presOf" srcId="{A3989F04-57A2-4559-BF44-044AD8FBD67A}" destId="{A670810F-0345-4254-8BC7-4FA06BB5C3CC}" srcOrd="0" destOrd="0" presId="urn:microsoft.com/office/officeart/2005/8/layout/cycle2"/>
-    <dgm:cxn modelId="{B1A95587-84CA-4CFC-BC3C-4ACFCE87D22E}" type="presOf" srcId="{D35F654F-C71E-4CF2-BA21-C832C92DCB2B}" destId="{9F2CA740-10BE-422F-97C4-215D3262A7C2}" srcOrd="0" destOrd="0" presId="urn:microsoft.com/office/officeart/2005/8/layout/cycle2"/>
-    <dgm:cxn modelId="{9B8BF793-47C8-469E-AADB-E360466F279C}" type="presOf" srcId="{D996DF6E-E24A-4672-B53C-F45E82ED11D5}" destId="{23B2CE62-F90C-4121-BB9A-FD58550B5409}" srcOrd="0" destOrd="0" presId="urn:microsoft.com/office/officeart/2005/8/layout/cycle2"/>
-    <dgm:cxn modelId="{5C86FD51-6C48-4D6F-953F-A3A698494528}" type="presOf" srcId="{30169AF5-3F60-49ED-BA16-26E156F3CD77}" destId="{B41B0945-C228-466F-ACBC-F0427AE563C3}" srcOrd="0" destOrd="0" presId="urn:microsoft.com/office/officeart/2005/8/layout/cycle2"/>
-    <dgm:cxn modelId="{CE986251-73F8-49FF-AFC6-62CF5071D78A}" type="presOf" srcId="{D01084D7-448F-40E6-BAD6-916FA5266B35}" destId="{6AB4841B-36EA-4743-8E11-22D754152787}" srcOrd="0" destOrd="0" presId="urn:microsoft.com/office/officeart/2005/8/layout/cycle2"/>
-    <dgm:cxn modelId="{11FCEE71-2108-4737-AC30-246C5CCC4D72}" type="presOf" srcId="{F2BE9233-54BD-4C28-B5F2-1B65E9CDDF96}" destId="{F9AED730-9635-4E85-B16D-CDB7F5FBEF2A}" srcOrd="0" destOrd="0" presId="urn:microsoft.com/office/officeart/2005/8/layout/cycle2"/>
-    <dgm:cxn modelId="{66EC039D-E2B4-45BB-B66C-1DD25754B212}" type="presOf" srcId="{F90989A5-9584-42E6-85EC-F46F18F0E118}" destId="{74D1E673-78E8-4911-AB9E-E98BE428CF47}" srcOrd="1" destOrd="0" presId="urn:microsoft.com/office/officeart/2005/8/layout/cycle2"/>
-    <dgm:cxn modelId="{4858F79C-6121-48BC-A02F-27C4E2E08B84}" type="presOf" srcId="{A01E66F2-8DE2-4DBF-B8E1-AB48AEB22F0F}" destId="{48BF6C11-EF1A-4273-900D-DD5B59C0D92F}" srcOrd="0" destOrd="0" presId="urn:microsoft.com/office/officeart/2005/8/layout/cycle2"/>
-    <dgm:cxn modelId="{B779FFA9-EBDE-481E-9037-2C97C8965141}" type="presOf" srcId="{6BE14A29-3F47-4123-9A53-87F7E3976F30}" destId="{1379CEB1-3469-4B4A-813A-D2A2C295406E}" srcOrd="0" destOrd="0" presId="urn:microsoft.com/office/officeart/2005/8/layout/cycle2"/>
+    <dgm:cxn modelId="{BCB73CA1-A8BA-4630-8998-0AB5F1412635}" type="presOf" srcId="{9C8E8DEB-5DB8-4F82-8CE8-1171D0ABBD37}" destId="{15DBFFA1-5F90-4067-9D91-73AA2852D991}" srcOrd="1" destOrd="0" presId="urn:microsoft.com/office/officeart/2005/8/layout/cycle2"/>
+    <dgm:cxn modelId="{3354B5DD-DD06-4226-83B0-C5DBB4314929}" srcId="{30169AF5-3F60-49ED-BA16-26E156F3CD77}" destId="{D01084D7-448F-40E6-BAD6-916FA5266B35}" srcOrd="1" destOrd="0" parTransId="{11A516D9-F860-4BE8-BA91-08CBF1F90AAF}" sibTransId="{BA319471-CEE2-4F47-BD5C-3922FB7DFA6B}"/>
+    <dgm:cxn modelId="{4A7628CA-D4FA-409C-B5C4-816187EDC643}" type="presOf" srcId="{7C03F650-450B-470D-9F41-9EBB6F24DE08}" destId="{915300E8-D21B-48E5-86A7-A677802348CF}" srcOrd="0" destOrd="0" presId="urn:microsoft.com/office/officeart/2005/8/layout/cycle2"/>
     <dgm:cxn modelId="{3A6CAD7C-9D06-4601-9DA6-58C23D4FE730}" srcId="{30169AF5-3F60-49ED-BA16-26E156F3CD77}" destId="{E3147738-712C-470E-BA43-1900B58F3BA1}" srcOrd="5" destOrd="0" parTransId="{390EF3C2-87EC-4379-B2B2-CD6400F6DFF0}" sibTransId="{A01E66F2-8DE2-4DBF-B8E1-AB48AEB22F0F}"/>
-    <dgm:cxn modelId="{164BCAD4-90AE-4875-9BCB-53B2E4913A4D}" type="presOf" srcId="{D996DF6E-E24A-4672-B53C-F45E82ED11D5}" destId="{85727C8B-3068-4E77-A7A1-E6EDA8103D60}" srcOrd="1" destOrd="0" presId="urn:microsoft.com/office/officeart/2005/8/layout/cycle2"/>
-    <dgm:cxn modelId="{F6A56139-7F2E-431B-BDF4-48A0AC1E10B3}" type="presOf" srcId="{BA319471-CEE2-4F47-BD5C-3922FB7DFA6B}" destId="{2FCF5CF5-49BA-4E5D-A81E-50ABA18D10A9}" srcOrd="1" destOrd="0" presId="urn:microsoft.com/office/officeart/2005/8/layout/cycle2"/>
-    <dgm:cxn modelId="{56B244FB-6C4B-401B-85DE-446509522270}" type="presOf" srcId="{F90989A5-9584-42E6-85EC-F46F18F0E118}" destId="{31D81D24-1473-4316-96A5-763E7A6060DC}" srcOrd="0" destOrd="0" presId="urn:microsoft.com/office/officeart/2005/8/layout/cycle2"/>
-    <dgm:cxn modelId="{390F1CA6-CCF9-4480-810F-FAFDB989256A}" type="presOf" srcId="{9C8E8DEB-5DB8-4F82-8CE8-1171D0ABBD37}" destId="{15DBFFA1-5F90-4067-9D91-73AA2852D991}" srcOrd="1" destOrd="0" presId="urn:microsoft.com/office/officeart/2005/8/layout/cycle2"/>
+    <dgm:cxn modelId="{3C433518-88E4-4CFC-90D6-B9E2CF94162D}" type="presOf" srcId="{30169AF5-3F60-49ED-BA16-26E156F3CD77}" destId="{B41B0945-C228-466F-ACBC-F0427AE563C3}" srcOrd="0" destOrd="0" presId="urn:microsoft.com/office/officeart/2005/8/layout/cycle2"/>
+    <dgm:cxn modelId="{FA45F822-2B82-46C8-9297-BF4F9B0B5C16}" type="presOf" srcId="{6BE14A29-3F47-4123-9A53-87F7E3976F30}" destId="{1379CEB1-3469-4B4A-813A-D2A2C295406E}" srcOrd="0" destOrd="0" presId="urn:microsoft.com/office/officeart/2005/8/layout/cycle2"/>
+    <dgm:cxn modelId="{108537BD-B320-4119-A1CC-706462728100}" type="presOf" srcId="{D35F654F-C71E-4CF2-BA21-C832C92DCB2B}" destId="{9F2CA740-10BE-422F-97C4-215D3262A7C2}" srcOrd="0" destOrd="0" presId="urn:microsoft.com/office/officeart/2005/8/layout/cycle2"/>
+    <dgm:cxn modelId="{9D50B2B8-24E7-4BE2-8C11-5B806721853F}" type="presOf" srcId="{9C8E8DEB-5DB8-4F82-8CE8-1171D0ABBD37}" destId="{2C63797F-35D2-4BF1-ADFC-8E15A2A56D28}" srcOrd="0" destOrd="0" presId="urn:microsoft.com/office/officeart/2005/8/layout/cycle2"/>
+    <dgm:cxn modelId="{74371C81-19E4-408E-8AEA-2D1D9211BDCB}" type="presOf" srcId="{A3989F04-57A2-4559-BF44-044AD8FBD67A}" destId="{A670810F-0345-4254-8BC7-4FA06BB5C3CC}" srcOrd="0" destOrd="0" presId="urn:microsoft.com/office/officeart/2005/8/layout/cycle2"/>
+    <dgm:cxn modelId="{026D6AE9-41C4-4E88-B421-D7A6BB38CC27}" srcId="{30169AF5-3F60-49ED-BA16-26E156F3CD77}" destId="{F2BE9233-54BD-4C28-B5F2-1B65E9CDDF96}" srcOrd="3" destOrd="0" parTransId="{672307C0-A98C-48FA-8729-D6E3187E5E3A}" sibTransId="{9C8E8DEB-5DB8-4F82-8CE8-1171D0ABBD37}"/>
+    <dgm:cxn modelId="{F09098C9-25DA-4B02-9318-DF911A08464B}" type="presOf" srcId="{F90989A5-9584-42E6-85EC-F46F18F0E118}" destId="{74D1E673-78E8-4911-AB9E-E98BE428CF47}" srcOrd="1" destOrd="0" presId="urn:microsoft.com/office/officeart/2005/8/layout/cycle2"/>
+    <dgm:cxn modelId="{1C93728A-C307-4AD1-B38B-9D6DE14AE321}" type="presOf" srcId="{BA319471-CEE2-4F47-BD5C-3922FB7DFA6B}" destId="{2FCF5CF5-49BA-4E5D-A81E-50ABA18D10A9}" srcOrd="1" destOrd="0" presId="urn:microsoft.com/office/officeart/2005/8/layout/cycle2"/>
     <dgm:cxn modelId="{FC683937-3E9A-4071-B70B-BFE511A7B23C}" srcId="{30169AF5-3F60-49ED-BA16-26E156F3CD77}" destId="{6BE14A29-3F47-4123-9A53-87F7E3976F30}" srcOrd="4" destOrd="0" parTransId="{14C76E7C-A806-46D2-A04B-406CC2747FBF}" sibTransId="{D35F654F-C71E-4CF2-BA21-C832C92DCB2B}"/>
-    <dgm:cxn modelId="{61418BAD-BFF7-4104-B807-3921163C3709}" type="presOf" srcId="{BA319471-CEE2-4F47-BD5C-3922FB7DFA6B}" destId="{59356F7B-2878-4C69-8BCC-736D52D62464}" srcOrd="0" destOrd="0" presId="urn:microsoft.com/office/officeart/2005/8/layout/cycle2"/>
-    <dgm:cxn modelId="{2CC467D8-9E66-42A4-B884-D9ACE6EB9455}" type="presOf" srcId="{E3147738-712C-470E-BA43-1900B58F3BA1}" destId="{ABB91F78-7B6C-410F-9644-452AF8D7494A}" srcOrd="0" destOrd="0" presId="urn:microsoft.com/office/officeart/2005/8/layout/cycle2"/>
-    <dgm:cxn modelId="{026D6AE9-41C4-4E88-B421-D7A6BB38CC27}" srcId="{30169AF5-3F60-49ED-BA16-26E156F3CD77}" destId="{F2BE9233-54BD-4C28-B5F2-1B65E9CDDF96}" srcOrd="3" destOrd="0" parTransId="{672307C0-A98C-48FA-8729-D6E3187E5E3A}" sibTransId="{9C8E8DEB-5DB8-4F82-8CE8-1171D0ABBD37}"/>
+    <dgm:cxn modelId="{2235659A-BB6D-42E0-AD13-F29A35BE3AF2}" type="presOf" srcId="{BA319471-CEE2-4F47-BD5C-3922FB7DFA6B}" destId="{59356F7B-2878-4C69-8BCC-736D52D62464}" srcOrd="0" destOrd="0" presId="urn:microsoft.com/office/officeart/2005/8/layout/cycle2"/>
     <dgm:cxn modelId="{F09F8ED9-D24F-448F-AF8E-F92EC404CBA7}" srcId="{30169AF5-3F60-49ED-BA16-26E156F3CD77}" destId="{7C03F650-450B-470D-9F41-9EBB6F24DE08}" srcOrd="0" destOrd="0" parTransId="{A8856599-3D3C-4A85-ABFD-520651FDD510}" sibTransId="{D996DF6E-E24A-4672-B53C-F45E82ED11D5}"/>
-    <dgm:cxn modelId="{DC8B3ADF-6BC8-417C-A49E-535407DD4803}" type="presOf" srcId="{D35F654F-C71E-4CF2-BA21-C832C92DCB2B}" destId="{C262E5EC-AFFC-4D29-8F55-4FC98D066102}" srcOrd="1" destOrd="0" presId="urn:microsoft.com/office/officeart/2005/8/layout/cycle2"/>
     <dgm:cxn modelId="{57569DDB-32CD-4132-93C5-3D28EE6D9D0F}" srcId="{30169AF5-3F60-49ED-BA16-26E156F3CD77}" destId="{A3989F04-57A2-4559-BF44-044AD8FBD67A}" srcOrd="2" destOrd="0" parTransId="{E7AABBEB-8EE1-4214-A7B4-DD1F0B63D6DC}" sibTransId="{F90989A5-9584-42E6-85EC-F46F18F0E118}"/>
-    <dgm:cxn modelId="{FA7A24BF-6670-415D-900E-08678E08C861}" type="presOf" srcId="{9C8E8DEB-5DB8-4F82-8CE8-1171D0ABBD37}" destId="{2C63797F-35D2-4BF1-ADFC-8E15A2A56D28}" srcOrd="0" destOrd="0" presId="urn:microsoft.com/office/officeart/2005/8/layout/cycle2"/>
-    <dgm:cxn modelId="{3354B5DD-DD06-4226-83B0-C5DBB4314929}" srcId="{30169AF5-3F60-49ED-BA16-26E156F3CD77}" destId="{D01084D7-448F-40E6-BAD6-916FA5266B35}" srcOrd="1" destOrd="0" parTransId="{11A516D9-F860-4BE8-BA91-08CBF1F90AAF}" sibTransId="{BA319471-CEE2-4F47-BD5C-3922FB7DFA6B}"/>
-    <dgm:cxn modelId="{D9D66686-A659-4E05-AB61-1D8AA5F87951}" type="presOf" srcId="{A01E66F2-8DE2-4DBF-B8E1-AB48AEB22F0F}" destId="{2D827D14-3A64-4B45-B11B-3ECDBC24212A}" srcOrd="1" destOrd="0" presId="urn:microsoft.com/office/officeart/2005/8/layout/cycle2"/>
-    <dgm:cxn modelId="{B0FD8BD0-5F3F-40D6-B8EA-29755A7CA720}" type="presParOf" srcId="{B41B0945-C228-466F-ACBC-F0427AE563C3}" destId="{915300E8-D21B-48E5-86A7-A677802348CF}" srcOrd="0" destOrd="0" presId="urn:microsoft.com/office/officeart/2005/8/layout/cycle2"/>
-    <dgm:cxn modelId="{03607631-265D-4A0C-BA4A-03C0FF131CBB}" type="presParOf" srcId="{B41B0945-C228-466F-ACBC-F0427AE563C3}" destId="{23B2CE62-F90C-4121-BB9A-FD58550B5409}" srcOrd="1" destOrd="0" presId="urn:microsoft.com/office/officeart/2005/8/layout/cycle2"/>
-    <dgm:cxn modelId="{50592A71-CC10-4DFE-8F2E-E8ED03192D8D}" type="presParOf" srcId="{23B2CE62-F90C-4121-BB9A-FD58550B5409}" destId="{85727C8B-3068-4E77-A7A1-E6EDA8103D60}" srcOrd="0" destOrd="0" presId="urn:microsoft.com/office/officeart/2005/8/layout/cycle2"/>
-    <dgm:cxn modelId="{0AE84D30-A3D8-4EB1-B705-56D1819EC90A}" type="presParOf" srcId="{B41B0945-C228-466F-ACBC-F0427AE563C3}" destId="{6AB4841B-36EA-4743-8E11-22D754152787}" srcOrd="2" destOrd="0" presId="urn:microsoft.com/office/officeart/2005/8/layout/cycle2"/>
-    <dgm:cxn modelId="{AE77C208-354A-4850-98BA-32399A9EACF6}" type="presParOf" srcId="{B41B0945-C228-466F-ACBC-F0427AE563C3}" destId="{59356F7B-2878-4C69-8BCC-736D52D62464}" srcOrd="3" destOrd="0" presId="urn:microsoft.com/office/officeart/2005/8/layout/cycle2"/>
-    <dgm:cxn modelId="{94A1BF37-3E34-4BA3-9DAB-68467E1B2F23}" type="presParOf" srcId="{59356F7B-2878-4C69-8BCC-736D52D62464}" destId="{2FCF5CF5-49BA-4E5D-A81E-50ABA18D10A9}" srcOrd="0" destOrd="0" presId="urn:microsoft.com/office/officeart/2005/8/layout/cycle2"/>
-    <dgm:cxn modelId="{6A963C6B-1485-4223-A275-819D32228783}" type="presParOf" srcId="{B41B0945-C228-466F-ACBC-F0427AE563C3}" destId="{A670810F-0345-4254-8BC7-4FA06BB5C3CC}" srcOrd="4" destOrd="0" presId="urn:microsoft.com/office/officeart/2005/8/layout/cycle2"/>
-    <dgm:cxn modelId="{96BFA7AC-7945-4A22-9B7D-CAD014CF10AE}" type="presParOf" srcId="{B41B0945-C228-466F-ACBC-F0427AE563C3}" destId="{31D81D24-1473-4316-96A5-763E7A6060DC}" srcOrd="5" destOrd="0" presId="urn:microsoft.com/office/officeart/2005/8/layout/cycle2"/>
-    <dgm:cxn modelId="{A0E66B0F-5687-4CAC-B755-D00208512BB4}" type="presParOf" srcId="{31D81D24-1473-4316-96A5-763E7A6060DC}" destId="{74D1E673-78E8-4911-AB9E-E98BE428CF47}" srcOrd="0" destOrd="0" presId="urn:microsoft.com/office/officeart/2005/8/layout/cycle2"/>
-    <dgm:cxn modelId="{5C59D3F9-9221-4A94-BE18-9DA372C19340}" type="presParOf" srcId="{B41B0945-C228-466F-ACBC-F0427AE563C3}" destId="{F9AED730-9635-4E85-B16D-CDB7F5FBEF2A}" srcOrd="6" destOrd="0" presId="urn:microsoft.com/office/officeart/2005/8/layout/cycle2"/>
-    <dgm:cxn modelId="{559096B8-0E90-4CDB-9C76-05203DCC699E}" type="presParOf" srcId="{B41B0945-C228-466F-ACBC-F0427AE563C3}" destId="{2C63797F-35D2-4BF1-ADFC-8E15A2A56D28}" srcOrd="7" destOrd="0" presId="urn:microsoft.com/office/officeart/2005/8/layout/cycle2"/>
-    <dgm:cxn modelId="{EEFA0E85-6245-4A4E-86E6-CEA69EC15BCF}" type="presParOf" srcId="{2C63797F-35D2-4BF1-ADFC-8E15A2A56D28}" destId="{15DBFFA1-5F90-4067-9D91-73AA2852D991}" srcOrd="0" destOrd="0" presId="urn:microsoft.com/office/officeart/2005/8/layout/cycle2"/>
-    <dgm:cxn modelId="{AC7B2EA5-157A-427A-9B54-CE559B861CB1}" type="presParOf" srcId="{B41B0945-C228-466F-ACBC-F0427AE563C3}" destId="{1379CEB1-3469-4B4A-813A-D2A2C295406E}" srcOrd="8" destOrd="0" presId="urn:microsoft.com/office/officeart/2005/8/layout/cycle2"/>
-    <dgm:cxn modelId="{6ECACB14-C2AB-4FCD-8C50-F61CB102F38E}" type="presParOf" srcId="{B41B0945-C228-466F-ACBC-F0427AE563C3}" destId="{9F2CA740-10BE-422F-97C4-215D3262A7C2}" srcOrd="9" destOrd="0" presId="urn:microsoft.com/office/officeart/2005/8/layout/cycle2"/>
-    <dgm:cxn modelId="{64FAF0A2-2E10-43A1-9126-CB1BD3A32190}" type="presParOf" srcId="{9F2CA740-10BE-422F-97C4-215D3262A7C2}" destId="{C262E5EC-AFFC-4D29-8F55-4FC98D066102}" srcOrd="0" destOrd="0" presId="urn:microsoft.com/office/officeart/2005/8/layout/cycle2"/>
-    <dgm:cxn modelId="{7CDD24E3-6D58-4652-883C-EE686E91CF28}" type="presParOf" srcId="{B41B0945-C228-466F-ACBC-F0427AE563C3}" destId="{ABB91F78-7B6C-410F-9644-452AF8D7494A}" srcOrd="10" destOrd="0" presId="urn:microsoft.com/office/officeart/2005/8/layout/cycle2"/>
-    <dgm:cxn modelId="{E68DD692-E6E5-48B6-B281-AE42555C0411}" type="presParOf" srcId="{B41B0945-C228-466F-ACBC-F0427AE563C3}" destId="{48BF6C11-EF1A-4273-900D-DD5B59C0D92F}" srcOrd="11" destOrd="0" presId="urn:microsoft.com/office/officeart/2005/8/layout/cycle2"/>
-    <dgm:cxn modelId="{B87ECD7D-2DE2-4DAF-8C1B-1E3B12FA1A34}" type="presParOf" srcId="{48BF6C11-EF1A-4273-900D-DD5B59C0D92F}" destId="{2D827D14-3A64-4B45-B11B-3ECDBC24212A}" srcOrd="0" destOrd="0" presId="urn:microsoft.com/office/officeart/2005/8/layout/cycle2"/>
+    <dgm:cxn modelId="{F30C02A5-69CD-4C19-9E74-E7FDB3E07676}" type="presOf" srcId="{A01E66F2-8DE2-4DBF-B8E1-AB48AEB22F0F}" destId="{48BF6C11-EF1A-4273-900D-DD5B59C0D92F}" srcOrd="0" destOrd="0" presId="urn:microsoft.com/office/officeart/2005/8/layout/cycle2"/>
+    <dgm:cxn modelId="{DE7F4290-D436-4F06-920C-7CBDC9898D48}" type="presOf" srcId="{F2BE9233-54BD-4C28-B5F2-1B65E9CDDF96}" destId="{F9AED730-9635-4E85-B16D-CDB7F5FBEF2A}" srcOrd="0" destOrd="0" presId="urn:microsoft.com/office/officeart/2005/8/layout/cycle2"/>
+    <dgm:cxn modelId="{53EE3BFC-F89F-438C-84C2-F919936EB0F7}" type="presOf" srcId="{D35F654F-C71E-4CF2-BA21-C832C92DCB2B}" destId="{C262E5EC-AFFC-4D29-8F55-4FC98D066102}" srcOrd="1" destOrd="0" presId="urn:microsoft.com/office/officeart/2005/8/layout/cycle2"/>
+    <dgm:cxn modelId="{DB836588-6F57-4A36-B4C1-1BDF9C3AA295}" type="presOf" srcId="{D996DF6E-E24A-4672-B53C-F45E82ED11D5}" destId="{85727C8B-3068-4E77-A7A1-E6EDA8103D60}" srcOrd="1" destOrd="0" presId="urn:microsoft.com/office/officeart/2005/8/layout/cycle2"/>
+    <dgm:cxn modelId="{7E9FB7AF-F01D-4FB6-96A6-346C8355AC84}" type="presOf" srcId="{E3147738-712C-470E-BA43-1900B58F3BA1}" destId="{ABB91F78-7B6C-410F-9644-452AF8D7494A}" srcOrd="0" destOrd="0" presId="urn:microsoft.com/office/officeart/2005/8/layout/cycle2"/>
+    <dgm:cxn modelId="{294B337E-7996-4801-96E3-7E59B5195695}" type="presOf" srcId="{F90989A5-9584-42E6-85EC-F46F18F0E118}" destId="{31D81D24-1473-4316-96A5-763E7A6060DC}" srcOrd="0" destOrd="0" presId="urn:microsoft.com/office/officeart/2005/8/layout/cycle2"/>
+    <dgm:cxn modelId="{9F007A08-E535-49F0-A76A-DED844E0F66D}" type="presOf" srcId="{D996DF6E-E24A-4672-B53C-F45E82ED11D5}" destId="{23B2CE62-F90C-4121-BB9A-FD58550B5409}" srcOrd="0" destOrd="0" presId="urn:microsoft.com/office/officeart/2005/8/layout/cycle2"/>
+    <dgm:cxn modelId="{E2E1ED2E-FC0F-4580-A558-F94BF26D9C6C}" type="presOf" srcId="{A01E66F2-8DE2-4DBF-B8E1-AB48AEB22F0F}" destId="{2D827D14-3A64-4B45-B11B-3ECDBC24212A}" srcOrd="1" destOrd="0" presId="urn:microsoft.com/office/officeart/2005/8/layout/cycle2"/>
+    <dgm:cxn modelId="{9E8B3E0E-E998-4F24-BEC8-ECB7382B4BCD}" type="presOf" srcId="{D01084D7-448F-40E6-BAD6-916FA5266B35}" destId="{6AB4841B-36EA-4743-8E11-22D754152787}" srcOrd="0" destOrd="0" presId="urn:microsoft.com/office/officeart/2005/8/layout/cycle2"/>
+    <dgm:cxn modelId="{643C260E-C688-4474-A795-7431602C7E10}" type="presParOf" srcId="{B41B0945-C228-466F-ACBC-F0427AE563C3}" destId="{915300E8-D21B-48E5-86A7-A677802348CF}" srcOrd="0" destOrd="0" presId="urn:microsoft.com/office/officeart/2005/8/layout/cycle2"/>
+    <dgm:cxn modelId="{DE67ACCD-523A-41AD-B8DB-CBBC33A15C15}" type="presParOf" srcId="{B41B0945-C228-466F-ACBC-F0427AE563C3}" destId="{23B2CE62-F90C-4121-BB9A-FD58550B5409}" srcOrd="1" destOrd="0" presId="urn:microsoft.com/office/officeart/2005/8/layout/cycle2"/>
+    <dgm:cxn modelId="{39F0BDE5-7625-48CC-BBD3-2AB017A98289}" type="presParOf" srcId="{23B2CE62-F90C-4121-BB9A-FD58550B5409}" destId="{85727C8B-3068-4E77-A7A1-E6EDA8103D60}" srcOrd="0" destOrd="0" presId="urn:microsoft.com/office/officeart/2005/8/layout/cycle2"/>
+    <dgm:cxn modelId="{60B1F311-AB88-4E3D-A75B-77245893F48F}" type="presParOf" srcId="{B41B0945-C228-466F-ACBC-F0427AE563C3}" destId="{6AB4841B-36EA-4743-8E11-22D754152787}" srcOrd="2" destOrd="0" presId="urn:microsoft.com/office/officeart/2005/8/layout/cycle2"/>
+    <dgm:cxn modelId="{3E202A76-4766-4F6D-A78F-5CF51436B025}" type="presParOf" srcId="{B41B0945-C228-466F-ACBC-F0427AE563C3}" destId="{59356F7B-2878-4C69-8BCC-736D52D62464}" srcOrd="3" destOrd="0" presId="urn:microsoft.com/office/officeart/2005/8/layout/cycle2"/>
+    <dgm:cxn modelId="{6D492EF9-137B-487D-8255-F1368F0AB0A0}" type="presParOf" srcId="{59356F7B-2878-4C69-8BCC-736D52D62464}" destId="{2FCF5CF5-49BA-4E5D-A81E-50ABA18D10A9}" srcOrd="0" destOrd="0" presId="urn:microsoft.com/office/officeart/2005/8/layout/cycle2"/>
+    <dgm:cxn modelId="{0C8D62D5-2611-44ED-8B21-A196E9AEEB38}" type="presParOf" srcId="{B41B0945-C228-466F-ACBC-F0427AE563C3}" destId="{A670810F-0345-4254-8BC7-4FA06BB5C3CC}" srcOrd="4" destOrd="0" presId="urn:microsoft.com/office/officeart/2005/8/layout/cycle2"/>
+    <dgm:cxn modelId="{E9DB90E0-9043-406C-9662-263AD31A3BF2}" type="presParOf" srcId="{B41B0945-C228-466F-ACBC-F0427AE563C3}" destId="{31D81D24-1473-4316-96A5-763E7A6060DC}" srcOrd="5" destOrd="0" presId="urn:microsoft.com/office/officeart/2005/8/layout/cycle2"/>
+    <dgm:cxn modelId="{3F591ECC-60DE-4C91-830C-87BBB3C8122F}" type="presParOf" srcId="{31D81D24-1473-4316-96A5-763E7A6060DC}" destId="{74D1E673-78E8-4911-AB9E-E98BE428CF47}" srcOrd="0" destOrd="0" presId="urn:microsoft.com/office/officeart/2005/8/layout/cycle2"/>
+    <dgm:cxn modelId="{94A819D3-59D5-4A0E-A513-C80B18386D9F}" type="presParOf" srcId="{B41B0945-C228-466F-ACBC-F0427AE563C3}" destId="{F9AED730-9635-4E85-B16D-CDB7F5FBEF2A}" srcOrd="6" destOrd="0" presId="urn:microsoft.com/office/officeart/2005/8/layout/cycle2"/>
+    <dgm:cxn modelId="{004557E4-64AC-46E7-9A51-0BD605012F46}" type="presParOf" srcId="{B41B0945-C228-466F-ACBC-F0427AE563C3}" destId="{2C63797F-35D2-4BF1-ADFC-8E15A2A56D28}" srcOrd="7" destOrd="0" presId="urn:microsoft.com/office/officeart/2005/8/layout/cycle2"/>
+    <dgm:cxn modelId="{3ACDFC4E-0A14-4E62-9F69-3C37E5B65401}" type="presParOf" srcId="{2C63797F-35D2-4BF1-ADFC-8E15A2A56D28}" destId="{15DBFFA1-5F90-4067-9D91-73AA2852D991}" srcOrd="0" destOrd="0" presId="urn:microsoft.com/office/officeart/2005/8/layout/cycle2"/>
+    <dgm:cxn modelId="{14C5CEDF-35CD-49F9-A8DB-3770852A9BB1}" type="presParOf" srcId="{B41B0945-C228-466F-ACBC-F0427AE563C3}" destId="{1379CEB1-3469-4B4A-813A-D2A2C295406E}" srcOrd="8" destOrd="0" presId="urn:microsoft.com/office/officeart/2005/8/layout/cycle2"/>
+    <dgm:cxn modelId="{17F28821-AD17-4842-892F-43DF570CB748}" type="presParOf" srcId="{B41B0945-C228-466F-ACBC-F0427AE563C3}" destId="{9F2CA740-10BE-422F-97C4-215D3262A7C2}" srcOrd="9" destOrd="0" presId="urn:microsoft.com/office/officeart/2005/8/layout/cycle2"/>
+    <dgm:cxn modelId="{2EA7C2ED-B78B-4AD7-B3E6-581D6F8030A4}" type="presParOf" srcId="{9F2CA740-10BE-422F-97C4-215D3262A7C2}" destId="{C262E5EC-AFFC-4D29-8F55-4FC98D066102}" srcOrd="0" destOrd="0" presId="urn:microsoft.com/office/officeart/2005/8/layout/cycle2"/>
+    <dgm:cxn modelId="{553E8C00-EB93-4944-9B2F-E06373423644}" type="presParOf" srcId="{B41B0945-C228-466F-ACBC-F0427AE563C3}" destId="{ABB91F78-7B6C-410F-9644-452AF8D7494A}" srcOrd="10" destOrd="0" presId="urn:microsoft.com/office/officeart/2005/8/layout/cycle2"/>
+    <dgm:cxn modelId="{E6270E17-B604-464E-A7A6-926DC478FAB8}" type="presParOf" srcId="{B41B0945-C228-466F-ACBC-F0427AE563C3}" destId="{48BF6C11-EF1A-4273-900D-DD5B59C0D92F}" srcOrd="11" destOrd="0" presId="urn:microsoft.com/office/officeart/2005/8/layout/cycle2"/>
+    <dgm:cxn modelId="{3130EAC9-F3FA-4F2A-9FA4-606859D1CAF6}" type="presParOf" srcId="{48BF6C11-EF1A-4273-900D-DD5B59C0D92F}" destId="{2D827D14-3A64-4B45-B11B-3ECDBC24212A}" srcOrd="0" destOrd="0" presId="urn:microsoft.com/office/officeart/2005/8/layout/cycle2"/>
   </dgm:cxnLst>
   <dgm:bg/>
   <dgm:whole/>

</xml_diff>

<commit_message>
Date: 19 Sept 2025
</commit_message>
<xml_diff>
--- a/Notes.docx
+++ b/Notes.docx
@@ -534,11 +534,19 @@
           <w:lang w:val="en-US"/>
         </w:rPr>
       </w:pPr>
-      <w:r>
-        <w:rPr>
-          <w:lang w:val="en-US"/>
-        </w:rPr>
-        <w:t>Thread.sleep()</w:t>
+      <w:proofErr w:type="spellStart"/>
+      <w:r>
+        <w:rPr>
+          <w:lang w:val="en-US"/>
+        </w:rPr>
+        <w:t>Thread.sleep</w:t>
+      </w:r>
+      <w:proofErr w:type="spellEnd"/>
+      <w:r>
+        <w:rPr>
+          <w:lang w:val="en-US"/>
+        </w:rPr>
+        <w:t>()</w:t>
       </w:r>
     </w:p>
     <w:p>
@@ -1921,8 +1929,18 @@
           <w:lang w:val="en-US"/>
         </w:rPr>
         <w:lastRenderedPageBreak/>
-        <w:t>What is Software Testing</w:t>
-      </w:r>
+        <w:t xml:space="preserve">What is Software </w:t>
+      </w:r>
+      <w:proofErr w:type="gramStart"/>
+      <w:r>
+        <w:rPr>
+          <w:b/>
+          <w:bCs/>
+          <w:lang w:val="en-US"/>
+        </w:rPr>
+        <w:t>Testing</w:t>
+      </w:r>
+      <w:proofErr w:type="gramEnd"/>
     </w:p>
     <w:p>
       <w:pPr>
@@ -2873,8 +2891,16 @@
         <w:rPr>
           <w:lang w:val="en-US"/>
         </w:rPr>
-        <w:t xml:space="preserve"> – Record and playback mech</w:t>
-      </w:r>
+        <w:t xml:space="preserve"> – Record and playback </w:t>
+      </w:r>
+      <w:proofErr w:type="spellStart"/>
+      <w:r>
+        <w:rPr>
+          <w:lang w:val="en-US"/>
+        </w:rPr>
+        <w:t>mech</w:t>
+      </w:r>
+      <w:proofErr w:type="spellEnd"/>
     </w:p>
     <w:p>
       <w:pPr>
@@ -3204,8 +3230,16 @@
         <w:rPr>
           <w:lang w:val="en-US"/>
         </w:rPr>
-        <w:t>Idea Intellj</w:t>
-      </w:r>
+        <w:t xml:space="preserve">Idea </w:t>
+      </w:r>
+      <w:proofErr w:type="spellStart"/>
+      <w:r>
+        <w:rPr>
+          <w:lang w:val="en-US"/>
+        </w:rPr>
+        <w:t>Intellj</w:t>
+      </w:r>
+      <w:proofErr w:type="spellEnd"/>
     </w:p>
     <w:p>
       <w:pPr>
@@ -3273,12 +3307,14 @@
           <w:lang w:val="en-US"/>
         </w:rPr>
       </w:pPr>
+      <w:proofErr w:type="spellStart"/>
       <w:r>
         <w:rPr>
           <w:lang w:val="en-US"/>
         </w:rPr>
         <w:t>YourName_SeleniumDemos</w:t>
       </w:r>
+      <w:proofErr w:type="spellEnd"/>
     </w:p>
     <w:p>
       <w:pPr>
@@ -3587,7 +3623,21 @@
         <w:rPr>
           <w:lang w:val="en-US"/>
         </w:rPr>
-        <w:t>Give the name to project (MyAutomationProject)</w:t>
+        <w:t>Give the name to project (</w:t>
+      </w:r>
+      <w:proofErr w:type="spellStart"/>
+      <w:r>
+        <w:rPr>
+          <w:lang w:val="en-US"/>
+        </w:rPr>
+        <w:t>MyAutomationProject</w:t>
+      </w:r>
+      <w:proofErr w:type="spellEnd"/>
+      <w:r>
+        <w:rPr>
+          <w:lang w:val="en-US"/>
+        </w:rPr>
+        <w:t>)</w:t>
       </w:r>
     </w:p>
     <w:p>
@@ -3697,7 +3747,21 @@
         <w:rPr>
           <w:lang w:val="en-US"/>
         </w:rPr>
-        <w:t xml:space="preserve"> Package (com.WebDriverDemos)</w:t>
+        <w:t xml:space="preserve"> Package (</w:t>
+      </w:r>
+      <w:proofErr w:type="spellStart"/>
+      <w:r>
+        <w:rPr>
+          <w:lang w:val="en-US"/>
+        </w:rPr>
+        <w:t>com.WebDriverDemos</w:t>
+      </w:r>
+      <w:proofErr w:type="spellEnd"/>
+      <w:r>
+        <w:rPr>
+          <w:lang w:val="en-US"/>
+        </w:rPr>
+        <w:t>)</w:t>
       </w:r>
     </w:p>
     <w:p>
@@ -3793,8 +3857,16 @@
         <w:rPr>
           <w:lang w:val="en-US"/>
         </w:rPr>
-        <w:t>Click on Classpath</w:t>
-      </w:r>
+        <w:t xml:space="preserve">Click on </w:t>
+      </w:r>
+      <w:proofErr w:type="spellStart"/>
+      <w:r>
+        <w:rPr>
+          <w:lang w:val="en-US"/>
+        </w:rPr>
+        <w:t>Classpath</w:t>
+      </w:r>
+      <w:proofErr w:type="spellEnd"/>
     </w:p>
     <w:p>
       <w:pPr>
@@ -3961,11 +4033,19 @@
           <w:lang w:val="en-US"/>
         </w:rPr>
       </w:pPr>
-      <w:r>
-        <w:rPr>
-          <w:lang w:val="en-US"/>
-        </w:rPr>
-        <w:t xml:space="preserve">get() </w:t>
+      <w:proofErr w:type="gramStart"/>
+      <w:r>
+        <w:rPr>
+          <w:lang w:val="en-US"/>
+        </w:rPr>
+        <w:t>get(</w:t>
+      </w:r>
+      <w:proofErr w:type="gramEnd"/>
+      <w:r>
+        <w:rPr>
+          <w:lang w:val="en-US"/>
+        </w:rPr>
+        <w:t xml:space="preserve">) </w:t>
       </w:r>
       <w:r>
         <w:rPr>
@@ -3991,11 +4071,27 @@
           <w:lang w:val="en-US"/>
         </w:rPr>
       </w:pPr>
-      <w:r>
-        <w:rPr>
-          <w:lang w:val="en-US"/>
-        </w:rPr>
-        <w:t xml:space="preserve">driver.manage().window().maximize() </w:t>
+      <w:proofErr w:type="spellStart"/>
+      <w:proofErr w:type="gramStart"/>
+      <w:r>
+        <w:rPr>
+          <w:lang w:val="en-US"/>
+        </w:rPr>
+        <w:t>driver.manage</w:t>
+      </w:r>
+      <w:proofErr w:type="spellEnd"/>
+      <w:r>
+        <w:rPr>
+          <w:lang w:val="en-US"/>
+        </w:rPr>
+        <w:t>(</w:t>
+      </w:r>
+      <w:proofErr w:type="gramEnd"/>
+      <w:r>
+        <w:rPr>
+          <w:lang w:val="en-US"/>
+        </w:rPr>
+        <w:t xml:space="preserve">).window().maximize() </w:t>
       </w:r>
       <w:r>
         <w:rPr>
@@ -4021,11 +4117,19 @@
           <w:lang w:val="en-US"/>
         </w:rPr>
       </w:pPr>
-      <w:r>
-        <w:rPr>
-          <w:lang w:val="en-US"/>
-        </w:rPr>
-        <w:t xml:space="preserve">close() </w:t>
+      <w:proofErr w:type="gramStart"/>
+      <w:r>
+        <w:rPr>
+          <w:lang w:val="en-US"/>
+        </w:rPr>
+        <w:t>close(</w:t>
+      </w:r>
+      <w:proofErr w:type="gramEnd"/>
+      <w:r>
+        <w:rPr>
+          <w:lang w:val="en-US"/>
+        </w:rPr>
+        <w:t xml:space="preserve">) </w:t>
       </w:r>
       <w:r>
         <w:rPr>
@@ -4051,11 +4155,19 @@
           <w:lang w:val="en-US"/>
         </w:rPr>
       </w:pPr>
-      <w:r>
-        <w:rPr>
-          <w:lang w:val="en-US"/>
-        </w:rPr>
-        <w:t xml:space="preserve">getTitle() </w:t>
+      <w:proofErr w:type="gramStart"/>
+      <w:r>
+        <w:rPr>
+          <w:lang w:val="en-US"/>
+        </w:rPr>
+        <w:t>getTitle(</w:t>
+      </w:r>
+      <w:proofErr w:type="gramEnd"/>
+      <w:r>
+        <w:rPr>
+          <w:lang w:val="en-US"/>
+        </w:rPr>
+        <w:t xml:space="preserve">) </w:t>
       </w:r>
       <w:r>
         <w:rPr>
@@ -4087,11 +4199,19 @@
           <w:lang w:val="en-US"/>
         </w:rPr>
       </w:pPr>
-      <w:r>
-        <w:rPr>
-          <w:lang w:val="en-US"/>
-        </w:rPr>
-        <w:t xml:space="preserve">getCurrentUrl() </w:t>
+      <w:proofErr w:type="gramStart"/>
+      <w:r>
+        <w:rPr>
+          <w:lang w:val="en-US"/>
+        </w:rPr>
+        <w:t>getCurrentUrl(</w:t>
+      </w:r>
+      <w:proofErr w:type="gramEnd"/>
+      <w:r>
+        <w:rPr>
+          <w:lang w:val="en-US"/>
+        </w:rPr>
+        <w:t xml:space="preserve">) </w:t>
       </w:r>
       <w:r>
         <w:rPr>
@@ -4117,11 +4237,19 @@
           <w:lang w:val="en-US"/>
         </w:rPr>
       </w:pPr>
-      <w:r>
-        <w:rPr>
-          <w:lang w:val="en-US"/>
-        </w:rPr>
-        <w:t xml:space="preserve">findElement() </w:t>
+      <w:proofErr w:type="gramStart"/>
+      <w:r>
+        <w:rPr>
+          <w:lang w:val="en-US"/>
+        </w:rPr>
+        <w:t>findElement(</w:t>
+      </w:r>
+      <w:proofErr w:type="gramEnd"/>
+      <w:r>
+        <w:rPr>
+          <w:lang w:val="en-US"/>
+        </w:rPr>
+        <w:t xml:space="preserve">) </w:t>
       </w:r>
       <w:r>
         <w:rPr>
@@ -4171,11 +4299,19 @@
           <w:lang w:val="en-US"/>
         </w:rPr>
       </w:pPr>
-      <w:r>
-        <w:rPr>
-          <w:lang w:val="en-US"/>
-        </w:rPr>
-        <w:t xml:space="preserve">findElements() </w:t>
+      <w:proofErr w:type="gramStart"/>
+      <w:r>
+        <w:rPr>
+          <w:lang w:val="en-US"/>
+        </w:rPr>
+        <w:t>findElements(</w:t>
+      </w:r>
+      <w:proofErr w:type="gramEnd"/>
+      <w:r>
+        <w:rPr>
+          <w:lang w:val="en-US"/>
+        </w:rPr>
+        <w:t xml:space="preserve">) </w:t>
       </w:r>
       <w:r>
         <w:rPr>
@@ -4237,11 +4373,19 @@
           <w:lang w:val="en-US"/>
         </w:rPr>
       </w:pPr>
-      <w:r>
-        <w:rPr>
-          <w:lang w:val="en-US"/>
-        </w:rPr>
-        <w:t xml:space="preserve">quit() </w:t>
+      <w:proofErr w:type="gramStart"/>
+      <w:r>
+        <w:rPr>
+          <w:lang w:val="en-US"/>
+        </w:rPr>
+        <w:t>quit(</w:t>
+      </w:r>
+      <w:proofErr w:type="gramEnd"/>
+      <w:r>
+        <w:rPr>
+          <w:lang w:val="en-US"/>
+        </w:rPr>
+        <w:t xml:space="preserve">) </w:t>
       </w:r>
       <w:r>
         <w:rPr>
@@ -4826,11 +4970,19 @@
           <w:lang w:val="en-US"/>
         </w:rPr>
       </w:pPr>
-      <w:r>
-        <w:rPr>
-          <w:lang w:val="en-US"/>
-        </w:rPr>
-        <w:t xml:space="preserve">sendKeys() </w:t>
+      <w:proofErr w:type="gramStart"/>
+      <w:r>
+        <w:rPr>
+          <w:lang w:val="en-US"/>
+        </w:rPr>
+        <w:t>sendKeys(</w:t>
+      </w:r>
+      <w:proofErr w:type="gramEnd"/>
+      <w:r>
+        <w:rPr>
+          <w:lang w:val="en-US"/>
+        </w:rPr>
+        <w:t xml:space="preserve">) </w:t>
       </w:r>
       <w:r>
         <w:rPr>
@@ -4868,11 +5020,19 @@
           <w:lang w:val="en-US"/>
         </w:rPr>
       </w:pPr>
-      <w:r>
-        <w:rPr>
-          <w:lang w:val="en-US"/>
-        </w:rPr>
-        <w:t xml:space="preserve">click() </w:t>
+      <w:proofErr w:type="gramStart"/>
+      <w:r>
+        <w:rPr>
+          <w:lang w:val="en-US"/>
+        </w:rPr>
+        <w:t>click(</w:t>
+      </w:r>
+      <w:proofErr w:type="gramEnd"/>
+      <w:r>
+        <w:rPr>
+          <w:lang w:val="en-US"/>
+        </w:rPr>
+        <w:t xml:space="preserve">) </w:t>
       </w:r>
       <w:r>
         <w:rPr>
@@ -4904,11 +5064,19 @@
           <w:lang w:val="en-US"/>
         </w:rPr>
       </w:pPr>
-      <w:r>
-        <w:rPr>
-          <w:lang w:val="en-US"/>
-        </w:rPr>
-        <w:t xml:space="preserve">getText() </w:t>
+      <w:proofErr w:type="gramStart"/>
+      <w:r>
+        <w:rPr>
+          <w:lang w:val="en-US"/>
+        </w:rPr>
+        <w:t>getText(</w:t>
+      </w:r>
+      <w:proofErr w:type="gramEnd"/>
+      <w:r>
+        <w:rPr>
+          <w:lang w:val="en-US"/>
+        </w:rPr>
+        <w:t xml:space="preserve">) </w:t>
       </w:r>
       <w:r>
         <w:rPr>
@@ -4934,11 +5102,19 @@
           <w:lang w:val="en-US"/>
         </w:rPr>
       </w:pPr>
-      <w:r>
-        <w:rPr>
-          <w:lang w:val="en-US"/>
-        </w:rPr>
-        <w:t xml:space="preserve">isSelected() </w:t>
+      <w:proofErr w:type="gramStart"/>
+      <w:r>
+        <w:rPr>
+          <w:lang w:val="en-US"/>
+        </w:rPr>
+        <w:t>isSelected(</w:t>
+      </w:r>
+      <w:proofErr w:type="gramEnd"/>
+      <w:r>
+        <w:rPr>
+          <w:lang w:val="en-US"/>
+        </w:rPr>
+        <w:t xml:space="preserve">) </w:t>
       </w:r>
       <w:r>
         <w:rPr>
@@ -4964,11 +5140,19 @@
           <w:lang w:val="en-US"/>
         </w:rPr>
       </w:pPr>
-      <w:r>
-        <w:rPr>
-          <w:lang w:val="en-US"/>
-        </w:rPr>
-        <w:t xml:space="preserve">isEnabled() </w:t>
+      <w:proofErr w:type="gramStart"/>
+      <w:r>
+        <w:rPr>
+          <w:lang w:val="en-US"/>
+        </w:rPr>
+        <w:t>isEnabled(</w:t>
+      </w:r>
+      <w:proofErr w:type="gramEnd"/>
+      <w:r>
+        <w:rPr>
+          <w:lang w:val="en-US"/>
+        </w:rPr>
+        <w:t xml:space="preserve">) </w:t>
       </w:r>
       <w:r>
         <w:rPr>
@@ -5105,7 +5289,21 @@
         <w:rPr>
           <w:lang w:val="en-US"/>
         </w:rPr>
-        <w:t>data-testid="royal-email"]</w:t>
+        <w:t>data-</w:t>
+      </w:r>
+      <w:proofErr w:type="spellStart"/>
+      <w:r>
+        <w:rPr>
+          <w:lang w:val="en-US"/>
+        </w:rPr>
+        <w:t>testid</w:t>
+      </w:r>
+      <w:proofErr w:type="spellEnd"/>
+      <w:r>
+        <w:rPr>
+          <w:lang w:val="en-US"/>
+        </w:rPr>
+        <w:t>="royal-email"]</w:t>
       </w:r>
     </w:p>
     <w:p>
@@ -5532,11 +5730,19 @@
           <w:lang w:val="en-US"/>
         </w:rPr>
       </w:pPr>
-      <w:r>
-        <w:rPr>
-          <w:lang w:val="en-US"/>
-        </w:rPr>
-        <w:t xml:space="preserve">getFirstSelectedOption() </w:t>
+      <w:proofErr w:type="gramStart"/>
+      <w:r>
+        <w:rPr>
+          <w:lang w:val="en-US"/>
+        </w:rPr>
+        <w:t>getFirstSelectedOption(</w:t>
+      </w:r>
+      <w:proofErr w:type="gramEnd"/>
+      <w:r>
+        <w:rPr>
+          <w:lang w:val="en-US"/>
+        </w:rPr>
+        <w:t xml:space="preserve">) </w:t>
       </w:r>
       <w:r>
         <w:rPr>
@@ -5562,11 +5768,19 @@
           <w:lang w:val="en-US"/>
         </w:rPr>
       </w:pPr>
-      <w:r>
-        <w:rPr>
-          <w:lang w:val="en-US"/>
-        </w:rPr>
-        <w:t xml:space="preserve">getOptions() </w:t>
+      <w:proofErr w:type="gramStart"/>
+      <w:r>
+        <w:rPr>
+          <w:lang w:val="en-US"/>
+        </w:rPr>
+        <w:t>getOptions(</w:t>
+      </w:r>
+      <w:proofErr w:type="gramEnd"/>
+      <w:r>
+        <w:rPr>
+          <w:lang w:val="en-US"/>
+        </w:rPr>
+        <w:t xml:space="preserve">) </w:t>
       </w:r>
       <w:r>
         <w:rPr>
@@ -5664,11 +5878,19 @@
           <w:lang w:val="en-US"/>
         </w:rPr>
       </w:pPr>
-      <w:r>
-        <w:rPr>
-          <w:lang w:val="en-US"/>
-        </w:rPr>
-        <w:t xml:space="preserve">getAllSelectedOptions() </w:t>
+      <w:proofErr w:type="gramStart"/>
+      <w:r>
+        <w:rPr>
+          <w:lang w:val="en-US"/>
+        </w:rPr>
+        <w:t>getAllSelectedOptions(</w:t>
+      </w:r>
+      <w:proofErr w:type="gramEnd"/>
+      <w:r>
+        <w:rPr>
+          <w:lang w:val="en-US"/>
+        </w:rPr>
+        <w:t xml:space="preserve">) </w:t>
       </w:r>
       <w:r>
         <w:rPr>
@@ -5706,11 +5928,19 @@
           <w:lang w:val="en-US"/>
         </w:rPr>
       </w:pPr>
-      <w:r>
-        <w:rPr>
-          <w:lang w:val="en-US"/>
-        </w:rPr>
-        <w:t xml:space="preserve">isMultiple() </w:t>
+      <w:proofErr w:type="gramStart"/>
+      <w:r>
+        <w:rPr>
+          <w:lang w:val="en-US"/>
+        </w:rPr>
+        <w:t>isMultiple(</w:t>
+      </w:r>
+      <w:proofErr w:type="gramEnd"/>
+      <w:r>
+        <w:rPr>
+          <w:lang w:val="en-US"/>
+        </w:rPr>
+        <w:t xml:space="preserve">) </w:t>
       </w:r>
       <w:r>
         <w:rPr>
@@ -5876,11 +6106,27 @@
           <w:lang w:val="en-US"/>
         </w:rPr>
       </w:pPr>
-      <w:r>
-        <w:rPr>
-          <w:lang w:val="en-US"/>
-        </w:rPr>
-        <w:t>Thread.sleep()</w:t>
+      <w:proofErr w:type="spellStart"/>
+      <w:proofErr w:type="gramStart"/>
+      <w:r>
+        <w:rPr>
+          <w:lang w:val="en-US"/>
+        </w:rPr>
+        <w:t>Thread.sleep</w:t>
+      </w:r>
+      <w:proofErr w:type="spellEnd"/>
+      <w:r>
+        <w:rPr>
+          <w:lang w:val="en-US"/>
+        </w:rPr>
+        <w:t>(</w:t>
+      </w:r>
+      <w:proofErr w:type="gramEnd"/>
+      <w:r>
+        <w:rPr>
+          <w:lang w:val="en-US"/>
+        </w:rPr>
+        <w:t>)</w:t>
       </w:r>
       <w:r>
         <w:rPr>
@@ -6195,7 +6441,20 @@
           <w:lang w:val="en-US"/>
         </w:rPr>
         <w:br/>
-        <w:t xml:space="preserve">i </w:t>
+      </w:r>
+      <w:proofErr w:type="spellStart"/>
+      <w:r>
+        <w:rPr>
+          <w:lang w:val="en-US"/>
+        </w:rPr>
+        <w:t>i</w:t>
+      </w:r>
+      <w:proofErr w:type="spellEnd"/>
+      <w:r>
+        <w:rPr>
+          <w:lang w:val="en-US"/>
+        </w:rPr>
+        <w:t xml:space="preserve"> </w:t>
       </w:r>
       <w:r>
         <w:rPr>
@@ -6579,7 +6838,21 @@
         <w:rPr>
           <w:lang w:val="en-US"/>
         </w:rPr>
-        <w:t>You can not perform any operation on the page if alert is present</w:t>
+        <w:t xml:space="preserve">You </w:t>
+      </w:r>
+      <w:proofErr w:type="spellStart"/>
+      <w:r>
+        <w:rPr>
+          <w:lang w:val="en-US"/>
+        </w:rPr>
+        <w:t>can not</w:t>
+      </w:r>
+      <w:proofErr w:type="spellEnd"/>
+      <w:r>
+        <w:rPr>
+          <w:lang w:val="en-US"/>
+        </w:rPr>
+        <w:t xml:space="preserve"> perform any operation on the page if alert is present</w:t>
       </w:r>
     </w:p>
     <w:p>
@@ -6634,11 +6907,19 @@
           <w:lang w:val="en-US"/>
         </w:rPr>
       </w:pPr>
-      <w:r>
-        <w:rPr>
-          <w:lang w:val="en-US"/>
-        </w:rPr>
-        <w:t xml:space="preserve">switchTo().alert() </w:t>
+      <w:proofErr w:type="spellStart"/>
+      <w:r>
+        <w:rPr>
+          <w:lang w:val="en-US"/>
+        </w:rPr>
+        <w:t>switchTo</w:t>
+      </w:r>
+      <w:proofErr w:type="spellEnd"/>
+      <w:r>
+        <w:rPr>
+          <w:lang w:val="en-US"/>
+        </w:rPr>
+        <w:t xml:space="preserve">().alert() </w:t>
       </w:r>
       <w:r>
         <w:rPr>
@@ -6664,11 +6945,19 @@
           <w:lang w:val="en-US"/>
         </w:rPr>
       </w:pPr>
-      <w:r>
-        <w:rPr>
-          <w:lang w:val="en-US"/>
-        </w:rPr>
-        <w:t xml:space="preserve">getText() </w:t>
+      <w:proofErr w:type="gramStart"/>
+      <w:r>
+        <w:rPr>
+          <w:lang w:val="en-US"/>
+        </w:rPr>
+        <w:t>getText(</w:t>
+      </w:r>
+      <w:proofErr w:type="gramEnd"/>
+      <w:r>
+        <w:rPr>
+          <w:lang w:val="en-US"/>
+        </w:rPr>
+        <w:t xml:space="preserve">) </w:t>
       </w:r>
       <w:r>
         <w:rPr>
@@ -6694,11 +6983,19 @@
           <w:lang w:val="en-US"/>
         </w:rPr>
       </w:pPr>
-      <w:r>
-        <w:rPr>
-          <w:lang w:val="en-US"/>
-        </w:rPr>
-        <w:t xml:space="preserve">accept() </w:t>
+      <w:proofErr w:type="gramStart"/>
+      <w:r>
+        <w:rPr>
+          <w:lang w:val="en-US"/>
+        </w:rPr>
+        <w:t>accept(</w:t>
+      </w:r>
+      <w:proofErr w:type="gramEnd"/>
+      <w:r>
+        <w:rPr>
+          <w:lang w:val="en-US"/>
+        </w:rPr>
+        <w:t xml:space="preserve">) </w:t>
       </w:r>
       <w:r>
         <w:rPr>
@@ -6724,12 +7021,20 @@
           <w:lang w:val="en-US"/>
         </w:rPr>
       </w:pPr>
+      <w:proofErr w:type="gramStart"/>
       <w:r>
         <w:rPr>
           <w:lang w:val="en-US"/>
         </w:rPr>
         <w:lastRenderedPageBreak/>
-        <w:t xml:space="preserve">dismiss() </w:t>
+        <w:t>dismiss(</w:t>
+      </w:r>
+      <w:proofErr w:type="gramEnd"/>
+      <w:r>
+        <w:rPr>
+          <w:lang w:val="en-US"/>
+        </w:rPr>
+        <w:t xml:space="preserve">) </w:t>
       </w:r>
       <w:r>
         <w:rPr>
@@ -8181,11 +8486,220 @@
     <w:p>
       <w:pPr>
         <w:rPr>
-          <w:lang w:val="en-US"/>
-        </w:rPr>
-      </w:pPr>
+          <w:b/>
+          <w:bCs/>
+          <w:lang w:val="en-US"/>
+        </w:rPr>
+      </w:pPr>
+    </w:p>
+    <w:p>
+      <w:pPr>
+        <w:rPr>
+          <w:b/>
+          <w:bCs/>
+          <w:lang w:val="en-US"/>
+        </w:rPr>
+      </w:pPr>
+      <w:r>
+        <w:rPr>
+          <w:b/>
+          <w:bCs/>
+          <w:lang w:val="en-US"/>
+        </w:rPr>
+        <w:t>Data Driven Testing</w:t>
+      </w:r>
+    </w:p>
+    <w:p>
+      <w:pPr>
+        <w:rPr>
+          <w:b/>
+          <w:bCs/>
+          <w:lang w:val="en-US"/>
+        </w:rPr>
+      </w:pPr>
+      <w:r>
+        <w:rPr>
+          <w:noProof/>
+          <w:lang w:eastAsia="en-IN"/>
+        </w:rPr>
+        <w:lastRenderedPageBreak/>
+        <mc:AlternateContent>
+          <mc:Choice Requires="wps">
+            <w:drawing>
+              <wp:anchor distT="0" distB="0" distL="114300" distR="114300" simplePos="0" relativeHeight="251659264" behindDoc="0" locked="0" layoutInCell="1" allowOverlap="1">
+                <wp:simplePos x="0" y="0"/>
+                <wp:positionH relativeFrom="column">
+                  <wp:posOffset>362309</wp:posOffset>
+                </wp:positionH>
+                <wp:positionV relativeFrom="paragraph">
+                  <wp:posOffset>284672</wp:posOffset>
+                </wp:positionV>
+                <wp:extent cx="612476" cy="198407"/>
+                <wp:effectExtent l="19050" t="19050" r="16510" b="11430"/>
+                <wp:wrapNone/>
+                <wp:docPr id="6" name="Rectangle 6"/>
+                <wp:cNvGraphicFramePr/>
+                <a:graphic xmlns:a="http://schemas.openxmlformats.org/drawingml/2006/main">
+                  <a:graphicData uri="http://schemas.microsoft.com/office/word/2010/wordprocessingShape">
+                    <wps:wsp>
+                      <wps:cNvSpPr/>
+                      <wps:spPr>
+                        <a:xfrm>
+                          <a:off x="0" y="0"/>
+                          <a:ext cx="612476" cy="198407"/>
+                        </a:xfrm>
+                        <a:prstGeom prst="rect">
+                          <a:avLst/>
+                        </a:prstGeom>
+                        <a:noFill/>
+                        <a:ln w="38100">
+                          <a:solidFill>
+                            <a:srgbClr val="FFFF00"/>
+                          </a:solidFill>
+                        </a:ln>
+                      </wps:spPr>
+                      <wps:style>
+                        <a:lnRef idx="2">
+                          <a:schemeClr val="accent1">
+                            <a:shade val="50000"/>
+                          </a:schemeClr>
+                        </a:lnRef>
+                        <a:fillRef idx="1">
+                          <a:schemeClr val="accent1"/>
+                        </a:fillRef>
+                        <a:effectRef idx="0">
+                          <a:schemeClr val="accent1"/>
+                        </a:effectRef>
+                        <a:fontRef idx="minor">
+                          <a:schemeClr val="lt1"/>
+                        </a:fontRef>
+                      </wps:style>
+                      <wps:bodyPr rot="0" spcFirstLastPara="0" vertOverflow="overflow" horzOverflow="overflow" vert="horz" wrap="square" lIns="91440" tIns="45720" rIns="91440" bIns="45720" numCol="1" spcCol="0" rtlCol="0" fromWordArt="0" anchor="ctr" anchorCtr="0" forceAA="0" compatLnSpc="1">
+                        <a:prstTxWarp prst="textNoShape">
+                          <a:avLst/>
+                        </a:prstTxWarp>
+                        <a:noAutofit/>
+                      </wps:bodyPr>
+                    </wps:wsp>
+                  </a:graphicData>
+                </a:graphic>
+              </wp:anchor>
+            </w:drawing>
+          </mc:Choice>
+          <mc:Fallback>
+            <w:pict>
+              <v:rect w14:anchorId="3D6C798C" id="Rectangle 6" o:spid="_x0000_s1026" style="position:absolute;margin-left:28.55pt;margin-top:22.4pt;width:48.25pt;height:15.6pt;z-index:251659264;visibility:visible;mso-wrap-style:square;mso-wrap-distance-left:9pt;mso-wrap-distance-top:0;mso-wrap-distance-right:9pt;mso-wrap-distance-bottom:0;mso-position-horizontal:absolute;mso-position-horizontal-relative:text;mso-position-vertical:absolute;mso-position-vertical-relative:text;v-text-anchor:middle" o:gfxdata="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" filled="f" strokecolor="yellow" strokeweight="3pt"/>
+            </w:pict>
+          </mc:Fallback>
+        </mc:AlternateContent>
+      </w:r>
       <w:bookmarkStart w:id="0" w:name="_GoBack"/>
+      <w:r>
+        <w:rPr>
+          <w:noProof/>
+          <w:lang w:eastAsia="en-IN"/>
+        </w:rPr>
+        <w:drawing>
+          <wp:inline distT="0" distB="0" distL="0" distR="0" wp14:anchorId="20E49725" wp14:editId="282BEAE8">
+            <wp:extent cx="3993527" cy="2208362"/>
+            <wp:effectExtent l="0" t="0" r="6985" b="1905"/>
+            <wp:docPr id="5" name="Picture 5"/>
+            <wp:cNvGraphicFramePr>
+              <a:graphicFrameLocks xmlns:a="http://schemas.openxmlformats.org/drawingml/2006/main" noChangeAspect="1"/>
+            </wp:cNvGraphicFramePr>
+            <a:graphic xmlns:a="http://schemas.openxmlformats.org/drawingml/2006/main">
+              <a:graphicData uri="http://schemas.openxmlformats.org/drawingml/2006/picture">
+                <pic:pic xmlns:pic="http://schemas.openxmlformats.org/drawingml/2006/picture">
+                  <pic:nvPicPr>
+                    <pic:cNvPr id="1" name=""/>
+                    <pic:cNvPicPr/>
+                  </pic:nvPicPr>
+                  <pic:blipFill rotWithShape="1">
+                    <a:blip r:embed="rId13"/>
+                    <a:srcRect l="22126" t="20076" r="8190" b="11391"/>
+                    <a:stretch/>
+                  </pic:blipFill>
+                  <pic:spPr bwMode="auto">
+                    <a:xfrm>
+                      <a:off x="0" y="0"/>
+                      <a:ext cx="3993909" cy="2208573"/>
+                    </a:xfrm>
+                    <a:prstGeom prst="rect">
+                      <a:avLst/>
+                    </a:prstGeom>
+                    <a:ln>
+                      <a:noFill/>
+                    </a:ln>
+                    <a:extLst>
+                      <a:ext uri="{53640926-AAD7-44D8-BBD7-CCE9431645EC}">
+                        <a14:shadowObscured xmlns:a14="http://schemas.microsoft.com/office/drawing/2010/main"/>
+                      </a:ext>
+                    </a:extLst>
+                  </pic:spPr>
+                </pic:pic>
+              </a:graphicData>
+            </a:graphic>
+          </wp:inline>
+        </w:drawing>
+      </w:r>
       <w:bookmarkEnd w:id="0"/>
+    </w:p>
+    <w:p>
+      <w:pPr>
+        <w:rPr>
+          <w:b/>
+          <w:bCs/>
+          <w:lang w:val="en-US"/>
+        </w:rPr>
+      </w:pPr>
+      <w:r>
+        <w:rPr>
+          <w:noProof/>
+          <w:lang w:eastAsia="en-IN"/>
+        </w:rPr>
+        <w:drawing>
+          <wp:inline distT="0" distB="0" distL="0" distR="0" wp14:anchorId="0D867F51" wp14:editId="16D129B0">
+            <wp:extent cx="3812324" cy="2260121"/>
+            <wp:effectExtent l="0" t="0" r="0" b="6985"/>
+            <wp:docPr id="3" name="Picture 3"/>
+            <wp:cNvGraphicFramePr>
+              <a:graphicFrameLocks xmlns:a="http://schemas.openxmlformats.org/drawingml/2006/main" noChangeAspect="1"/>
+            </wp:cNvGraphicFramePr>
+            <a:graphic xmlns:a="http://schemas.openxmlformats.org/drawingml/2006/main">
+              <a:graphicData uri="http://schemas.openxmlformats.org/drawingml/2006/picture">
+                <pic:pic xmlns:pic="http://schemas.openxmlformats.org/drawingml/2006/picture">
+                  <pic:nvPicPr>
+                    <pic:cNvPr id="1" name=""/>
+                    <pic:cNvPicPr/>
+                  </pic:nvPicPr>
+                  <pic:blipFill rotWithShape="1">
+                    <a:blip r:embed="rId14"/>
+                    <a:srcRect l="24536" t="21950" r="8942" b="7909"/>
+                    <a:stretch/>
+                  </pic:blipFill>
+                  <pic:spPr bwMode="auto">
+                    <a:xfrm>
+                      <a:off x="0" y="0"/>
+                      <a:ext cx="3812727" cy="2260360"/>
+                    </a:xfrm>
+                    <a:prstGeom prst="rect">
+                      <a:avLst/>
+                    </a:prstGeom>
+                    <a:ln>
+                      <a:noFill/>
+                    </a:ln>
+                    <a:extLst>
+                      <a:ext uri="{53640926-AAD7-44D8-BBD7-CCE9431645EC}">
+                        <a14:shadowObscured xmlns:a14="http://schemas.microsoft.com/office/drawing/2010/main"/>
+                      </a:ext>
+                    </a:extLst>
+                  </pic:spPr>
+                </pic:pic>
+              </a:graphicData>
+            </a:graphic>
+          </wp:inline>
+        </w:drawing>
+      </w:r>
     </w:p>
     <w:sectPr>
       <w:pgSz w:w="11906" w:h="16838"/>
@@ -13339,49 +13853,49 @@
     </dgm:pt>
   </dgm:ptLst>
   <dgm:cxnLst>
+    <dgm:cxn modelId="{60E0ADED-62D2-48C1-A22E-1EE414CFA65B}" type="presOf" srcId="{7C03F650-450B-470D-9F41-9EBB6F24DE08}" destId="{915300E8-D21B-48E5-86A7-A677802348CF}" srcOrd="0" destOrd="0" presId="urn:microsoft.com/office/officeart/2005/8/layout/cycle2"/>
+    <dgm:cxn modelId="{A399273C-C291-42AE-942B-FA93C88D7CCE}" type="presOf" srcId="{D996DF6E-E24A-4672-B53C-F45E82ED11D5}" destId="{85727C8B-3068-4E77-A7A1-E6EDA8103D60}" srcOrd="1" destOrd="0" presId="urn:microsoft.com/office/officeart/2005/8/layout/cycle2"/>
+    <dgm:cxn modelId="{C5F99A22-E613-4BDF-9805-D8A697F0AEDE}" type="presOf" srcId="{D35F654F-C71E-4CF2-BA21-C832C92DCB2B}" destId="{C262E5EC-AFFC-4D29-8F55-4FC98D066102}" srcOrd="1" destOrd="0" presId="urn:microsoft.com/office/officeart/2005/8/layout/cycle2"/>
+    <dgm:cxn modelId="{95EF98A5-729B-4A48-B0C3-3EDF5A3A2A35}" type="presOf" srcId="{A01E66F2-8DE2-4DBF-B8E1-AB48AEB22F0F}" destId="{48BF6C11-EF1A-4273-900D-DD5B59C0D92F}" srcOrd="0" destOrd="0" presId="urn:microsoft.com/office/officeart/2005/8/layout/cycle2"/>
+    <dgm:cxn modelId="{2F15B67A-A203-4FA1-BBF1-32C38F9EF0BE}" type="presOf" srcId="{D35F654F-C71E-4CF2-BA21-C832C92DCB2B}" destId="{9F2CA740-10BE-422F-97C4-215D3262A7C2}" srcOrd="0" destOrd="0" presId="urn:microsoft.com/office/officeart/2005/8/layout/cycle2"/>
+    <dgm:cxn modelId="{A918CD4B-C30A-4C47-BEA0-3B3D875F1016}" type="presOf" srcId="{D996DF6E-E24A-4672-B53C-F45E82ED11D5}" destId="{23B2CE62-F90C-4121-BB9A-FD58550B5409}" srcOrd="0" destOrd="0" presId="urn:microsoft.com/office/officeart/2005/8/layout/cycle2"/>
+    <dgm:cxn modelId="{C5EA23E8-94B3-451F-8DBC-2B72E533231A}" type="presOf" srcId="{F2BE9233-54BD-4C28-B5F2-1B65E9CDDF96}" destId="{F9AED730-9635-4E85-B16D-CDB7F5FBEF2A}" srcOrd="0" destOrd="0" presId="urn:microsoft.com/office/officeart/2005/8/layout/cycle2"/>
+    <dgm:cxn modelId="{7A2BE47A-D32B-47A3-9D07-D52DD49DCB98}" type="presOf" srcId="{BA319471-CEE2-4F47-BD5C-3922FB7DFA6B}" destId="{59356F7B-2878-4C69-8BCC-736D52D62464}" srcOrd="0" destOrd="0" presId="urn:microsoft.com/office/officeart/2005/8/layout/cycle2"/>
+    <dgm:cxn modelId="{AAC3BE58-6DD8-44A7-8473-6474700CFCE2}" type="presOf" srcId="{30169AF5-3F60-49ED-BA16-26E156F3CD77}" destId="{B41B0945-C228-466F-ACBC-F0427AE563C3}" srcOrd="0" destOrd="0" presId="urn:microsoft.com/office/officeart/2005/8/layout/cycle2"/>
+    <dgm:cxn modelId="{3A6CAD7C-9D06-4601-9DA6-58C23D4FE730}" srcId="{30169AF5-3F60-49ED-BA16-26E156F3CD77}" destId="{E3147738-712C-470E-BA43-1900B58F3BA1}" srcOrd="5" destOrd="0" parTransId="{390EF3C2-87EC-4379-B2B2-CD6400F6DFF0}" sibTransId="{A01E66F2-8DE2-4DBF-B8E1-AB48AEB22F0F}"/>
+    <dgm:cxn modelId="{A15675F6-BA42-483A-900D-764E0852D957}" type="presOf" srcId="{6BE14A29-3F47-4123-9A53-87F7E3976F30}" destId="{1379CEB1-3469-4B4A-813A-D2A2C295406E}" srcOrd="0" destOrd="0" presId="urn:microsoft.com/office/officeart/2005/8/layout/cycle2"/>
+    <dgm:cxn modelId="{01E4F031-66F5-4638-9F7C-98317BAD510F}" type="presOf" srcId="{9C8E8DEB-5DB8-4F82-8CE8-1171D0ABBD37}" destId="{15DBFFA1-5F90-4067-9D91-73AA2852D991}" srcOrd="1" destOrd="0" presId="urn:microsoft.com/office/officeart/2005/8/layout/cycle2"/>
+    <dgm:cxn modelId="{FC683937-3E9A-4071-B70B-BFE511A7B23C}" srcId="{30169AF5-3F60-49ED-BA16-26E156F3CD77}" destId="{6BE14A29-3F47-4123-9A53-87F7E3976F30}" srcOrd="4" destOrd="0" parTransId="{14C76E7C-A806-46D2-A04B-406CC2747FBF}" sibTransId="{D35F654F-C71E-4CF2-BA21-C832C92DCB2B}"/>
+    <dgm:cxn modelId="{4B17C9FE-737D-402D-90DA-537D4D9C6925}" type="presOf" srcId="{A3989F04-57A2-4559-BF44-044AD8FBD67A}" destId="{A670810F-0345-4254-8BC7-4FA06BB5C3CC}" srcOrd="0" destOrd="0" presId="urn:microsoft.com/office/officeart/2005/8/layout/cycle2"/>
+    <dgm:cxn modelId="{4BD35898-F714-4BB7-9542-A453503E48C4}" type="presOf" srcId="{F90989A5-9584-42E6-85EC-F46F18F0E118}" destId="{31D81D24-1473-4316-96A5-763E7A6060DC}" srcOrd="0" destOrd="0" presId="urn:microsoft.com/office/officeart/2005/8/layout/cycle2"/>
+    <dgm:cxn modelId="{47725AA6-D8AE-40F2-9328-C99F4DEBF854}" type="presOf" srcId="{9C8E8DEB-5DB8-4F82-8CE8-1171D0ABBD37}" destId="{2C63797F-35D2-4BF1-ADFC-8E15A2A56D28}" srcOrd="0" destOrd="0" presId="urn:microsoft.com/office/officeart/2005/8/layout/cycle2"/>
+    <dgm:cxn modelId="{4DDB629C-79EF-4AD9-B998-0368998FAA2A}" type="presOf" srcId="{A01E66F2-8DE2-4DBF-B8E1-AB48AEB22F0F}" destId="{2D827D14-3A64-4B45-B11B-3ECDBC24212A}" srcOrd="1" destOrd="0" presId="urn:microsoft.com/office/officeart/2005/8/layout/cycle2"/>
+    <dgm:cxn modelId="{026D6AE9-41C4-4E88-B421-D7A6BB38CC27}" srcId="{30169AF5-3F60-49ED-BA16-26E156F3CD77}" destId="{F2BE9233-54BD-4C28-B5F2-1B65E9CDDF96}" srcOrd="3" destOrd="0" parTransId="{672307C0-A98C-48FA-8729-D6E3187E5E3A}" sibTransId="{9C8E8DEB-5DB8-4F82-8CE8-1171D0ABBD37}"/>
+    <dgm:cxn modelId="{F09F8ED9-D24F-448F-AF8E-F92EC404CBA7}" srcId="{30169AF5-3F60-49ED-BA16-26E156F3CD77}" destId="{7C03F650-450B-470D-9F41-9EBB6F24DE08}" srcOrd="0" destOrd="0" parTransId="{A8856599-3D3C-4A85-ABFD-520651FDD510}" sibTransId="{D996DF6E-E24A-4672-B53C-F45E82ED11D5}"/>
+    <dgm:cxn modelId="{B0815934-1B44-40A9-9D49-AF3B988350BF}" type="presOf" srcId="{F90989A5-9584-42E6-85EC-F46F18F0E118}" destId="{74D1E673-78E8-4911-AB9E-E98BE428CF47}" srcOrd="1" destOrd="0" presId="urn:microsoft.com/office/officeart/2005/8/layout/cycle2"/>
+    <dgm:cxn modelId="{57569DDB-32CD-4132-93C5-3D28EE6D9D0F}" srcId="{30169AF5-3F60-49ED-BA16-26E156F3CD77}" destId="{A3989F04-57A2-4559-BF44-044AD8FBD67A}" srcOrd="2" destOrd="0" parTransId="{E7AABBEB-8EE1-4214-A7B4-DD1F0B63D6DC}" sibTransId="{F90989A5-9584-42E6-85EC-F46F18F0E118}"/>
+    <dgm:cxn modelId="{B5EAB028-F417-4832-AD66-4B8646A7D8CC}" type="presOf" srcId="{E3147738-712C-470E-BA43-1900B58F3BA1}" destId="{ABB91F78-7B6C-410F-9644-452AF8D7494A}" srcOrd="0" destOrd="0" presId="urn:microsoft.com/office/officeart/2005/8/layout/cycle2"/>
     <dgm:cxn modelId="{3354B5DD-DD06-4226-83B0-C5DBB4314929}" srcId="{30169AF5-3F60-49ED-BA16-26E156F3CD77}" destId="{D01084D7-448F-40E6-BAD6-916FA5266B35}" srcOrd="1" destOrd="0" parTransId="{11A516D9-F860-4BE8-BA91-08CBF1F90AAF}" sibTransId="{BA319471-CEE2-4F47-BD5C-3922FB7DFA6B}"/>
-    <dgm:cxn modelId="{34143BF3-62EC-49DB-9FC5-CA8C01B9EBA0}" type="presOf" srcId="{D01084D7-448F-40E6-BAD6-916FA5266B35}" destId="{6AB4841B-36EA-4743-8E11-22D754152787}" srcOrd="0" destOrd="0" presId="urn:microsoft.com/office/officeart/2005/8/layout/cycle2"/>
-    <dgm:cxn modelId="{2A01271B-6581-4251-B2FF-03F77A18EC1D}" type="presOf" srcId="{F90989A5-9584-42E6-85EC-F46F18F0E118}" destId="{74D1E673-78E8-4911-AB9E-E98BE428CF47}" srcOrd="1" destOrd="0" presId="urn:microsoft.com/office/officeart/2005/8/layout/cycle2"/>
-    <dgm:cxn modelId="{3A6CAD7C-9D06-4601-9DA6-58C23D4FE730}" srcId="{30169AF5-3F60-49ED-BA16-26E156F3CD77}" destId="{E3147738-712C-470E-BA43-1900B58F3BA1}" srcOrd="5" destOrd="0" parTransId="{390EF3C2-87EC-4379-B2B2-CD6400F6DFF0}" sibTransId="{A01E66F2-8DE2-4DBF-B8E1-AB48AEB22F0F}"/>
-    <dgm:cxn modelId="{4C295B74-D989-4B0F-9B7E-3F270C8F38B7}" type="presOf" srcId="{D35F654F-C71E-4CF2-BA21-C832C92DCB2B}" destId="{9F2CA740-10BE-422F-97C4-215D3262A7C2}" srcOrd="0" destOrd="0" presId="urn:microsoft.com/office/officeart/2005/8/layout/cycle2"/>
-    <dgm:cxn modelId="{CAEACB13-07A4-4AC9-88A1-B91B413EAFBE}" type="presOf" srcId="{F90989A5-9584-42E6-85EC-F46F18F0E118}" destId="{31D81D24-1473-4316-96A5-763E7A6060DC}" srcOrd="0" destOrd="0" presId="urn:microsoft.com/office/officeart/2005/8/layout/cycle2"/>
-    <dgm:cxn modelId="{FD08B4D2-B1D4-4437-A43F-D204C2A3717A}" type="presOf" srcId="{9C8E8DEB-5DB8-4F82-8CE8-1171D0ABBD37}" destId="{2C63797F-35D2-4BF1-ADFC-8E15A2A56D28}" srcOrd="0" destOrd="0" presId="urn:microsoft.com/office/officeart/2005/8/layout/cycle2"/>
-    <dgm:cxn modelId="{B2FF81C7-77B5-441F-AEFC-AC8CCCF852C6}" type="presOf" srcId="{A01E66F2-8DE2-4DBF-B8E1-AB48AEB22F0F}" destId="{2D827D14-3A64-4B45-B11B-3ECDBC24212A}" srcOrd="1" destOrd="0" presId="urn:microsoft.com/office/officeart/2005/8/layout/cycle2"/>
-    <dgm:cxn modelId="{026D6AE9-41C4-4E88-B421-D7A6BB38CC27}" srcId="{30169AF5-3F60-49ED-BA16-26E156F3CD77}" destId="{F2BE9233-54BD-4C28-B5F2-1B65E9CDDF96}" srcOrd="3" destOrd="0" parTransId="{672307C0-A98C-48FA-8729-D6E3187E5E3A}" sibTransId="{9C8E8DEB-5DB8-4F82-8CE8-1171D0ABBD37}"/>
-    <dgm:cxn modelId="{04850D61-5746-4649-9120-0BB3E4692931}" type="presOf" srcId="{F2BE9233-54BD-4C28-B5F2-1B65E9CDDF96}" destId="{F9AED730-9635-4E85-B16D-CDB7F5FBEF2A}" srcOrd="0" destOrd="0" presId="urn:microsoft.com/office/officeart/2005/8/layout/cycle2"/>
-    <dgm:cxn modelId="{3DB1CD4D-A104-402A-8271-1BCC1D5875D1}" type="presOf" srcId="{D996DF6E-E24A-4672-B53C-F45E82ED11D5}" destId="{85727C8B-3068-4E77-A7A1-E6EDA8103D60}" srcOrd="1" destOrd="0" presId="urn:microsoft.com/office/officeart/2005/8/layout/cycle2"/>
-    <dgm:cxn modelId="{FC683937-3E9A-4071-B70B-BFE511A7B23C}" srcId="{30169AF5-3F60-49ED-BA16-26E156F3CD77}" destId="{6BE14A29-3F47-4123-9A53-87F7E3976F30}" srcOrd="4" destOrd="0" parTransId="{14C76E7C-A806-46D2-A04B-406CC2747FBF}" sibTransId="{D35F654F-C71E-4CF2-BA21-C832C92DCB2B}"/>
-    <dgm:cxn modelId="{C55842D6-2F70-407B-99B8-8B5DB2F6A7D7}" type="presOf" srcId="{6BE14A29-3F47-4123-9A53-87F7E3976F30}" destId="{1379CEB1-3469-4B4A-813A-D2A2C295406E}" srcOrd="0" destOrd="0" presId="urn:microsoft.com/office/officeart/2005/8/layout/cycle2"/>
-    <dgm:cxn modelId="{6512533F-7F4D-4E9D-991E-1FF547073C4C}" type="presOf" srcId="{30169AF5-3F60-49ED-BA16-26E156F3CD77}" destId="{B41B0945-C228-466F-ACBC-F0427AE563C3}" srcOrd="0" destOrd="0" presId="urn:microsoft.com/office/officeart/2005/8/layout/cycle2"/>
-    <dgm:cxn modelId="{F09F8ED9-D24F-448F-AF8E-F92EC404CBA7}" srcId="{30169AF5-3F60-49ED-BA16-26E156F3CD77}" destId="{7C03F650-450B-470D-9F41-9EBB6F24DE08}" srcOrd="0" destOrd="0" parTransId="{A8856599-3D3C-4A85-ABFD-520651FDD510}" sibTransId="{D996DF6E-E24A-4672-B53C-F45E82ED11D5}"/>
-    <dgm:cxn modelId="{57569DDB-32CD-4132-93C5-3D28EE6D9D0F}" srcId="{30169AF5-3F60-49ED-BA16-26E156F3CD77}" destId="{A3989F04-57A2-4559-BF44-044AD8FBD67A}" srcOrd="2" destOrd="0" parTransId="{E7AABBEB-8EE1-4214-A7B4-DD1F0B63D6DC}" sibTransId="{F90989A5-9584-42E6-85EC-F46F18F0E118}"/>
-    <dgm:cxn modelId="{EBBCE9F5-A222-4736-AB8F-7619ECEC1405}" type="presOf" srcId="{BA319471-CEE2-4F47-BD5C-3922FB7DFA6B}" destId="{59356F7B-2878-4C69-8BCC-736D52D62464}" srcOrd="0" destOrd="0" presId="urn:microsoft.com/office/officeart/2005/8/layout/cycle2"/>
-    <dgm:cxn modelId="{44157C87-3573-42C2-8D5F-8524671AF62F}" type="presOf" srcId="{D996DF6E-E24A-4672-B53C-F45E82ED11D5}" destId="{23B2CE62-F90C-4121-BB9A-FD58550B5409}" srcOrd="0" destOrd="0" presId="urn:microsoft.com/office/officeart/2005/8/layout/cycle2"/>
-    <dgm:cxn modelId="{E523435C-E718-4A34-AD14-A458FF17183B}" type="presOf" srcId="{E3147738-712C-470E-BA43-1900B58F3BA1}" destId="{ABB91F78-7B6C-410F-9644-452AF8D7494A}" srcOrd="0" destOrd="0" presId="urn:microsoft.com/office/officeart/2005/8/layout/cycle2"/>
-    <dgm:cxn modelId="{F4113A5F-81FE-495C-B18A-5DC03C68F544}" type="presOf" srcId="{A3989F04-57A2-4559-BF44-044AD8FBD67A}" destId="{A670810F-0345-4254-8BC7-4FA06BB5C3CC}" srcOrd="0" destOrd="0" presId="urn:microsoft.com/office/officeart/2005/8/layout/cycle2"/>
-    <dgm:cxn modelId="{D39FCECE-E3B3-4255-BCFB-A22DFA4C6CB6}" type="presOf" srcId="{9C8E8DEB-5DB8-4F82-8CE8-1171D0ABBD37}" destId="{15DBFFA1-5F90-4067-9D91-73AA2852D991}" srcOrd="1" destOrd="0" presId="urn:microsoft.com/office/officeart/2005/8/layout/cycle2"/>
-    <dgm:cxn modelId="{DA97AC66-8A0C-40A2-94A3-E39C60FA1949}" type="presOf" srcId="{D35F654F-C71E-4CF2-BA21-C832C92DCB2B}" destId="{C262E5EC-AFFC-4D29-8F55-4FC98D066102}" srcOrd="1" destOrd="0" presId="urn:microsoft.com/office/officeart/2005/8/layout/cycle2"/>
-    <dgm:cxn modelId="{B9EFDBE2-C0E1-4AE6-AE68-A137E0CBD574}" type="presOf" srcId="{7C03F650-450B-470D-9F41-9EBB6F24DE08}" destId="{915300E8-D21B-48E5-86A7-A677802348CF}" srcOrd="0" destOrd="0" presId="urn:microsoft.com/office/officeart/2005/8/layout/cycle2"/>
-    <dgm:cxn modelId="{41AE1DB4-572F-480B-AC3A-97756229DE0B}" type="presOf" srcId="{A01E66F2-8DE2-4DBF-B8E1-AB48AEB22F0F}" destId="{48BF6C11-EF1A-4273-900D-DD5B59C0D92F}" srcOrd="0" destOrd="0" presId="urn:microsoft.com/office/officeart/2005/8/layout/cycle2"/>
-    <dgm:cxn modelId="{D6A71509-9D8B-4945-B2FB-C174AB0AB7D1}" type="presOf" srcId="{BA319471-CEE2-4F47-BD5C-3922FB7DFA6B}" destId="{2FCF5CF5-49BA-4E5D-A81E-50ABA18D10A9}" srcOrd="1" destOrd="0" presId="urn:microsoft.com/office/officeart/2005/8/layout/cycle2"/>
-    <dgm:cxn modelId="{09462DED-BEA4-4EA6-9EBD-1FA6BD61719A}" type="presParOf" srcId="{B41B0945-C228-466F-ACBC-F0427AE563C3}" destId="{915300E8-D21B-48E5-86A7-A677802348CF}" srcOrd="0" destOrd="0" presId="urn:microsoft.com/office/officeart/2005/8/layout/cycle2"/>
-    <dgm:cxn modelId="{F75B6FBB-6677-406C-A85D-443AE38BE1EC}" type="presParOf" srcId="{B41B0945-C228-466F-ACBC-F0427AE563C3}" destId="{23B2CE62-F90C-4121-BB9A-FD58550B5409}" srcOrd="1" destOrd="0" presId="urn:microsoft.com/office/officeart/2005/8/layout/cycle2"/>
-    <dgm:cxn modelId="{A48500FD-702D-4EEE-AFA7-C9B9B21F245C}" type="presParOf" srcId="{23B2CE62-F90C-4121-BB9A-FD58550B5409}" destId="{85727C8B-3068-4E77-A7A1-E6EDA8103D60}" srcOrd="0" destOrd="0" presId="urn:microsoft.com/office/officeart/2005/8/layout/cycle2"/>
-    <dgm:cxn modelId="{3D50CA61-8EC7-4370-886A-7017F6AC38C5}" type="presParOf" srcId="{B41B0945-C228-466F-ACBC-F0427AE563C3}" destId="{6AB4841B-36EA-4743-8E11-22D754152787}" srcOrd="2" destOrd="0" presId="urn:microsoft.com/office/officeart/2005/8/layout/cycle2"/>
-    <dgm:cxn modelId="{0AFFC4FB-81CE-4382-8FA2-8718CA10A2AD}" type="presParOf" srcId="{B41B0945-C228-466F-ACBC-F0427AE563C3}" destId="{59356F7B-2878-4C69-8BCC-736D52D62464}" srcOrd="3" destOrd="0" presId="urn:microsoft.com/office/officeart/2005/8/layout/cycle2"/>
-    <dgm:cxn modelId="{1227E558-8D91-4742-AA15-2AAA33C5632C}" type="presParOf" srcId="{59356F7B-2878-4C69-8BCC-736D52D62464}" destId="{2FCF5CF5-49BA-4E5D-A81E-50ABA18D10A9}" srcOrd="0" destOrd="0" presId="urn:microsoft.com/office/officeart/2005/8/layout/cycle2"/>
-    <dgm:cxn modelId="{752DB14F-1A2D-41AE-B55A-8EDA8AFE6730}" type="presParOf" srcId="{B41B0945-C228-466F-ACBC-F0427AE563C3}" destId="{A670810F-0345-4254-8BC7-4FA06BB5C3CC}" srcOrd="4" destOrd="0" presId="urn:microsoft.com/office/officeart/2005/8/layout/cycle2"/>
-    <dgm:cxn modelId="{EEE1267E-0770-4231-B2F8-9F455F26BCD4}" type="presParOf" srcId="{B41B0945-C228-466F-ACBC-F0427AE563C3}" destId="{31D81D24-1473-4316-96A5-763E7A6060DC}" srcOrd="5" destOrd="0" presId="urn:microsoft.com/office/officeart/2005/8/layout/cycle2"/>
-    <dgm:cxn modelId="{BD67F40B-2C8D-4CC5-BE61-8C03D25AA0B7}" type="presParOf" srcId="{31D81D24-1473-4316-96A5-763E7A6060DC}" destId="{74D1E673-78E8-4911-AB9E-E98BE428CF47}" srcOrd="0" destOrd="0" presId="urn:microsoft.com/office/officeart/2005/8/layout/cycle2"/>
-    <dgm:cxn modelId="{5EEC3CCB-871B-483C-9560-31C7939BF9B5}" type="presParOf" srcId="{B41B0945-C228-466F-ACBC-F0427AE563C3}" destId="{F9AED730-9635-4E85-B16D-CDB7F5FBEF2A}" srcOrd="6" destOrd="0" presId="urn:microsoft.com/office/officeart/2005/8/layout/cycle2"/>
-    <dgm:cxn modelId="{86880478-9E03-4A81-8C00-B8336C090ED2}" type="presParOf" srcId="{B41B0945-C228-466F-ACBC-F0427AE563C3}" destId="{2C63797F-35D2-4BF1-ADFC-8E15A2A56D28}" srcOrd="7" destOrd="0" presId="urn:microsoft.com/office/officeart/2005/8/layout/cycle2"/>
-    <dgm:cxn modelId="{D75F30C0-2616-4F28-99AE-F2EF3F0B1F15}" type="presParOf" srcId="{2C63797F-35D2-4BF1-ADFC-8E15A2A56D28}" destId="{15DBFFA1-5F90-4067-9D91-73AA2852D991}" srcOrd="0" destOrd="0" presId="urn:microsoft.com/office/officeart/2005/8/layout/cycle2"/>
-    <dgm:cxn modelId="{82A48217-CEFD-45A4-A05E-938124F23144}" type="presParOf" srcId="{B41B0945-C228-466F-ACBC-F0427AE563C3}" destId="{1379CEB1-3469-4B4A-813A-D2A2C295406E}" srcOrd="8" destOrd="0" presId="urn:microsoft.com/office/officeart/2005/8/layout/cycle2"/>
-    <dgm:cxn modelId="{CD951CF0-31A3-4BBB-9F98-0033F5405A78}" type="presParOf" srcId="{B41B0945-C228-466F-ACBC-F0427AE563C3}" destId="{9F2CA740-10BE-422F-97C4-215D3262A7C2}" srcOrd="9" destOrd="0" presId="urn:microsoft.com/office/officeart/2005/8/layout/cycle2"/>
-    <dgm:cxn modelId="{65E8D638-ECEB-4FD5-A1C1-1BC6CD5AB700}" type="presParOf" srcId="{9F2CA740-10BE-422F-97C4-215D3262A7C2}" destId="{C262E5EC-AFFC-4D29-8F55-4FC98D066102}" srcOrd="0" destOrd="0" presId="urn:microsoft.com/office/officeart/2005/8/layout/cycle2"/>
-    <dgm:cxn modelId="{98A0861F-43E8-4334-A52A-DE03E006C2EA}" type="presParOf" srcId="{B41B0945-C228-466F-ACBC-F0427AE563C3}" destId="{ABB91F78-7B6C-410F-9644-452AF8D7494A}" srcOrd="10" destOrd="0" presId="urn:microsoft.com/office/officeart/2005/8/layout/cycle2"/>
-    <dgm:cxn modelId="{B8C7D7DB-8912-4D75-9457-981A39853E5B}" type="presParOf" srcId="{B41B0945-C228-466F-ACBC-F0427AE563C3}" destId="{48BF6C11-EF1A-4273-900D-DD5B59C0D92F}" srcOrd="11" destOrd="0" presId="urn:microsoft.com/office/officeart/2005/8/layout/cycle2"/>
-    <dgm:cxn modelId="{7FCB3050-15A8-4D19-B466-58CDD1D8BFF0}" type="presParOf" srcId="{48BF6C11-EF1A-4273-900D-DD5B59C0D92F}" destId="{2D827D14-3A64-4B45-B11B-3ECDBC24212A}" srcOrd="0" destOrd="0" presId="urn:microsoft.com/office/officeart/2005/8/layout/cycle2"/>
+    <dgm:cxn modelId="{1F1FD298-1A4A-4B36-8ABD-C4E13CD9081A}" type="presOf" srcId="{BA319471-CEE2-4F47-BD5C-3922FB7DFA6B}" destId="{2FCF5CF5-49BA-4E5D-A81E-50ABA18D10A9}" srcOrd="1" destOrd="0" presId="urn:microsoft.com/office/officeart/2005/8/layout/cycle2"/>
+    <dgm:cxn modelId="{AA5891B7-7C52-47C6-A6F4-B77372D02295}" type="presOf" srcId="{D01084D7-448F-40E6-BAD6-916FA5266B35}" destId="{6AB4841B-36EA-4743-8E11-22D754152787}" srcOrd="0" destOrd="0" presId="urn:microsoft.com/office/officeart/2005/8/layout/cycle2"/>
+    <dgm:cxn modelId="{974C49DE-98DE-4633-9D58-E35443D2E9F3}" type="presParOf" srcId="{B41B0945-C228-466F-ACBC-F0427AE563C3}" destId="{915300E8-D21B-48E5-86A7-A677802348CF}" srcOrd="0" destOrd="0" presId="urn:microsoft.com/office/officeart/2005/8/layout/cycle2"/>
+    <dgm:cxn modelId="{F7FD353D-C984-4737-AE5A-AD10322BDA50}" type="presParOf" srcId="{B41B0945-C228-466F-ACBC-F0427AE563C3}" destId="{23B2CE62-F90C-4121-BB9A-FD58550B5409}" srcOrd="1" destOrd="0" presId="urn:microsoft.com/office/officeart/2005/8/layout/cycle2"/>
+    <dgm:cxn modelId="{BB8F428C-84C4-49A6-ADA1-550FABC94D53}" type="presParOf" srcId="{23B2CE62-F90C-4121-BB9A-FD58550B5409}" destId="{85727C8B-3068-4E77-A7A1-E6EDA8103D60}" srcOrd="0" destOrd="0" presId="urn:microsoft.com/office/officeart/2005/8/layout/cycle2"/>
+    <dgm:cxn modelId="{2925B7B6-4996-462C-B227-72B42727B458}" type="presParOf" srcId="{B41B0945-C228-466F-ACBC-F0427AE563C3}" destId="{6AB4841B-36EA-4743-8E11-22D754152787}" srcOrd="2" destOrd="0" presId="urn:microsoft.com/office/officeart/2005/8/layout/cycle2"/>
+    <dgm:cxn modelId="{2A9604D9-72C0-4041-A9C2-5F212FE7E9E2}" type="presParOf" srcId="{B41B0945-C228-466F-ACBC-F0427AE563C3}" destId="{59356F7B-2878-4C69-8BCC-736D52D62464}" srcOrd="3" destOrd="0" presId="urn:microsoft.com/office/officeart/2005/8/layout/cycle2"/>
+    <dgm:cxn modelId="{02B70247-EAFC-4F41-99DF-EF252C25717B}" type="presParOf" srcId="{59356F7B-2878-4C69-8BCC-736D52D62464}" destId="{2FCF5CF5-49BA-4E5D-A81E-50ABA18D10A9}" srcOrd="0" destOrd="0" presId="urn:microsoft.com/office/officeart/2005/8/layout/cycle2"/>
+    <dgm:cxn modelId="{399E25AD-4A38-4FD3-B95D-1C7FFCBF2917}" type="presParOf" srcId="{B41B0945-C228-466F-ACBC-F0427AE563C3}" destId="{A670810F-0345-4254-8BC7-4FA06BB5C3CC}" srcOrd="4" destOrd="0" presId="urn:microsoft.com/office/officeart/2005/8/layout/cycle2"/>
+    <dgm:cxn modelId="{F2CF6157-F7D3-46DD-A74D-A5545C9B317C}" type="presParOf" srcId="{B41B0945-C228-466F-ACBC-F0427AE563C3}" destId="{31D81D24-1473-4316-96A5-763E7A6060DC}" srcOrd="5" destOrd="0" presId="urn:microsoft.com/office/officeart/2005/8/layout/cycle2"/>
+    <dgm:cxn modelId="{F13541A2-1A32-4507-B141-0BA7356DE8D1}" type="presParOf" srcId="{31D81D24-1473-4316-96A5-763E7A6060DC}" destId="{74D1E673-78E8-4911-AB9E-E98BE428CF47}" srcOrd="0" destOrd="0" presId="urn:microsoft.com/office/officeart/2005/8/layout/cycle2"/>
+    <dgm:cxn modelId="{868A7B5C-F648-4033-8A08-250C2F2C50EC}" type="presParOf" srcId="{B41B0945-C228-466F-ACBC-F0427AE563C3}" destId="{F9AED730-9635-4E85-B16D-CDB7F5FBEF2A}" srcOrd="6" destOrd="0" presId="urn:microsoft.com/office/officeart/2005/8/layout/cycle2"/>
+    <dgm:cxn modelId="{4EC2BDD5-CD18-4532-B7B5-D9FEA0749599}" type="presParOf" srcId="{B41B0945-C228-466F-ACBC-F0427AE563C3}" destId="{2C63797F-35D2-4BF1-ADFC-8E15A2A56D28}" srcOrd="7" destOrd="0" presId="urn:microsoft.com/office/officeart/2005/8/layout/cycle2"/>
+    <dgm:cxn modelId="{726A6AFD-B477-4822-891D-CF87A43C88F0}" type="presParOf" srcId="{2C63797F-35D2-4BF1-ADFC-8E15A2A56D28}" destId="{15DBFFA1-5F90-4067-9D91-73AA2852D991}" srcOrd="0" destOrd="0" presId="urn:microsoft.com/office/officeart/2005/8/layout/cycle2"/>
+    <dgm:cxn modelId="{9AE975B4-7365-4E61-A350-FC04F7112C29}" type="presParOf" srcId="{B41B0945-C228-466F-ACBC-F0427AE563C3}" destId="{1379CEB1-3469-4B4A-813A-D2A2C295406E}" srcOrd="8" destOrd="0" presId="urn:microsoft.com/office/officeart/2005/8/layout/cycle2"/>
+    <dgm:cxn modelId="{52C70280-083E-45FE-AF2E-82365C6C262F}" type="presParOf" srcId="{B41B0945-C228-466F-ACBC-F0427AE563C3}" destId="{9F2CA740-10BE-422F-97C4-215D3262A7C2}" srcOrd="9" destOrd="0" presId="urn:microsoft.com/office/officeart/2005/8/layout/cycle2"/>
+    <dgm:cxn modelId="{3DFF00A4-0158-46F8-917A-DDB95F90D3FD}" type="presParOf" srcId="{9F2CA740-10BE-422F-97C4-215D3262A7C2}" destId="{C262E5EC-AFFC-4D29-8F55-4FC98D066102}" srcOrd="0" destOrd="0" presId="urn:microsoft.com/office/officeart/2005/8/layout/cycle2"/>
+    <dgm:cxn modelId="{1471E911-8E29-4496-A759-82894456E004}" type="presParOf" srcId="{B41B0945-C228-466F-ACBC-F0427AE563C3}" destId="{ABB91F78-7B6C-410F-9644-452AF8D7494A}" srcOrd="10" destOrd="0" presId="urn:microsoft.com/office/officeart/2005/8/layout/cycle2"/>
+    <dgm:cxn modelId="{D32703AB-1794-45C9-8014-39E5461C3E32}" type="presParOf" srcId="{B41B0945-C228-466F-ACBC-F0427AE563C3}" destId="{48BF6C11-EF1A-4273-900D-DD5B59C0D92F}" srcOrd="11" destOrd="0" presId="urn:microsoft.com/office/officeart/2005/8/layout/cycle2"/>
+    <dgm:cxn modelId="{501227A3-6510-4955-938E-E3C15478228A}" type="presParOf" srcId="{48BF6C11-EF1A-4273-900D-DD5B59C0D92F}" destId="{2D827D14-3A64-4B45-B11B-3ECDBC24212A}" srcOrd="0" destOrd="0" presId="urn:microsoft.com/office/officeart/2005/8/layout/cycle2"/>
   </dgm:cxnLst>
   <dgm:bg/>
   <dgm:whole/>

</xml_diff>

<commit_message>
Date: 04 Oct 2025
</commit_message>
<xml_diff>
--- a/Notes.docx
+++ b/Notes.docx
@@ -534,19 +534,11 @@
           <w:lang w:val="en-US"/>
         </w:rPr>
       </w:pPr>
-      <w:proofErr w:type="spellStart"/>
-      <w:r>
-        <w:rPr>
-          <w:lang w:val="en-US"/>
-        </w:rPr>
-        <w:t>Thread.sleep</w:t>
-      </w:r>
-      <w:proofErr w:type="spellEnd"/>
-      <w:r>
-        <w:rPr>
-          <w:lang w:val="en-US"/>
-        </w:rPr>
-        <w:t>()</w:t>
+      <w:r>
+        <w:rPr>
+          <w:lang w:val="en-US"/>
+        </w:rPr>
+        <w:t>Thread.sleep()</w:t>
       </w:r>
     </w:p>
     <w:p>
@@ -1929,18 +1921,8 @@
           <w:lang w:val="en-US"/>
         </w:rPr>
         <w:lastRenderedPageBreak/>
-        <w:t xml:space="preserve">What is Software </w:t>
-      </w:r>
-      <w:proofErr w:type="gramStart"/>
-      <w:r>
-        <w:rPr>
-          <w:b/>
-          <w:bCs/>
-          <w:lang w:val="en-US"/>
-        </w:rPr>
-        <w:t>Testing</w:t>
-      </w:r>
-      <w:proofErr w:type="gramEnd"/>
+        <w:t>What is Software Testing</w:t>
+      </w:r>
     </w:p>
     <w:p>
       <w:pPr>
@@ -2891,16 +2873,8 @@
         <w:rPr>
           <w:lang w:val="en-US"/>
         </w:rPr>
-        <w:t xml:space="preserve"> – Record and playback </w:t>
-      </w:r>
-      <w:proofErr w:type="spellStart"/>
-      <w:r>
-        <w:rPr>
-          <w:lang w:val="en-US"/>
-        </w:rPr>
-        <w:t>mech</w:t>
-      </w:r>
-      <w:proofErr w:type="spellEnd"/>
+        <w:t xml:space="preserve"> – Record and playback mech</w:t>
+      </w:r>
     </w:p>
     <w:p>
       <w:pPr>
@@ -3230,16 +3204,8 @@
         <w:rPr>
           <w:lang w:val="en-US"/>
         </w:rPr>
-        <w:t xml:space="preserve">Idea </w:t>
-      </w:r>
-      <w:proofErr w:type="spellStart"/>
-      <w:r>
-        <w:rPr>
-          <w:lang w:val="en-US"/>
-        </w:rPr>
-        <w:t>Intellj</w:t>
-      </w:r>
-      <w:proofErr w:type="spellEnd"/>
+        <w:t>Idea Intellj</w:t>
+      </w:r>
     </w:p>
     <w:p>
       <w:pPr>
@@ -3307,14 +3273,12 @@
           <w:lang w:val="en-US"/>
         </w:rPr>
       </w:pPr>
-      <w:proofErr w:type="spellStart"/>
       <w:r>
         <w:rPr>
           <w:lang w:val="en-US"/>
         </w:rPr>
         <w:t>YourName_SeleniumDemos</w:t>
       </w:r>
-      <w:proofErr w:type="spellEnd"/>
     </w:p>
     <w:p>
       <w:pPr>
@@ -3623,21 +3587,7 @@
         <w:rPr>
           <w:lang w:val="en-US"/>
         </w:rPr>
-        <w:t>Give the name to project (</w:t>
-      </w:r>
-      <w:proofErr w:type="spellStart"/>
-      <w:r>
-        <w:rPr>
-          <w:lang w:val="en-US"/>
-        </w:rPr>
-        <w:t>MyAutomationProject</w:t>
-      </w:r>
-      <w:proofErr w:type="spellEnd"/>
-      <w:r>
-        <w:rPr>
-          <w:lang w:val="en-US"/>
-        </w:rPr>
-        <w:t>)</w:t>
+        <w:t>Give the name to project (MyAutomationProject)</w:t>
       </w:r>
     </w:p>
     <w:p>
@@ -3747,21 +3697,7 @@
         <w:rPr>
           <w:lang w:val="en-US"/>
         </w:rPr>
-        <w:t xml:space="preserve"> Package (</w:t>
-      </w:r>
-      <w:proofErr w:type="spellStart"/>
-      <w:r>
-        <w:rPr>
-          <w:lang w:val="en-US"/>
-        </w:rPr>
-        <w:t>com.WebDriverDemos</w:t>
-      </w:r>
-      <w:proofErr w:type="spellEnd"/>
-      <w:r>
-        <w:rPr>
-          <w:lang w:val="en-US"/>
-        </w:rPr>
-        <w:t>)</w:t>
+        <w:t xml:space="preserve"> Package (com.WebDriverDemos)</w:t>
       </w:r>
     </w:p>
     <w:p>
@@ -3857,16 +3793,8 @@
         <w:rPr>
           <w:lang w:val="en-US"/>
         </w:rPr>
-        <w:t xml:space="preserve">Click on </w:t>
-      </w:r>
-      <w:proofErr w:type="spellStart"/>
-      <w:r>
-        <w:rPr>
-          <w:lang w:val="en-US"/>
-        </w:rPr>
-        <w:t>Classpath</w:t>
-      </w:r>
-      <w:proofErr w:type="spellEnd"/>
+        <w:t>Click on Classpath</w:t>
+      </w:r>
     </w:p>
     <w:p>
       <w:pPr>
@@ -4033,19 +3961,11 @@
           <w:lang w:val="en-US"/>
         </w:rPr>
       </w:pPr>
-      <w:proofErr w:type="gramStart"/>
-      <w:r>
-        <w:rPr>
-          <w:lang w:val="en-US"/>
-        </w:rPr>
-        <w:t>get(</w:t>
-      </w:r>
-      <w:proofErr w:type="gramEnd"/>
-      <w:r>
-        <w:rPr>
-          <w:lang w:val="en-US"/>
-        </w:rPr>
-        <w:t xml:space="preserve">) </w:t>
+      <w:r>
+        <w:rPr>
+          <w:lang w:val="en-US"/>
+        </w:rPr>
+        <w:t xml:space="preserve">get() </w:t>
       </w:r>
       <w:r>
         <w:rPr>
@@ -4071,27 +3991,11 @@
           <w:lang w:val="en-US"/>
         </w:rPr>
       </w:pPr>
-      <w:proofErr w:type="spellStart"/>
-      <w:proofErr w:type="gramStart"/>
-      <w:r>
-        <w:rPr>
-          <w:lang w:val="en-US"/>
-        </w:rPr>
-        <w:t>driver.manage</w:t>
-      </w:r>
-      <w:proofErr w:type="spellEnd"/>
-      <w:r>
-        <w:rPr>
-          <w:lang w:val="en-US"/>
-        </w:rPr>
-        <w:t>(</w:t>
-      </w:r>
-      <w:proofErr w:type="gramEnd"/>
-      <w:r>
-        <w:rPr>
-          <w:lang w:val="en-US"/>
-        </w:rPr>
-        <w:t xml:space="preserve">).window().maximize() </w:t>
+      <w:r>
+        <w:rPr>
+          <w:lang w:val="en-US"/>
+        </w:rPr>
+        <w:t xml:space="preserve">driver.manage().window().maximize() </w:t>
       </w:r>
       <w:r>
         <w:rPr>
@@ -4117,19 +4021,11 @@
           <w:lang w:val="en-US"/>
         </w:rPr>
       </w:pPr>
-      <w:proofErr w:type="gramStart"/>
-      <w:r>
-        <w:rPr>
-          <w:lang w:val="en-US"/>
-        </w:rPr>
-        <w:t>close(</w:t>
-      </w:r>
-      <w:proofErr w:type="gramEnd"/>
-      <w:r>
-        <w:rPr>
-          <w:lang w:val="en-US"/>
-        </w:rPr>
-        <w:t xml:space="preserve">) </w:t>
+      <w:r>
+        <w:rPr>
+          <w:lang w:val="en-US"/>
+        </w:rPr>
+        <w:t xml:space="preserve">close() </w:t>
       </w:r>
       <w:r>
         <w:rPr>
@@ -4155,19 +4051,11 @@
           <w:lang w:val="en-US"/>
         </w:rPr>
       </w:pPr>
-      <w:proofErr w:type="gramStart"/>
-      <w:r>
-        <w:rPr>
-          <w:lang w:val="en-US"/>
-        </w:rPr>
-        <w:t>getTitle(</w:t>
-      </w:r>
-      <w:proofErr w:type="gramEnd"/>
-      <w:r>
-        <w:rPr>
-          <w:lang w:val="en-US"/>
-        </w:rPr>
-        <w:t xml:space="preserve">) </w:t>
+      <w:r>
+        <w:rPr>
+          <w:lang w:val="en-US"/>
+        </w:rPr>
+        <w:t xml:space="preserve">getTitle() </w:t>
       </w:r>
       <w:r>
         <w:rPr>
@@ -4199,19 +4087,11 @@
           <w:lang w:val="en-US"/>
         </w:rPr>
       </w:pPr>
-      <w:proofErr w:type="gramStart"/>
-      <w:r>
-        <w:rPr>
-          <w:lang w:val="en-US"/>
-        </w:rPr>
-        <w:t>getCurrentUrl(</w:t>
-      </w:r>
-      <w:proofErr w:type="gramEnd"/>
-      <w:r>
-        <w:rPr>
-          <w:lang w:val="en-US"/>
-        </w:rPr>
-        <w:t xml:space="preserve">) </w:t>
+      <w:r>
+        <w:rPr>
+          <w:lang w:val="en-US"/>
+        </w:rPr>
+        <w:t xml:space="preserve">getCurrentUrl() </w:t>
       </w:r>
       <w:r>
         <w:rPr>
@@ -4237,19 +4117,11 @@
           <w:lang w:val="en-US"/>
         </w:rPr>
       </w:pPr>
-      <w:proofErr w:type="gramStart"/>
-      <w:r>
-        <w:rPr>
-          <w:lang w:val="en-US"/>
-        </w:rPr>
-        <w:t>findElement(</w:t>
-      </w:r>
-      <w:proofErr w:type="gramEnd"/>
-      <w:r>
-        <w:rPr>
-          <w:lang w:val="en-US"/>
-        </w:rPr>
-        <w:t xml:space="preserve">) </w:t>
+      <w:r>
+        <w:rPr>
+          <w:lang w:val="en-US"/>
+        </w:rPr>
+        <w:t xml:space="preserve">findElement() </w:t>
       </w:r>
       <w:r>
         <w:rPr>
@@ -4299,19 +4171,11 @@
           <w:lang w:val="en-US"/>
         </w:rPr>
       </w:pPr>
-      <w:proofErr w:type="gramStart"/>
-      <w:r>
-        <w:rPr>
-          <w:lang w:val="en-US"/>
-        </w:rPr>
-        <w:t>findElements(</w:t>
-      </w:r>
-      <w:proofErr w:type="gramEnd"/>
-      <w:r>
-        <w:rPr>
-          <w:lang w:val="en-US"/>
-        </w:rPr>
-        <w:t xml:space="preserve">) </w:t>
+      <w:r>
+        <w:rPr>
+          <w:lang w:val="en-US"/>
+        </w:rPr>
+        <w:t xml:space="preserve">findElements() </w:t>
       </w:r>
       <w:r>
         <w:rPr>
@@ -4373,19 +4237,11 @@
           <w:lang w:val="en-US"/>
         </w:rPr>
       </w:pPr>
-      <w:proofErr w:type="gramStart"/>
-      <w:r>
-        <w:rPr>
-          <w:lang w:val="en-US"/>
-        </w:rPr>
-        <w:t>quit(</w:t>
-      </w:r>
-      <w:proofErr w:type="gramEnd"/>
-      <w:r>
-        <w:rPr>
-          <w:lang w:val="en-US"/>
-        </w:rPr>
-        <w:t xml:space="preserve">) </w:t>
+      <w:r>
+        <w:rPr>
+          <w:lang w:val="en-US"/>
+        </w:rPr>
+        <w:t xml:space="preserve">quit() </w:t>
       </w:r>
       <w:r>
         <w:rPr>
@@ -4970,19 +4826,11 @@
           <w:lang w:val="en-US"/>
         </w:rPr>
       </w:pPr>
-      <w:proofErr w:type="gramStart"/>
-      <w:r>
-        <w:rPr>
-          <w:lang w:val="en-US"/>
-        </w:rPr>
-        <w:t>sendKeys(</w:t>
-      </w:r>
-      <w:proofErr w:type="gramEnd"/>
-      <w:r>
-        <w:rPr>
-          <w:lang w:val="en-US"/>
-        </w:rPr>
-        <w:t xml:space="preserve">) </w:t>
+      <w:r>
+        <w:rPr>
+          <w:lang w:val="en-US"/>
+        </w:rPr>
+        <w:t xml:space="preserve">sendKeys() </w:t>
       </w:r>
       <w:r>
         <w:rPr>
@@ -5020,19 +4868,11 @@
           <w:lang w:val="en-US"/>
         </w:rPr>
       </w:pPr>
-      <w:proofErr w:type="gramStart"/>
-      <w:r>
-        <w:rPr>
-          <w:lang w:val="en-US"/>
-        </w:rPr>
-        <w:t>click(</w:t>
-      </w:r>
-      <w:proofErr w:type="gramEnd"/>
-      <w:r>
-        <w:rPr>
-          <w:lang w:val="en-US"/>
-        </w:rPr>
-        <w:t xml:space="preserve">) </w:t>
+      <w:r>
+        <w:rPr>
+          <w:lang w:val="en-US"/>
+        </w:rPr>
+        <w:t xml:space="preserve">click() </w:t>
       </w:r>
       <w:r>
         <w:rPr>
@@ -5064,19 +4904,11 @@
           <w:lang w:val="en-US"/>
         </w:rPr>
       </w:pPr>
-      <w:proofErr w:type="gramStart"/>
-      <w:r>
-        <w:rPr>
-          <w:lang w:val="en-US"/>
-        </w:rPr>
-        <w:t>getText(</w:t>
-      </w:r>
-      <w:proofErr w:type="gramEnd"/>
-      <w:r>
-        <w:rPr>
-          <w:lang w:val="en-US"/>
-        </w:rPr>
-        <w:t xml:space="preserve">) </w:t>
+      <w:r>
+        <w:rPr>
+          <w:lang w:val="en-US"/>
+        </w:rPr>
+        <w:t xml:space="preserve">getText() </w:t>
       </w:r>
       <w:r>
         <w:rPr>
@@ -5102,19 +4934,11 @@
           <w:lang w:val="en-US"/>
         </w:rPr>
       </w:pPr>
-      <w:proofErr w:type="gramStart"/>
-      <w:r>
-        <w:rPr>
-          <w:lang w:val="en-US"/>
-        </w:rPr>
-        <w:t>isSelected(</w:t>
-      </w:r>
-      <w:proofErr w:type="gramEnd"/>
-      <w:r>
-        <w:rPr>
-          <w:lang w:val="en-US"/>
-        </w:rPr>
-        <w:t xml:space="preserve">) </w:t>
+      <w:r>
+        <w:rPr>
+          <w:lang w:val="en-US"/>
+        </w:rPr>
+        <w:t xml:space="preserve">isSelected() </w:t>
       </w:r>
       <w:r>
         <w:rPr>
@@ -5140,19 +4964,11 @@
           <w:lang w:val="en-US"/>
         </w:rPr>
       </w:pPr>
-      <w:proofErr w:type="gramStart"/>
-      <w:r>
-        <w:rPr>
-          <w:lang w:val="en-US"/>
-        </w:rPr>
-        <w:t>isEnabled(</w:t>
-      </w:r>
-      <w:proofErr w:type="gramEnd"/>
-      <w:r>
-        <w:rPr>
-          <w:lang w:val="en-US"/>
-        </w:rPr>
-        <w:t xml:space="preserve">) </w:t>
+      <w:r>
+        <w:rPr>
+          <w:lang w:val="en-US"/>
+        </w:rPr>
+        <w:t xml:space="preserve">isEnabled() </w:t>
       </w:r>
       <w:r>
         <w:rPr>
@@ -5289,21 +5105,7 @@
         <w:rPr>
           <w:lang w:val="en-US"/>
         </w:rPr>
-        <w:t>data-</w:t>
-      </w:r>
-      <w:proofErr w:type="spellStart"/>
-      <w:r>
-        <w:rPr>
-          <w:lang w:val="en-US"/>
-        </w:rPr>
-        <w:t>testid</w:t>
-      </w:r>
-      <w:proofErr w:type="spellEnd"/>
-      <w:r>
-        <w:rPr>
-          <w:lang w:val="en-US"/>
-        </w:rPr>
-        <w:t>="royal-email"]</w:t>
+        <w:t>data-testid="royal-email"]</w:t>
       </w:r>
     </w:p>
     <w:p>
@@ -5730,19 +5532,11 @@
           <w:lang w:val="en-US"/>
         </w:rPr>
       </w:pPr>
-      <w:proofErr w:type="gramStart"/>
-      <w:r>
-        <w:rPr>
-          <w:lang w:val="en-US"/>
-        </w:rPr>
-        <w:t>getFirstSelectedOption(</w:t>
-      </w:r>
-      <w:proofErr w:type="gramEnd"/>
-      <w:r>
-        <w:rPr>
-          <w:lang w:val="en-US"/>
-        </w:rPr>
-        <w:t xml:space="preserve">) </w:t>
+      <w:r>
+        <w:rPr>
+          <w:lang w:val="en-US"/>
+        </w:rPr>
+        <w:t xml:space="preserve">getFirstSelectedOption() </w:t>
       </w:r>
       <w:r>
         <w:rPr>
@@ -5768,19 +5562,11 @@
           <w:lang w:val="en-US"/>
         </w:rPr>
       </w:pPr>
-      <w:proofErr w:type="gramStart"/>
-      <w:r>
-        <w:rPr>
-          <w:lang w:val="en-US"/>
-        </w:rPr>
-        <w:t>getOptions(</w:t>
-      </w:r>
-      <w:proofErr w:type="gramEnd"/>
-      <w:r>
-        <w:rPr>
-          <w:lang w:val="en-US"/>
-        </w:rPr>
-        <w:t xml:space="preserve">) </w:t>
+      <w:r>
+        <w:rPr>
+          <w:lang w:val="en-US"/>
+        </w:rPr>
+        <w:t xml:space="preserve">getOptions() </w:t>
       </w:r>
       <w:r>
         <w:rPr>
@@ -5878,19 +5664,11 @@
           <w:lang w:val="en-US"/>
         </w:rPr>
       </w:pPr>
-      <w:proofErr w:type="gramStart"/>
-      <w:r>
-        <w:rPr>
-          <w:lang w:val="en-US"/>
-        </w:rPr>
-        <w:t>getAllSelectedOptions(</w:t>
-      </w:r>
-      <w:proofErr w:type="gramEnd"/>
-      <w:r>
-        <w:rPr>
-          <w:lang w:val="en-US"/>
-        </w:rPr>
-        <w:t xml:space="preserve">) </w:t>
+      <w:r>
+        <w:rPr>
+          <w:lang w:val="en-US"/>
+        </w:rPr>
+        <w:t xml:space="preserve">getAllSelectedOptions() </w:t>
       </w:r>
       <w:r>
         <w:rPr>
@@ -5928,19 +5706,11 @@
           <w:lang w:val="en-US"/>
         </w:rPr>
       </w:pPr>
-      <w:proofErr w:type="gramStart"/>
-      <w:r>
-        <w:rPr>
-          <w:lang w:val="en-US"/>
-        </w:rPr>
-        <w:t>isMultiple(</w:t>
-      </w:r>
-      <w:proofErr w:type="gramEnd"/>
-      <w:r>
-        <w:rPr>
-          <w:lang w:val="en-US"/>
-        </w:rPr>
-        <w:t xml:space="preserve">) </w:t>
+      <w:r>
+        <w:rPr>
+          <w:lang w:val="en-US"/>
+        </w:rPr>
+        <w:t xml:space="preserve">isMultiple() </w:t>
       </w:r>
       <w:r>
         <w:rPr>
@@ -6106,27 +5876,11 @@
           <w:lang w:val="en-US"/>
         </w:rPr>
       </w:pPr>
-      <w:proofErr w:type="spellStart"/>
-      <w:proofErr w:type="gramStart"/>
-      <w:r>
-        <w:rPr>
-          <w:lang w:val="en-US"/>
-        </w:rPr>
-        <w:t>Thread.sleep</w:t>
-      </w:r>
-      <w:proofErr w:type="spellEnd"/>
-      <w:r>
-        <w:rPr>
-          <w:lang w:val="en-US"/>
-        </w:rPr>
-        <w:t>(</w:t>
-      </w:r>
-      <w:proofErr w:type="gramEnd"/>
-      <w:r>
-        <w:rPr>
-          <w:lang w:val="en-US"/>
-        </w:rPr>
-        <w:t>)</w:t>
+      <w:r>
+        <w:rPr>
+          <w:lang w:val="en-US"/>
+        </w:rPr>
+        <w:t>Thread.sleep()</w:t>
       </w:r>
       <w:r>
         <w:rPr>
@@ -6441,20 +6195,7 @@
           <w:lang w:val="en-US"/>
         </w:rPr>
         <w:br/>
-      </w:r>
-      <w:proofErr w:type="spellStart"/>
-      <w:r>
-        <w:rPr>
-          <w:lang w:val="en-US"/>
-        </w:rPr>
-        <w:t>i</w:t>
-      </w:r>
-      <w:proofErr w:type="spellEnd"/>
-      <w:r>
-        <w:rPr>
-          <w:lang w:val="en-US"/>
-        </w:rPr>
-        <w:t xml:space="preserve"> </w:t>
+        <w:t xml:space="preserve">i </w:t>
       </w:r>
       <w:r>
         <w:rPr>
@@ -6838,21 +6579,7 @@
         <w:rPr>
           <w:lang w:val="en-US"/>
         </w:rPr>
-        <w:t xml:space="preserve">You </w:t>
-      </w:r>
-      <w:proofErr w:type="spellStart"/>
-      <w:r>
-        <w:rPr>
-          <w:lang w:val="en-US"/>
-        </w:rPr>
-        <w:t>can not</w:t>
-      </w:r>
-      <w:proofErr w:type="spellEnd"/>
-      <w:r>
-        <w:rPr>
-          <w:lang w:val="en-US"/>
-        </w:rPr>
-        <w:t xml:space="preserve"> perform any operation on the page if alert is present</w:t>
+        <w:t>You can not perform any operation on the page if alert is present</w:t>
       </w:r>
     </w:p>
     <w:p>
@@ -6907,19 +6634,11 @@
           <w:lang w:val="en-US"/>
         </w:rPr>
       </w:pPr>
-      <w:proofErr w:type="spellStart"/>
-      <w:r>
-        <w:rPr>
-          <w:lang w:val="en-US"/>
-        </w:rPr>
-        <w:t>switchTo</w:t>
-      </w:r>
-      <w:proofErr w:type="spellEnd"/>
-      <w:r>
-        <w:rPr>
-          <w:lang w:val="en-US"/>
-        </w:rPr>
-        <w:t xml:space="preserve">().alert() </w:t>
+      <w:r>
+        <w:rPr>
+          <w:lang w:val="en-US"/>
+        </w:rPr>
+        <w:t xml:space="preserve">switchTo().alert() </w:t>
       </w:r>
       <w:r>
         <w:rPr>
@@ -6945,19 +6664,11 @@
           <w:lang w:val="en-US"/>
         </w:rPr>
       </w:pPr>
-      <w:proofErr w:type="gramStart"/>
-      <w:r>
-        <w:rPr>
-          <w:lang w:val="en-US"/>
-        </w:rPr>
-        <w:t>getText(</w:t>
-      </w:r>
-      <w:proofErr w:type="gramEnd"/>
-      <w:r>
-        <w:rPr>
-          <w:lang w:val="en-US"/>
-        </w:rPr>
-        <w:t xml:space="preserve">) </w:t>
+      <w:r>
+        <w:rPr>
+          <w:lang w:val="en-US"/>
+        </w:rPr>
+        <w:t xml:space="preserve">getText() </w:t>
       </w:r>
       <w:r>
         <w:rPr>
@@ -6983,19 +6694,11 @@
           <w:lang w:val="en-US"/>
         </w:rPr>
       </w:pPr>
-      <w:proofErr w:type="gramStart"/>
-      <w:r>
-        <w:rPr>
-          <w:lang w:val="en-US"/>
-        </w:rPr>
-        <w:t>accept(</w:t>
-      </w:r>
-      <w:proofErr w:type="gramEnd"/>
-      <w:r>
-        <w:rPr>
-          <w:lang w:val="en-US"/>
-        </w:rPr>
-        <w:t xml:space="preserve">) </w:t>
+      <w:r>
+        <w:rPr>
+          <w:lang w:val="en-US"/>
+        </w:rPr>
+        <w:t xml:space="preserve">accept() </w:t>
       </w:r>
       <w:r>
         <w:rPr>
@@ -7021,20 +6724,12 @@
           <w:lang w:val="en-US"/>
         </w:rPr>
       </w:pPr>
-      <w:proofErr w:type="gramStart"/>
       <w:r>
         <w:rPr>
           <w:lang w:val="en-US"/>
         </w:rPr>
         <w:lastRenderedPageBreak/>
-        <w:t>dismiss(</w:t>
-      </w:r>
-      <w:proofErr w:type="gramEnd"/>
-      <w:r>
-        <w:rPr>
-          <w:lang w:val="en-US"/>
-        </w:rPr>
-        <w:t xml:space="preserve">) </w:t>
+        <w:t xml:space="preserve">dismiss() </w:t>
       </w:r>
       <w:r>
         <w:rPr>
@@ -8593,7 +8288,6 @@
           </mc:Fallback>
         </mc:AlternateContent>
       </w:r>
-      <w:bookmarkStart w:id="0" w:name="_GoBack"/>
       <w:r>
         <w:rPr>
           <w:noProof/>
@@ -8642,7 +8336,6 @@
           </wp:inline>
         </w:drawing>
       </w:r>
-      <w:bookmarkEnd w:id="0"/>
     </w:p>
     <w:p>
       <w:pPr>
@@ -8701,6 +8394,158 @@
         </w:drawing>
       </w:r>
     </w:p>
+    <w:p>
+      <w:pPr>
+        <w:rPr>
+          <w:b/>
+          <w:bCs/>
+          <w:lang w:val="en-US"/>
+        </w:rPr>
+      </w:pPr>
+      <w:r>
+        <w:rPr>
+          <w:b/>
+          <w:bCs/>
+          <w:lang w:val="en-US"/>
+        </w:rPr>
+        <w:br w:type="page"/>
+      </w:r>
+    </w:p>
+    <w:p>
+      <w:pPr>
+        <w:rPr>
+          <w:b/>
+          <w:bCs/>
+          <w:lang w:val="en-US"/>
+        </w:rPr>
+      </w:pPr>
+      <w:r>
+        <w:rPr>
+          <w:b/>
+          <w:bCs/>
+          <w:lang w:val="en-US"/>
+        </w:rPr>
+        <w:lastRenderedPageBreak/>
+        <w:t>Maven</w:t>
+      </w:r>
+    </w:p>
+    <w:p>
+      <w:pPr>
+        <w:pStyle w:val="ListParagraph"/>
+        <w:numPr>
+          <w:ilvl w:val="0"/>
+          <w:numId w:val="36"/>
+        </w:numPr>
+        <w:rPr>
+          <w:lang w:val="en-US"/>
+        </w:rPr>
+      </w:pPr>
+      <w:r>
+        <w:rPr>
+          <w:lang w:val="en-US"/>
+        </w:rPr>
+        <w:t>Is a build management tool.</w:t>
+      </w:r>
+    </w:p>
+    <w:p>
+      <w:pPr>
+        <w:pStyle w:val="ListParagraph"/>
+        <w:numPr>
+          <w:ilvl w:val="0"/>
+          <w:numId w:val="36"/>
+        </w:numPr>
+        <w:rPr>
+          <w:lang w:val="en-US"/>
+        </w:rPr>
+      </w:pPr>
+      <w:r>
+        <w:rPr>
+          <w:lang w:val="en-US"/>
+        </w:rPr>
+        <w:t>Apache product</w:t>
+      </w:r>
+    </w:p>
+    <w:p>
+      <w:pPr>
+        <w:pStyle w:val="ListParagraph"/>
+        <w:numPr>
+          <w:ilvl w:val="0"/>
+          <w:numId w:val="36"/>
+        </w:numPr>
+        <w:rPr>
+          <w:lang w:val="en-US"/>
+        </w:rPr>
+      </w:pPr>
+      <w:r>
+        <w:rPr>
+          <w:lang w:val="en-US"/>
+        </w:rPr>
+        <w:t>Open source</w:t>
+      </w:r>
+    </w:p>
+    <w:p>
+      <w:pPr>
+        <w:pStyle w:val="ListParagraph"/>
+        <w:numPr>
+          <w:ilvl w:val="0"/>
+          <w:numId w:val="36"/>
+        </w:numPr>
+        <w:rPr>
+          <w:lang w:val="en-US"/>
+        </w:rPr>
+      </w:pPr>
+      <w:r>
+        <w:rPr>
+          <w:lang w:val="en-US"/>
+        </w:rPr>
+        <w:t>Used by both developer and tester</w:t>
+      </w:r>
+    </w:p>
+    <w:p>
+      <w:pPr>
+        <w:pStyle w:val="ListParagraph"/>
+        <w:numPr>
+          <w:ilvl w:val="0"/>
+          <w:numId w:val="36"/>
+        </w:numPr>
+        <w:rPr>
+          <w:lang w:val="en-US"/>
+        </w:rPr>
+      </w:pPr>
+      <w:r>
+        <w:rPr>
+          <w:lang w:val="en-US"/>
+        </w:rPr>
+        <w:t>Easy configuration via pom.xml file</w:t>
+      </w:r>
+    </w:p>
+    <w:p>
+      <w:pPr>
+        <w:pStyle w:val="ListParagraph"/>
+        <w:numPr>
+          <w:ilvl w:val="0"/>
+          <w:numId w:val="36"/>
+        </w:numPr>
+        <w:rPr>
+          <w:lang w:val="en-US"/>
+        </w:rPr>
+      </w:pPr>
+      <w:r>
+        <w:rPr>
+          <w:lang w:val="en-US"/>
+        </w:rPr>
+        <w:t>Uses dependency for easy configuration</w:t>
+      </w:r>
+      <w:bookmarkStart w:id="0" w:name="_GoBack"/>
+      <w:bookmarkEnd w:id="0"/>
+    </w:p>
+    <w:p>
+      <w:pPr>
+        <w:rPr>
+          <w:lang w:val="en-US"/>
+        </w:rPr>
+      </w:pPr>
+    </w:p>
     <w:sectPr>
       <w:pgSz w:w="11906" w:h="16838"/>
       <w:pgMar w:top="1440" w:right="1440" w:bottom="1440" w:left="1440" w:header="708" w:footer="708" w:gutter="0"/>
@@ -10718,6 +10563,119 @@
     </w:lvl>
   </w:abstractNum>
   <w:abstractNum w:abstractNumId="21">
+    <w:nsid w:val="4CE23BC5"/>
+    <w:multiLevelType w:val="hybridMultilevel"/>
+    <w:tmpl w:val="5BF2B3C6"/>
+    <w:lvl w:ilvl="0" w:tplc="40090001">
+      <w:start w:val="1"/>
+      <w:numFmt w:val="bullet"/>
+      <w:lvlText w:val=""/>
+      <w:lvlJc w:val="left"/>
+      <w:pPr>
+        <w:ind w:left="720" w:hanging="360"/>
+      </w:pPr>
+      <w:rPr>
+        <w:rFonts w:ascii="Symbol" w:hAnsi="Symbol" w:hint="default"/>
+      </w:rPr>
+    </w:lvl>
+    <w:lvl w:ilvl="1" w:tplc="40090003" w:tentative="1">
+      <w:start w:val="1"/>
+      <w:numFmt w:val="bullet"/>
+      <w:lvlText w:val="o"/>
+      <w:lvlJc w:val="left"/>
+      <w:pPr>
+        <w:ind w:left="1440" w:hanging="360"/>
+      </w:pPr>
+      <w:rPr>
+        <w:rFonts w:ascii="Courier New" w:hAnsi="Courier New" w:cs="Courier New" w:hint="default"/>
+      </w:rPr>
+    </w:lvl>
+    <w:lvl w:ilvl="2" w:tplc="40090005" w:tentative="1">
+      <w:start w:val="1"/>
+      <w:numFmt w:val="bullet"/>
+      <w:lvlText w:val=""/>
+      <w:lvlJc w:val="left"/>
+      <w:pPr>
+        <w:ind w:left="2160" w:hanging="360"/>
+      </w:pPr>
+      <w:rPr>
+        <w:rFonts w:ascii="Wingdings" w:hAnsi="Wingdings" w:hint="default"/>
+      </w:rPr>
+    </w:lvl>
+    <w:lvl w:ilvl="3" w:tplc="40090001" w:tentative="1">
+      <w:start w:val="1"/>
+      <w:numFmt w:val="bullet"/>
+      <w:lvlText w:val=""/>
+      <w:lvlJc w:val="left"/>
+      <w:pPr>
+        <w:ind w:left="2880" w:hanging="360"/>
+      </w:pPr>
+      <w:rPr>
+        <w:rFonts w:ascii="Symbol" w:hAnsi="Symbol" w:hint="default"/>
+      </w:rPr>
+    </w:lvl>
+    <w:lvl w:ilvl="4" w:tplc="40090003" w:tentative="1">
+      <w:start w:val="1"/>
+      <w:numFmt w:val="bullet"/>
+      <w:lvlText w:val="o"/>
+      <w:lvlJc w:val="left"/>
+      <w:pPr>
+        <w:ind w:left="3600" w:hanging="360"/>
+      </w:pPr>
+      <w:rPr>
+        <w:rFonts w:ascii="Courier New" w:hAnsi="Courier New" w:cs="Courier New" w:hint="default"/>
+      </w:rPr>
+    </w:lvl>
+    <w:lvl w:ilvl="5" w:tplc="40090005" w:tentative="1">
+      <w:start w:val="1"/>
+      <w:numFmt w:val="bullet"/>
+      <w:lvlText w:val=""/>
+      <w:lvlJc w:val="left"/>
+      <w:pPr>
+        <w:ind w:left="4320" w:hanging="360"/>
+      </w:pPr>
+      <w:rPr>
+        <w:rFonts w:ascii="Wingdings" w:hAnsi="Wingdings" w:hint="default"/>
+      </w:rPr>
+    </w:lvl>
+    <w:lvl w:ilvl="6" w:tplc="40090001" w:tentative="1">
+      <w:start w:val="1"/>
+      <w:numFmt w:val="bullet"/>
+      <w:lvlText w:val=""/>
+      <w:lvlJc w:val="left"/>
+      <w:pPr>
+        <w:ind w:left="5040" w:hanging="360"/>
+      </w:pPr>
+      <w:rPr>
+        <w:rFonts w:ascii="Symbol" w:hAnsi="Symbol" w:hint="default"/>
+      </w:rPr>
+    </w:lvl>
+    <w:lvl w:ilvl="7" w:tplc="40090003" w:tentative="1">
+      <w:start w:val="1"/>
+      <w:numFmt w:val="bullet"/>
+      <w:lvlText w:val="o"/>
+      <w:lvlJc w:val="left"/>
+      <w:pPr>
+        <w:ind w:left="5760" w:hanging="360"/>
+      </w:pPr>
+      <w:rPr>
+        <w:rFonts w:ascii="Courier New" w:hAnsi="Courier New" w:cs="Courier New" w:hint="default"/>
+      </w:rPr>
+    </w:lvl>
+    <w:lvl w:ilvl="8" w:tplc="40090005" w:tentative="1">
+      <w:start w:val="1"/>
+      <w:numFmt w:val="bullet"/>
+      <w:lvlText w:val=""/>
+      <w:lvlJc w:val="left"/>
+      <w:pPr>
+        <w:ind w:left="6480" w:hanging="360"/>
+      </w:pPr>
+      <w:rPr>
+        <w:rFonts w:ascii="Wingdings" w:hAnsi="Wingdings" w:hint="default"/>
+      </w:rPr>
+    </w:lvl>
+  </w:abstractNum>
+  <w:abstractNum w:abstractNumId="22">
     <w:nsid w:val="50837B95"/>
     <w:multiLevelType w:val="hybridMultilevel"/>
     <w:tmpl w:val="609845DA"/>
@@ -10806,7 +10764,7 @@
       </w:pPr>
     </w:lvl>
   </w:abstractNum>
-  <w:abstractNum w:abstractNumId="22">
+  <w:abstractNum w:abstractNumId="23">
     <w:nsid w:val="5258329B"/>
     <w:multiLevelType w:val="hybridMultilevel"/>
     <w:tmpl w:val="BD92215E"/>
@@ -10895,7 +10853,7 @@
       </w:pPr>
     </w:lvl>
   </w:abstractNum>
-  <w:abstractNum w:abstractNumId="23">
+  <w:abstractNum w:abstractNumId="24">
     <w:nsid w:val="54DB2DAC"/>
     <w:multiLevelType w:val="hybridMultilevel"/>
     <w:tmpl w:val="1B7A5AE2"/>
@@ -10984,7 +10942,7 @@
       </w:pPr>
     </w:lvl>
   </w:abstractNum>
-  <w:abstractNum w:abstractNumId="24">
+  <w:abstractNum w:abstractNumId="25">
     <w:nsid w:val="58FC74FD"/>
     <w:multiLevelType w:val="hybridMultilevel"/>
     <w:tmpl w:val="A59023F4"/>
@@ -11097,7 +11055,7 @@
       </w:rPr>
     </w:lvl>
   </w:abstractNum>
-  <w:abstractNum w:abstractNumId="25">
+  <w:abstractNum w:abstractNumId="26">
     <w:nsid w:val="5F06226B"/>
     <w:multiLevelType w:val="hybridMultilevel"/>
     <w:tmpl w:val="605E8DFA"/>
@@ -11186,7 +11144,7 @@
       </w:pPr>
     </w:lvl>
   </w:abstractNum>
-  <w:abstractNum w:abstractNumId="26">
+  <w:abstractNum w:abstractNumId="27">
     <w:nsid w:val="62C20A5C"/>
     <w:multiLevelType w:val="hybridMultilevel"/>
     <w:tmpl w:val="1F1CB96E"/>
@@ -11275,7 +11233,7 @@
       </w:pPr>
     </w:lvl>
   </w:abstractNum>
-  <w:abstractNum w:abstractNumId="27">
+  <w:abstractNum w:abstractNumId="28">
     <w:nsid w:val="6BAF613D"/>
     <w:multiLevelType w:val="hybridMultilevel"/>
     <w:tmpl w:val="7DD24A66"/>
@@ -11388,7 +11346,7 @@
       </w:rPr>
     </w:lvl>
   </w:abstractNum>
-  <w:abstractNum w:abstractNumId="28">
+  <w:abstractNum w:abstractNumId="29">
     <w:nsid w:val="6FD878C3"/>
     <w:multiLevelType w:val="hybridMultilevel"/>
     <w:tmpl w:val="63B48D7C"/>
@@ -11501,7 +11459,7 @@
       </w:rPr>
     </w:lvl>
   </w:abstractNum>
-  <w:abstractNum w:abstractNumId="29">
+  <w:abstractNum w:abstractNumId="30">
     <w:nsid w:val="77E30C16"/>
     <w:multiLevelType w:val="hybridMultilevel"/>
     <w:tmpl w:val="579E9B88"/>
@@ -11590,7 +11548,7 @@
       </w:pPr>
     </w:lvl>
   </w:abstractNum>
-  <w:abstractNum w:abstractNumId="30">
+  <w:abstractNum w:abstractNumId="31">
     <w:nsid w:val="78077B09"/>
     <w:multiLevelType w:val="hybridMultilevel"/>
     <w:tmpl w:val="5F663B46"/>
@@ -11679,7 +11637,7 @@
       </w:pPr>
     </w:lvl>
   </w:abstractNum>
-  <w:abstractNum w:abstractNumId="31">
+  <w:abstractNum w:abstractNumId="32">
     <w:nsid w:val="78BD4FB2"/>
     <w:multiLevelType w:val="hybridMultilevel"/>
     <w:tmpl w:val="63D445FA"/>
@@ -11768,7 +11726,7 @@
       </w:pPr>
     </w:lvl>
   </w:abstractNum>
-  <w:abstractNum w:abstractNumId="32">
+  <w:abstractNum w:abstractNumId="33">
     <w:nsid w:val="79103F06"/>
     <w:multiLevelType w:val="hybridMultilevel"/>
     <w:tmpl w:val="1716EC20"/>
@@ -11857,7 +11815,7 @@
       </w:pPr>
     </w:lvl>
   </w:abstractNum>
-  <w:abstractNum w:abstractNumId="33">
+  <w:abstractNum w:abstractNumId="34">
     <w:nsid w:val="79D23D9D"/>
     <w:multiLevelType w:val="hybridMultilevel"/>
     <w:tmpl w:val="D19E3E78"/>
@@ -11946,7 +11904,7 @@
       </w:pPr>
     </w:lvl>
   </w:abstractNum>
-  <w:abstractNum w:abstractNumId="34">
+  <w:abstractNum w:abstractNumId="35">
     <w:nsid w:val="79E47C68"/>
     <w:multiLevelType w:val="hybridMultilevel"/>
     <w:tmpl w:val="1E82EB72"/>
@@ -12036,7 +11994,7 @@
     </w:lvl>
   </w:abstractNum>
   <w:num w:numId="1">
-    <w:abstractNumId w:val="28"/>
+    <w:abstractNumId w:val="29"/>
   </w:num>
   <w:num w:numId="2">
     <w:abstractNumId w:val="2"/>
@@ -12048,7 +12006,7 @@
     <w:abstractNumId w:val="16"/>
   </w:num>
   <w:num w:numId="5">
-    <w:abstractNumId w:val="27"/>
+    <w:abstractNumId w:val="28"/>
   </w:num>
   <w:num w:numId="6">
     <w:abstractNumId w:val="1"/>
@@ -12063,10 +12021,10 @@
     <w:abstractNumId w:val="6"/>
   </w:num>
   <w:num w:numId="10">
-    <w:abstractNumId w:val="33"/>
+    <w:abstractNumId w:val="34"/>
   </w:num>
   <w:num w:numId="11">
-    <w:abstractNumId w:val="34"/>
+    <w:abstractNumId w:val="35"/>
   </w:num>
   <w:num w:numId="12">
     <w:abstractNumId w:val="9"/>
@@ -12078,19 +12036,19 @@
     <w:abstractNumId w:val="20"/>
   </w:num>
   <w:num w:numId="15">
-    <w:abstractNumId w:val="24"/>
+    <w:abstractNumId w:val="25"/>
   </w:num>
   <w:num w:numId="16">
     <w:abstractNumId w:val="10"/>
   </w:num>
   <w:num w:numId="17">
-    <w:abstractNumId w:val="29"/>
+    <w:abstractNumId w:val="30"/>
   </w:num>
   <w:num w:numId="18">
-    <w:abstractNumId w:val="30"/>
+    <w:abstractNumId w:val="31"/>
   </w:num>
   <w:num w:numId="19">
-    <w:abstractNumId w:val="21"/>
+    <w:abstractNumId w:val="22"/>
   </w:num>
   <w:num w:numId="20">
     <w:abstractNumId w:val="15"/>
@@ -12102,7 +12060,7 @@
     <w:abstractNumId w:val="19"/>
   </w:num>
   <w:num w:numId="23">
-    <w:abstractNumId w:val="22"/>
+    <w:abstractNumId w:val="23"/>
   </w:num>
   <w:num w:numId="24">
     <w:abstractNumId w:val="12"/>
@@ -12111,16 +12069,16 @@
     <w:abstractNumId w:val="3"/>
   </w:num>
   <w:num w:numId="26">
-    <w:abstractNumId w:val="26"/>
+    <w:abstractNumId w:val="27"/>
   </w:num>
   <w:num w:numId="27">
-    <w:abstractNumId w:val="32"/>
+    <w:abstractNumId w:val="33"/>
   </w:num>
   <w:num w:numId="28">
     <w:abstractNumId w:val="8"/>
   </w:num>
   <w:num w:numId="29">
-    <w:abstractNumId w:val="25"/>
+    <w:abstractNumId w:val="26"/>
   </w:num>
   <w:num w:numId="30">
     <w:abstractNumId w:val="13"/>
@@ -12129,16 +12087,19 @@
     <w:abstractNumId w:val="11"/>
   </w:num>
   <w:num w:numId="32">
-    <w:abstractNumId w:val="23"/>
+    <w:abstractNumId w:val="24"/>
   </w:num>
   <w:num w:numId="33">
-    <w:abstractNumId w:val="31"/>
+    <w:abstractNumId w:val="32"/>
   </w:num>
   <w:num w:numId="34">
     <w:abstractNumId w:val="17"/>
   </w:num>
   <w:num w:numId="35">
     <w:abstractNumId w:val="5"/>
+  </w:num>
+  <w:num w:numId="36">
+    <w:abstractNumId w:val="21"/>
   </w:num>
 </w:numbering>
 </file>
@@ -13853,49 +13814,49 @@
     </dgm:pt>
   </dgm:ptLst>
   <dgm:cxnLst>
-    <dgm:cxn modelId="{60E0ADED-62D2-48C1-A22E-1EE414CFA65B}" type="presOf" srcId="{7C03F650-450B-470D-9F41-9EBB6F24DE08}" destId="{915300E8-D21B-48E5-86A7-A677802348CF}" srcOrd="0" destOrd="0" presId="urn:microsoft.com/office/officeart/2005/8/layout/cycle2"/>
-    <dgm:cxn modelId="{A399273C-C291-42AE-942B-FA93C88D7CCE}" type="presOf" srcId="{D996DF6E-E24A-4672-B53C-F45E82ED11D5}" destId="{85727C8B-3068-4E77-A7A1-E6EDA8103D60}" srcOrd="1" destOrd="0" presId="urn:microsoft.com/office/officeart/2005/8/layout/cycle2"/>
-    <dgm:cxn modelId="{C5F99A22-E613-4BDF-9805-D8A697F0AEDE}" type="presOf" srcId="{D35F654F-C71E-4CF2-BA21-C832C92DCB2B}" destId="{C262E5EC-AFFC-4D29-8F55-4FC98D066102}" srcOrd="1" destOrd="0" presId="urn:microsoft.com/office/officeart/2005/8/layout/cycle2"/>
-    <dgm:cxn modelId="{95EF98A5-729B-4A48-B0C3-3EDF5A3A2A35}" type="presOf" srcId="{A01E66F2-8DE2-4DBF-B8E1-AB48AEB22F0F}" destId="{48BF6C11-EF1A-4273-900D-DD5B59C0D92F}" srcOrd="0" destOrd="0" presId="urn:microsoft.com/office/officeart/2005/8/layout/cycle2"/>
-    <dgm:cxn modelId="{2F15B67A-A203-4FA1-BBF1-32C38F9EF0BE}" type="presOf" srcId="{D35F654F-C71E-4CF2-BA21-C832C92DCB2B}" destId="{9F2CA740-10BE-422F-97C4-215D3262A7C2}" srcOrd="0" destOrd="0" presId="urn:microsoft.com/office/officeart/2005/8/layout/cycle2"/>
-    <dgm:cxn modelId="{A918CD4B-C30A-4C47-BEA0-3B3D875F1016}" type="presOf" srcId="{D996DF6E-E24A-4672-B53C-F45E82ED11D5}" destId="{23B2CE62-F90C-4121-BB9A-FD58550B5409}" srcOrd="0" destOrd="0" presId="urn:microsoft.com/office/officeart/2005/8/layout/cycle2"/>
-    <dgm:cxn modelId="{C5EA23E8-94B3-451F-8DBC-2B72E533231A}" type="presOf" srcId="{F2BE9233-54BD-4C28-B5F2-1B65E9CDDF96}" destId="{F9AED730-9635-4E85-B16D-CDB7F5FBEF2A}" srcOrd="0" destOrd="0" presId="urn:microsoft.com/office/officeart/2005/8/layout/cycle2"/>
-    <dgm:cxn modelId="{7A2BE47A-D32B-47A3-9D07-D52DD49DCB98}" type="presOf" srcId="{BA319471-CEE2-4F47-BD5C-3922FB7DFA6B}" destId="{59356F7B-2878-4C69-8BCC-736D52D62464}" srcOrd="0" destOrd="0" presId="urn:microsoft.com/office/officeart/2005/8/layout/cycle2"/>
-    <dgm:cxn modelId="{AAC3BE58-6DD8-44A7-8473-6474700CFCE2}" type="presOf" srcId="{30169AF5-3F60-49ED-BA16-26E156F3CD77}" destId="{B41B0945-C228-466F-ACBC-F0427AE563C3}" srcOrd="0" destOrd="0" presId="urn:microsoft.com/office/officeart/2005/8/layout/cycle2"/>
+    <dgm:cxn modelId="{3354B5DD-DD06-4226-83B0-C5DBB4314929}" srcId="{30169AF5-3F60-49ED-BA16-26E156F3CD77}" destId="{D01084D7-448F-40E6-BAD6-916FA5266B35}" srcOrd="1" destOrd="0" parTransId="{11A516D9-F860-4BE8-BA91-08CBF1F90AAF}" sibTransId="{BA319471-CEE2-4F47-BD5C-3922FB7DFA6B}"/>
+    <dgm:cxn modelId="{20D214BE-246B-44CA-A43D-90EF7A851446}" type="presOf" srcId="{D996DF6E-E24A-4672-B53C-F45E82ED11D5}" destId="{85727C8B-3068-4E77-A7A1-E6EDA8103D60}" srcOrd="1" destOrd="0" presId="urn:microsoft.com/office/officeart/2005/8/layout/cycle2"/>
+    <dgm:cxn modelId="{ACF6C25F-1067-4DBC-B2D1-F242701282FB}" type="presOf" srcId="{E3147738-712C-470E-BA43-1900B58F3BA1}" destId="{ABB91F78-7B6C-410F-9644-452AF8D7494A}" srcOrd="0" destOrd="0" presId="urn:microsoft.com/office/officeart/2005/8/layout/cycle2"/>
+    <dgm:cxn modelId="{B4645157-A364-441D-AC0B-CC3996D322C0}" type="presOf" srcId="{F90989A5-9584-42E6-85EC-F46F18F0E118}" destId="{31D81D24-1473-4316-96A5-763E7A6060DC}" srcOrd="0" destOrd="0" presId="urn:microsoft.com/office/officeart/2005/8/layout/cycle2"/>
     <dgm:cxn modelId="{3A6CAD7C-9D06-4601-9DA6-58C23D4FE730}" srcId="{30169AF5-3F60-49ED-BA16-26E156F3CD77}" destId="{E3147738-712C-470E-BA43-1900B58F3BA1}" srcOrd="5" destOrd="0" parTransId="{390EF3C2-87EC-4379-B2B2-CD6400F6DFF0}" sibTransId="{A01E66F2-8DE2-4DBF-B8E1-AB48AEB22F0F}"/>
-    <dgm:cxn modelId="{A15675F6-BA42-483A-900D-764E0852D957}" type="presOf" srcId="{6BE14A29-3F47-4123-9A53-87F7E3976F30}" destId="{1379CEB1-3469-4B4A-813A-D2A2C295406E}" srcOrd="0" destOrd="0" presId="urn:microsoft.com/office/officeart/2005/8/layout/cycle2"/>
-    <dgm:cxn modelId="{01E4F031-66F5-4638-9F7C-98317BAD510F}" type="presOf" srcId="{9C8E8DEB-5DB8-4F82-8CE8-1171D0ABBD37}" destId="{15DBFFA1-5F90-4067-9D91-73AA2852D991}" srcOrd="1" destOrd="0" presId="urn:microsoft.com/office/officeart/2005/8/layout/cycle2"/>
+    <dgm:cxn modelId="{434A434F-BF38-42D9-9E6B-F02554924AB7}" type="presOf" srcId="{BA319471-CEE2-4F47-BD5C-3922FB7DFA6B}" destId="{2FCF5CF5-49BA-4E5D-A81E-50ABA18D10A9}" srcOrd="1" destOrd="0" presId="urn:microsoft.com/office/officeart/2005/8/layout/cycle2"/>
+    <dgm:cxn modelId="{026D6AE9-41C4-4E88-B421-D7A6BB38CC27}" srcId="{30169AF5-3F60-49ED-BA16-26E156F3CD77}" destId="{F2BE9233-54BD-4C28-B5F2-1B65E9CDDF96}" srcOrd="3" destOrd="0" parTransId="{672307C0-A98C-48FA-8729-D6E3187E5E3A}" sibTransId="{9C8E8DEB-5DB8-4F82-8CE8-1171D0ABBD37}"/>
+    <dgm:cxn modelId="{0D8CB631-3ECE-46CD-B7F8-C5DF94A69746}" type="presOf" srcId="{A01E66F2-8DE2-4DBF-B8E1-AB48AEB22F0F}" destId="{2D827D14-3A64-4B45-B11B-3ECDBC24212A}" srcOrd="1" destOrd="0" presId="urn:microsoft.com/office/officeart/2005/8/layout/cycle2"/>
+    <dgm:cxn modelId="{D08F3ABD-FA78-4D48-8162-46B4C8E76768}" type="presOf" srcId="{F90989A5-9584-42E6-85EC-F46F18F0E118}" destId="{74D1E673-78E8-4911-AB9E-E98BE428CF47}" srcOrd="1" destOrd="0" presId="urn:microsoft.com/office/officeart/2005/8/layout/cycle2"/>
+    <dgm:cxn modelId="{BBF08D3B-FC3B-469A-B1D6-2C45B7879960}" type="presOf" srcId="{D01084D7-448F-40E6-BAD6-916FA5266B35}" destId="{6AB4841B-36EA-4743-8E11-22D754152787}" srcOrd="0" destOrd="0" presId="urn:microsoft.com/office/officeart/2005/8/layout/cycle2"/>
+    <dgm:cxn modelId="{8FB06003-F2E6-4237-A6FB-681DBEB856F3}" type="presOf" srcId="{F2BE9233-54BD-4C28-B5F2-1B65E9CDDF96}" destId="{F9AED730-9635-4E85-B16D-CDB7F5FBEF2A}" srcOrd="0" destOrd="0" presId="urn:microsoft.com/office/officeart/2005/8/layout/cycle2"/>
     <dgm:cxn modelId="{FC683937-3E9A-4071-B70B-BFE511A7B23C}" srcId="{30169AF5-3F60-49ED-BA16-26E156F3CD77}" destId="{6BE14A29-3F47-4123-9A53-87F7E3976F30}" srcOrd="4" destOrd="0" parTransId="{14C76E7C-A806-46D2-A04B-406CC2747FBF}" sibTransId="{D35F654F-C71E-4CF2-BA21-C832C92DCB2B}"/>
-    <dgm:cxn modelId="{4B17C9FE-737D-402D-90DA-537D4D9C6925}" type="presOf" srcId="{A3989F04-57A2-4559-BF44-044AD8FBD67A}" destId="{A670810F-0345-4254-8BC7-4FA06BB5C3CC}" srcOrd="0" destOrd="0" presId="urn:microsoft.com/office/officeart/2005/8/layout/cycle2"/>
-    <dgm:cxn modelId="{4BD35898-F714-4BB7-9542-A453503E48C4}" type="presOf" srcId="{F90989A5-9584-42E6-85EC-F46F18F0E118}" destId="{31D81D24-1473-4316-96A5-763E7A6060DC}" srcOrd="0" destOrd="0" presId="urn:microsoft.com/office/officeart/2005/8/layout/cycle2"/>
-    <dgm:cxn modelId="{47725AA6-D8AE-40F2-9328-C99F4DEBF854}" type="presOf" srcId="{9C8E8DEB-5DB8-4F82-8CE8-1171D0ABBD37}" destId="{2C63797F-35D2-4BF1-ADFC-8E15A2A56D28}" srcOrd="0" destOrd="0" presId="urn:microsoft.com/office/officeart/2005/8/layout/cycle2"/>
-    <dgm:cxn modelId="{4DDB629C-79EF-4AD9-B998-0368998FAA2A}" type="presOf" srcId="{A01E66F2-8DE2-4DBF-B8E1-AB48AEB22F0F}" destId="{2D827D14-3A64-4B45-B11B-3ECDBC24212A}" srcOrd="1" destOrd="0" presId="urn:microsoft.com/office/officeart/2005/8/layout/cycle2"/>
-    <dgm:cxn modelId="{026D6AE9-41C4-4E88-B421-D7A6BB38CC27}" srcId="{30169AF5-3F60-49ED-BA16-26E156F3CD77}" destId="{F2BE9233-54BD-4C28-B5F2-1B65E9CDDF96}" srcOrd="3" destOrd="0" parTransId="{672307C0-A98C-48FA-8729-D6E3187E5E3A}" sibTransId="{9C8E8DEB-5DB8-4F82-8CE8-1171D0ABBD37}"/>
+    <dgm:cxn modelId="{52E5D6E8-DDAE-47A4-AFD1-CFA49E9B6D88}" type="presOf" srcId="{7C03F650-450B-470D-9F41-9EBB6F24DE08}" destId="{915300E8-D21B-48E5-86A7-A677802348CF}" srcOrd="0" destOrd="0" presId="urn:microsoft.com/office/officeart/2005/8/layout/cycle2"/>
+    <dgm:cxn modelId="{8149DB51-1EDD-4EF2-8264-8D4A89906C6E}" type="presOf" srcId="{A01E66F2-8DE2-4DBF-B8E1-AB48AEB22F0F}" destId="{48BF6C11-EF1A-4273-900D-DD5B59C0D92F}" srcOrd="0" destOrd="0" presId="urn:microsoft.com/office/officeart/2005/8/layout/cycle2"/>
+    <dgm:cxn modelId="{EEE87F86-CB4F-4CA9-A314-73B957768C6B}" type="presOf" srcId="{9C8E8DEB-5DB8-4F82-8CE8-1171D0ABBD37}" destId="{2C63797F-35D2-4BF1-ADFC-8E15A2A56D28}" srcOrd="0" destOrd="0" presId="urn:microsoft.com/office/officeart/2005/8/layout/cycle2"/>
     <dgm:cxn modelId="{F09F8ED9-D24F-448F-AF8E-F92EC404CBA7}" srcId="{30169AF5-3F60-49ED-BA16-26E156F3CD77}" destId="{7C03F650-450B-470D-9F41-9EBB6F24DE08}" srcOrd="0" destOrd="0" parTransId="{A8856599-3D3C-4A85-ABFD-520651FDD510}" sibTransId="{D996DF6E-E24A-4672-B53C-F45E82ED11D5}"/>
-    <dgm:cxn modelId="{B0815934-1B44-40A9-9D49-AF3B988350BF}" type="presOf" srcId="{F90989A5-9584-42E6-85EC-F46F18F0E118}" destId="{74D1E673-78E8-4911-AB9E-E98BE428CF47}" srcOrd="1" destOrd="0" presId="urn:microsoft.com/office/officeart/2005/8/layout/cycle2"/>
     <dgm:cxn modelId="{57569DDB-32CD-4132-93C5-3D28EE6D9D0F}" srcId="{30169AF5-3F60-49ED-BA16-26E156F3CD77}" destId="{A3989F04-57A2-4559-BF44-044AD8FBD67A}" srcOrd="2" destOrd="0" parTransId="{E7AABBEB-8EE1-4214-A7B4-DD1F0B63D6DC}" sibTransId="{F90989A5-9584-42E6-85EC-F46F18F0E118}"/>
-    <dgm:cxn modelId="{B5EAB028-F417-4832-AD66-4B8646A7D8CC}" type="presOf" srcId="{E3147738-712C-470E-BA43-1900B58F3BA1}" destId="{ABB91F78-7B6C-410F-9644-452AF8D7494A}" srcOrd="0" destOrd="0" presId="urn:microsoft.com/office/officeart/2005/8/layout/cycle2"/>
-    <dgm:cxn modelId="{3354B5DD-DD06-4226-83B0-C5DBB4314929}" srcId="{30169AF5-3F60-49ED-BA16-26E156F3CD77}" destId="{D01084D7-448F-40E6-BAD6-916FA5266B35}" srcOrd="1" destOrd="0" parTransId="{11A516D9-F860-4BE8-BA91-08CBF1F90AAF}" sibTransId="{BA319471-CEE2-4F47-BD5C-3922FB7DFA6B}"/>
-    <dgm:cxn modelId="{1F1FD298-1A4A-4B36-8ABD-C4E13CD9081A}" type="presOf" srcId="{BA319471-CEE2-4F47-BD5C-3922FB7DFA6B}" destId="{2FCF5CF5-49BA-4E5D-A81E-50ABA18D10A9}" srcOrd="1" destOrd="0" presId="urn:microsoft.com/office/officeart/2005/8/layout/cycle2"/>
-    <dgm:cxn modelId="{AA5891B7-7C52-47C6-A6F4-B77372D02295}" type="presOf" srcId="{D01084D7-448F-40E6-BAD6-916FA5266B35}" destId="{6AB4841B-36EA-4743-8E11-22D754152787}" srcOrd="0" destOrd="0" presId="urn:microsoft.com/office/officeart/2005/8/layout/cycle2"/>
-    <dgm:cxn modelId="{974C49DE-98DE-4633-9D58-E35443D2E9F3}" type="presParOf" srcId="{B41B0945-C228-466F-ACBC-F0427AE563C3}" destId="{915300E8-D21B-48E5-86A7-A677802348CF}" srcOrd="0" destOrd="0" presId="urn:microsoft.com/office/officeart/2005/8/layout/cycle2"/>
-    <dgm:cxn modelId="{F7FD353D-C984-4737-AE5A-AD10322BDA50}" type="presParOf" srcId="{B41B0945-C228-466F-ACBC-F0427AE563C3}" destId="{23B2CE62-F90C-4121-BB9A-FD58550B5409}" srcOrd="1" destOrd="0" presId="urn:microsoft.com/office/officeart/2005/8/layout/cycle2"/>
-    <dgm:cxn modelId="{BB8F428C-84C4-49A6-ADA1-550FABC94D53}" type="presParOf" srcId="{23B2CE62-F90C-4121-BB9A-FD58550B5409}" destId="{85727C8B-3068-4E77-A7A1-E6EDA8103D60}" srcOrd="0" destOrd="0" presId="urn:microsoft.com/office/officeart/2005/8/layout/cycle2"/>
-    <dgm:cxn modelId="{2925B7B6-4996-462C-B227-72B42727B458}" type="presParOf" srcId="{B41B0945-C228-466F-ACBC-F0427AE563C3}" destId="{6AB4841B-36EA-4743-8E11-22D754152787}" srcOrd="2" destOrd="0" presId="urn:microsoft.com/office/officeart/2005/8/layout/cycle2"/>
-    <dgm:cxn modelId="{2A9604D9-72C0-4041-A9C2-5F212FE7E9E2}" type="presParOf" srcId="{B41B0945-C228-466F-ACBC-F0427AE563C3}" destId="{59356F7B-2878-4C69-8BCC-736D52D62464}" srcOrd="3" destOrd="0" presId="urn:microsoft.com/office/officeart/2005/8/layout/cycle2"/>
-    <dgm:cxn modelId="{02B70247-EAFC-4F41-99DF-EF252C25717B}" type="presParOf" srcId="{59356F7B-2878-4C69-8BCC-736D52D62464}" destId="{2FCF5CF5-49BA-4E5D-A81E-50ABA18D10A9}" srcOrd="0" destOrd="0" presId="urn:microsoft.com/office/officeart/2005/8/layout/cycle2"/>
-    <dgm:cxn modelId="{399E25AD-4A38-4FD3-B95D-1C7FFCBF2917}" type="presParOf" srcId="{B41B0945-C228-466F-ACBC-F0427AE563C3}" destId="{A670810F-0345-4254-8BC7-4FA06BB5C3CC}" srcOrd="4" destOrd="0" presId="urn:microsoft.com/office/officeart/2005/8/layout/cycle2"/>
-    <dgm:cxn modelId="{F2CF6157-F7D3-46DD-A74D-A5545C9B317C}" type="presParOf" srcId="{B41B0945-C228-466F-ACBC-F0427AE563C3}" destId="{31D81D24-1473-4316-96A5-763E7A6060DC}" srcOrd="5" destOrd="0" presId="urn:microsoft.com/office/officeart/2005/8/layout/cycle2"/>
-    <dgm:cxn modelId="{F13541A2-1A32-4507-B141-0BA7356DE8D1}" type="presParOf" srcId="{31D81D24-1473-4316-96A5-763E7A6060DC}" destId="{74D1E673-78E8-4911-AB9E-E98BE428CF47}" srcOrd="0" destOrd="0" presId="urn:microsoft.com/office/officeart/2005/8/layout/cycle2"/>
-    <dgm:cxn modelId="{868A7B5C-F648-4033-8A08-250C2F2C50EC}" type="presParOf" srcId="{B41B0945-C228-466F-ACBC-F0427AE563C3}" destId="{F9AED730-9635-4E85-B16D-CDB7F5FBEF2A}" srcOrd="6" destOrd="0" presId="urn:microsoft.com/office/officeart/2005/8/layout/cycle2"/>
-    <dgm:cxn modelId="{4EC2BDD5-CD18-4532-B7B5-D9FEA0749599}" type="presParOf" srcId="{B41B0945-C228-466F-ACBC-F0427AE563C3}" destId="{2C63797F-35D2-4BF1-ADFC-8E15A2A56D28}" srcOrd="7" destOrd="0" presId="urn:microsoft.com/office/officeart/2005/8/layout/cycle2"/>
-    <dgm:cxn modelId="{726A6AFD-B477-4822-891D-CF87A43C88F0}" type="presParOf" srcId="{2C63797F-35D2-4BF1-ADFC-8E15A2A56D28}" destId="{15DBFFA1-5F90-4067-9D91-73AA2852D991}" srcOrd="0" destOrd="0" presId="urn:microsoft.com/office/officeart/2005/8/layout/cycle2"/>
-    <dgm:cxn modelId="{9AE975B4-7365-4E61-A350-FC04F7112C29}" type="presParOf" srcId="{B41B0945-C228-466F-ACBC-F0427AE563C3}" destId="{1379CEB1-3469-4B4A-813A-D2A2C295406E}" srcOrd="8" destOrd="0" presId="urn:microsoft.com/office/officeart/2005/8/layout/cycle2"/>
-    <dgm:cxn modelId="{52C70280-083E-45FE-AF2E-82365C6C262F}" type="presParOf" srcId="{B41B0945-C228-466F-ACBC-F0427AE563C3}" destId="{9F2CA740-10BE-422F-97C4-215D3262A7C2}" srcOrd="9" destOrd="0" presId="urn:microsoft.com/office/officeart/2005/8/layout/cycle2"/>
-    <dgm:cxn modelId="{3DFF00A4-0158-46F8-917A-DDB95F90D3FD}" type="presParOf" srcId="{9F2CA740-10BE-422F-97C4-215D3262A7C2}" destId="{C262E5EC-AFFC-4D29-8F55-4FC98D066102}" srcOrd="0" destOrd="0" presId="urn:microsoft.com/office/officeart/2005/8/layout/cycle2"/>
-    <dgm:cxn modelId="{1471E911-8E29-4496-A759-82894456E004}" type="presParOf" srcId="{B41B0945-C228-466F-ACBC-F0427AE563C3}" destId="{ABB91F78-7B6C-410F-9644-452AF8D7494A}" srcOrd="10" destOrd="0" presId="urn:microsoft.com/office/officeart/2005/8/layout/cycle2"/>
-    <dgm:cxn modelId="{D32703AB-1794-45C9-8014-39E5461C3E32}" type="presParOf" srcId="{B41B0945-C228-466F-ACBC-F0427AE563C3}" destId="{48BF6C11-EF1A-4273-900D-DD5B59C0D92F}" srcOrd="11" destOrd="0" presId="urn:microsoft.com/office/officeart/2005/8/layout/cycle2"/>
-    <dgm:cxn modelId="{501227A3-6510-4955-938E-E3C15478228A}" type="presParOf" srcId="{48BF6C11-EF1A-4273-900D-DD5B59C0D92F}" destId="{2D827D14-3A64-4B45-B11B-3ECDBC24212A}" srcOrd="0" destOrd="0" presId="urn:microsoft.com/office/officeart/2005/8/layout/cycle2"/>
+    <dgm:cxn modelId="{0591D3D2-78A7-4C81-B13A-00427AF54A69}" type="presOf" srcId="{D996DF6E-E24A-4672-B53C-F45E82ED11D5}" destId="{23B2CE62-F90C-4121-BB9A-FD58550B5409}" srcOrd="0" destOrd="0" presId="urn:microsoft.com/office/officeart/2005/8/layout/cycle2"/>
+    <dgm:cxn modelId="{793B1BD7-3D68-444B-B214-46E93B6C8ABF}" type="presOf" srcId="{BA319471-CEE2-4F47-BD5C-3922FB7DFA6B}" destId="{59356F7B-2878-4C69-8BCC-736D52D62464}" srcOrd="0" destOrd="0" presId="urn:microsoft.com/office/officeart/2005/8/layout/cycle2"/>
+    <dgm:cxn modelId="{458DDE21-3FE2-44E7-90F1-18D58EC5D5EF}" type="presOf" srcId="{9C8E8DEB-5DB8-4F82-8CE8-1171D0ABBD37}" destId="{15DBFFA1-5F90-4067-9D91-73AA2852D991}" srcOrd="1" destOrd="0" presId="urn:microsoft.com/office/officeart/2005/8/layout/cycle2"/>
+    <dgm:cxn modelId="{DB59D8E5-CF70-43DC-BBB4-C8E1E8EBEBC4}" type="presOf" srcId="{30169AF5-3F60-49ED-BA16-26E156F3CD77}" destId="{B41B0945-C228-466F-ACBC-F0427AE563C3}" srcOrd="0" destOrd="0" presId="urn:microsoft.com/office/officeart/2005/8/layout/cycle2"/>
+    <dgm:cxn modelId="{20D3C5BD-EBE7-4728-B671-27DA5549B209}" type="presOf" srcId="{A3989F04-57A2-4559-BF44-044AD8FBD67A}" destId="{A670810F-0345-4254-8BC7-4FA06BB5C3CC}" srcOrd="0" destOrd="0" presId="urn:microsoft.com/office/officeart/2005/8/layout/cycle2"/>
+    <dgm:cxn modelId="{25D9D267-B830-45CE-86F1-4DC28C9DB631}" type="presOf" srcId="{D35F654F-C71E-4CF2-BA21-C832C92DCB2B}" destId="{9F2CA740-10BE-422F-97C4-215D3262A7C2}" srcOrd="0" destOrd="0" presId="urn:microsoft.com/office/officeart/2005/8/layout/cycle2"/>
+    <dgm:cxn modelId="{2DDC350E-7FAF-4C6B-81A1-0E193A3EDED2}" type="presOf" srcId="{D35F654F-C71E-4CF2-BA21-C832C92DCB2B}" destId="{C262E5EC-AFFC-4D29-8F55-4FC98D066102}" srcOrd="1" destOrd="0" presId="urn:microsoft.com/office/officeart/2005/8/layout/cycle2"/>
+    <dgm:cxn modelId="{EEDAA1BF-2648-42C4-ACE8-BCD8E5C6ED8D}" type="presOf" srcId="{6BE14A29-3F47-4123-9A53-87F7E3976F30}" destId="{1379CEB1-3469-4B4A-813A-D2A2C295406E}" srcOrd="0" destOrd="0" presId="urn:microsoft.com/office/officeart/2005/8/layout/cycle2"/>
+    <dgm:cxn modelId="{42C57BF2-843F-4633-84B3-B6988B4E2570}" type="presParOf" srcId="{B41B0945-C228-466F-ACBC-F0427AE563C3}" destId="{915300E8-D21B-48E5-86A7-A677802348CF}" srcOrd="0" destOrd="0" presId="urn:microsoft.com/office/officeart/2005/8/layout/cycle2"/>
+    <dgm:cxn modelId="{218E5B13-DD11-4624-91D7-7FE73B7EA3F3}" type="presParOf" srcId="{B41B0945-C228-466F-ACBC-F0427AE563C3}" destId="{23B2CE62-F90C-4121-BB9A-FD58550B5409}" srcOrd="1" destOrd="0" presId="urn:microsoft.com/office/officeart/2005/8/layout/cycle2"/>
+    <dgm:cxn modelId="{DC07C3CA-47B8-4530-939B-8B7EF90A0696}" type="presParOf" srcId="{23B2CE62-F90C-4121-BB9A-FD58550B5409}" destId="{85727C8B-3068-4E77-A7A1-E6EDA8103D60}" srcOrd="0" destOrd="0" presId="urn:microsoft.com/office/officeart/2005/8/layout/cycle2"/>
+    <dgm:cxn modelId="{EF930522-D2C4-4763-A5E9-372DECBA65D7}" type="presParOf" srcId="{B41B0945-C228-466F-ACBC-F0427AE563C3}" destId="{6AB4841B-36EA-4743-8E11-22D754152787}" srcOrd="2" destOrd="0" presId="urn:microsoft.com/office/officeart/2005/8/layout/cycle2"/>
+    <dgm:cxn modelId="{88710739-DEA4-44CD-93DA-7395D17ACC47}" type="presParOf" srcId="{B41B0945-C228-466F-ACBC-F0427AE563C3}" destId="{59356F7B-2878-4C69-8BCC-736D52D62464}" srcOrd="3" destOrd="0" presId="urn:microsoft.com/office/officeart/2005/8/layout/cycle2"/>
+    <dgm:cxn modelId="{613800F2-9595-4CDC-AD8C-F023AA474D92}" type="presParOf" srcId="{59356F7B-2878-4C69-8BCC-736D52D62464}" destId="{2FCF5CF5-49BA-4E5D-A81E-50ABA18D10A9}" srcOrd="0" destOrd="0" presId="urn:microsoft.com/office/officeart/2005/8/layout/cycle2"/>
+    <dgm:cxn modelId="{DBAF32B2-9C26-4DC7-A12D-EE6D0EE11FF3}" type="presParOf" srcId="{B41B0945-C228-466F-ACBC-F0427AE563C3}" destId="{A670810F-0345-4254-8BC7-4FA06BB5C3CC}" srcOrd="4" destOrd="0" presId="urn:microsoft.com/office/officeart/2005/8/layout/cycle2"/>
+    <dgm:cxn modelId="{2D2F61E9-AA14-4137-BB69-586E2B11CE88}" type="presParOf" srcId="{B41B0945-C228-466F-ACBC-F0427AE563C3}" destId="{31D81D24-1473-4316-96A5-763E7A6060DC}" srcOrd="5" destOrd="0" presId="urn:microsoft.com/office/officeart/2005/8/layout/cycle2"/>
+    <dgm:cxn modelId="{C5CD131F-21E0-47BE-B3A1-818095F10D9B}" type="presParOf" srcId="{31D81D24-1473-4316-96A5-763E7A6060DC}" destId="{74D1E673-78E8-4911-AB9E-E98BE428CF47}" srcOrd="0" destOrd="0" presId="urn:microsoft.com/office/officeart/2005/8/layout/cycle2"/>
+    <dgm:cxn modelId="{1DC94A6A-8963-4264-8764-27D8F7E308B7}" type="presParOf" srcId="{B41B0945-C228-466F-ACBC-F0427AE563C3}" destId="{F9AED730-9635-4E85-B16D-CDB7F5FBEF2A}" srcOrd="6" destOrd="0" presId="urn:microsoft.com/office/officeart/2005/8/layout/cycle2"/>
+    <dgm:cxn modelId="{57471F0A-395A-4342-87EC-69C6AB6911C9}" type="presParOf" srcId="{B41B0945-C228-466F-ACBC-F0427AE563C3}" destId="{2C63797F-35D2-4BF1-ADFC-8E15A2A56D28}" srcOrd="7" destOrd="0" presId="urn:microsoft.com/office/officeart/2005/8/layout/cycle2"/>
+    <dgm:cxn modelId="{19AEEC5A-A320-46C9-9675-E95A09F7A911}" type="presParOf" srcId="{2C63797F-35D2-4BF1-ADFC-8E15A2A56D28}" destId="{15DBFFA1-5F90-4067-9D91-73AA2852D991}" srcOrd="0" destOrd="0" presId="urn:microsoft.com/office/officeart/2005/8/layout/cycle2"/>
+    <dgm:cxn modelId="{A988B43E-F5CA-401A-AF37-8FA3675F4344}" type="presParOf" srcId="{B41B0945-C228-466F-ACBC-F0427AE563C3}" destId="{1379CEB1-3469-4B4A-813A-D2A2C295406E}" srcOrd="8" destOrd="0" presId="urn:microsoft.com/office/officeart/2005/8/layout/cycle2"/>
+    <dgm:cxn modelId="{CBEA64A2-23D3-4DF6-8E08-DB58B50710EC}" type="presParOf" srcId="{B41B0945-C228-466F-ACBC-F0427AE563C3}" destId="{9F2CA740-10BE-422F-97C4-215D3262A7C2}" srcOrd="9" destOrd="0" presId="urn:microsoft.com/office/officeart/2005/8/layout/cycle2"/>
+    <dgm:cxn modelId="{FEC78367-7CDD-4949-821D-A03006628870}" type="presParOf" srcId="{9F2CA740-10BE-422F-97C4-215D3262A7C2}" destId="{C262E5EC-AFFC-4D29-8F55-4FC98D066102}" srcOrd="0" destOrd="0" presId="urn:microsoft.com/office/officeart/2005/8/layout/cycle2"/>
+    <dgm:cxn modelId="{DDEC5D6A-2F17-4F97-A054-B02F1DA3AC28}" type="presParOf" srcId="{B41B0945-C228-466F-ACBC-F0427AE563C3}" destId="{ABB91F78-7B6C-410F-9644-452AF8D7494A}" srcOrd="10" destOrd="0" presId="urn:microsoft.com/office/officeart/2005/8/layout/cycle2"/>
+    <dgm:cxn modelId="{A84F21FB-C5BA-4A08-B602-E660F351D6BD}" type="presParOf" srcId="{B41B0945-C228-466F-ACBC-F0427AE563C3}" destId="{48BF6C11-EF1A-4273-900D-DD5B59C0D92F}" srcOrd="11" destOrd="0" presId="urn:microsoft.com/office/officeart/2005/8/layout/cycle2"/>
+    <dgm:cxn modelId="{66C8DB77-A69E-4274-BC23-DD5E416F9A60}" type="presParOf" srcId="{48BF6C11-EF1A-4273-900D-DD5B59C0D92F}" destId="{2D827D14-3A64-4B45-B11B-3ECDBC24212A}" srcOrd="0" destOrd="0" presId="urn:microsoft.com/office/officeart/2005/8/layout/cycle2"/>
   </dgm:cxnLst>
   <dgm:bg/>
   <dgm:whole/>

</xml_diff>